<commit_message>
docs: add initial project documentation for SpringfieldCity
</commit_message>
<xml_diff>
--- a/docs/Documentacion_SpringfieldCity.docx
+++ b/docs/Documentacion_SpringfieldCity.docx
@@ -72,6 +72,9 @@
         <w:jc w:val="center"/>
       </w:pPr>
       <w:r>
+        <w:rPr>
+          <w:noProof/>
+        </w:rPr>
         <w:drawing>
           <wp:inline distT="0" distB="0" distL="0" distR="0" wp14:anchorId="04102C9E" wp14:editId="52A8B0FC">
             <wp:extent cx="2326640" cy="2870247"/>
@@ -129,23 +132,7 @@
           <w:rFonts w:ascii="Arial" w:hAnsi="Arial" w:cs="Arial"/>
           <w:color w:val="000000"/>
         </w:rPr>
-        <w:t xml:space="preserve"> </w:t>
-      </w:r>
-      <w:proofErr w:type="spellStart"/>
-      <w:r>
-        <w:rPr>
-          <w:rFonts w:ascii="Arial" w:hAnsi="Arial" w:cs="Arial"/>
-          <w:color w:val="000000"/>
-        </w:rPr>
-        <w:t>Programacion</w:t>
-      </w:r>
-      <w:proofErr w:type="spellEnd"/>
-      <w:r>
-        <w:rPr>
-          <w:rFonts w:ascii="Arial" w:hAnsi="Arial" w:cs="Arial"/>
-          <w:color w:val="000000"/>
-        </w:rPr>
-        <w:t xml:space="preserve"> Grafica</w:t>
+        <w:t xml:space="preserve"> Programacion Grafica</w:t>
       </w:r>
     </w:p>
     <w:p>
@@ -182,31 +169,13 @@
         </w:rPr>
         <w:t xml:space="preserve">CARRERA: </w:t>
       </w:r>
-      <w:proofErr w:type="spellStart"/>
       <w:r>
         <w:rPr>
           <w:rFonts w:ascii="Arial" w:hAnsi="Arial" w:cs="Arial"/>
           <w:color w:val="000000"/>
         </w:rPr>
-        <w:t>Ingenieria</w:t>
-      </w:r>
-      <w:proofErr w:type="spellEnd"/>
-      <w:r>
-        <w:rPr>
-          <w:rFonts w:ascii="Arial" w:hAnsi="Arial" w:cs="Arial"/>
-          <w:color w:val="000000"/>
-        </w:rPr>
-        <w:t xml:space="preserve"> en </w:t>
-      </w:r>
-      <w:proofErr w:type="spellStart"/>
-      <w:r>
-        <w:rPr>
-          <w:rFonts w:ascii="Arial" w:hAnsi="Arial" w:cs="Arial"/>
-          <w:color w:val="000000"/>
-        </w:rPr>
-        <w:t>informatica</w:t>
-      </w:r>
-      <w:proofErr w:type="spellEnd"/>
+        <w:t>Ingenieria en informatica</w:t>
+      </w:r>
     </w:p>
     <w:p>
       <w:pPr>
@@ -321,27 +290,7 @@
         <w:rPr>
           <w:rFonts w:ascii="Arial" w:hAnsi="Arial" w:cs="Arial"/>
         </w:rPr>
-        <w:t xml:space="preserve"> es una ciudad 3D inspirada en Springfield, construida desde cero con </w:t>
-      </w:r>
-      <w:proofErr w:type="spellStart"/>
-      <w:r>
-        <w:rPr>
-          <w:rFonts w:ascii="Arial" w:hAnsi="Arial" w:cs="Arial"/>
-        </w:rPr>
-        <w:t>OpenGL</w:t>
-      </w:r>
-      <w:proofErr w:type="spellEnd"/>
-      <w:r>
-        <w:rPr>
-          <w:rFonts w:ascii="Arial" w:hAnsi="Arial" w:cs="Arial"/>
-        </w:rPr>
-        <w:t xml:space="preserve"> 3.3 y Java. No usa imágenes ni modelos externos: todos los objetos (casas, árboles, el auto, la plaza, los semáfor</w:t>
-      </w:r>
-      <w:r>
-        <w:rPr>
-          <w:rFonts w:ascii="Arial" w:hAnsi="Arial" w:cs="Arial"/>
-        </w:rPr>
-        <w:t>os) se arman con cajas y cilindros desde el código, con un estilo de bloques.</w:t>
+        <w:t xml:space="preserve"> es una ciudad 3D inspirada en Springfield, construida desde cero con OpenGL 3.3 y Java. No usa imágenes ni modelos externos: todos los objetos (casas, árboles, el auto, la plaza, los semáforos) se arman con cajas y cilindros desde el código, con un estilo de bloques.</w:t>
       </w:r>
     </w:p>
     <w:p>
@@ -357,7 +306,6 @@
         </w:rPr>
         <w:t>El proyecto parte de la guía del curso (</w:t>
       </w:r>
-      <w:proofErr w:type="spellStart"/>
       <w:r>
         <w:rPr>
           <w:rFonts w:ascii="Arial" w:eastAsia="Consolas" w:hAnsi="Arial" w:cs="Arial"/>
@@ -367,46 +315,11 @@
         </w:rPr>
         <w:t>CiudadConduccion</w:t>
       </w:r>
-      <w:proofErr w:type="spellEnd"/>
-      <w:r>
-        <w:rPr>
-          <w:rFonts w:ascii="Arial" w:hAnsi="Arial" w:cs="Arial"/>
-        </w:rPr>
-        <w:t xml:space="preserve">, de la cual se tomaron la física de conducción, el </w:t>
-      </w:r>
-      <w:proofErr w:type="spellStart"/>
-      <w:r>
-        <w:rPr>
-          <w:rFonts w:ascii="Arial" w:hAnsi="Arial" w:cs="Arial"/>
-        </w:rPr>
-        <w:t>shader</w:t>
-      </w:r>
-      <w:proofErr w:type="spellEnd"/>
-      <w:r>
-        <w:rPr>
-          <w:rFonts w:ascii="Arial" w:hAnsi="Arial" w:cs="Arial"/>
-        </w:rPr>
-        <w:t xml:space="preserve"> de iluminación y el </w:t>
-      </w:r>
-      <w:proofErr w:type="spellStart"/>
-      <w:r>
-        <w:rPr>
-          <w:rFonts w:ascii="Arial" w:hAnsi="Arial" w:cs="Arial"/>
-        </w:rPr>
-        <w:t>minimapa</w:t>
-      </w:r>
-      <w:proofErr w:type="spellEnd"/>
-      <w:r>
-        <w:rPr>
-          <w:rFonts w:ascii="Arial" w:hAnsi="Arial" w:cs="Arial"/>
-        </w:rPr>
-        <w:t>) y la amplía de un mapa de 7 × 7 c</w:t>
-      </w:r>
-      <w:r>
-        <w:rPr>
-          <w:rFonts w:ascii="Arial" w:hAnsi="Arial" w:cs="Arial"/>
-        </w:rPr>
-        <w:t xml:space="preserve">eldas a una ciudad de </w:t>
+      <w:r>
+        <w:rPr>
+          <w:rFonts w:ascii="Arial" w:hAnsi="Arial" w:cs="Arial"/>
+        </w:rPr>
+        <w:t xml:space="preserve">, de la cual se tomaron la física de conducción, el shader de iluminación y el minimapa) y la amplía de un mapa de 7 × 7 celdas a una ciudad de </w:t>
       </w:r>
       <w:r>
         <w:rPr>
@@ -420,21 +333,7 @@
         <w:rPr>
           <w:rFonts w:ascii="Arial" w:hAnsi="Arial" w:cs="Arial"/>
         </w:rPr>
-        <w:t xml:space="preserve">, con zonas transitables, obstáculos, colisiones, cámaras y </w:t>
-      </w:r>
-      <w:proofErr w:type="spellStart"/>
-      <w:r>
-        <w:rPr>
-          <w:rFonts w:ascii="Arial" w:hAnsi="Arial" w:cs="Arial"/>
-        </w:rPr>
-        <w:t>minimapa</w:t>
-      </w:r>
-      <w:proofErr w:type="spellEnd"/>
-      <w:r>
-        <w:rPr>
-          <w:rFonts w:ascii="Arial" w:hAnsi="Arial" w:cs="Arial"/>
-        </w:rPr>
-        <w:t xml:space="preserve"> adaptados a ese tamaño.</w:t>
+        <w:t>, con zonas transitables, obstáculos, colisiones, cámaras y minimapa adaptados a ese tamaño.</w:t>
       </w:r>
     </w:p>
     <w:p>
@@ -475,43 +374,7 @@
         <w:rPr>
           <w:rFonts w:ascii="Arial" w:hAnsi="Arial" w:cs="Arial"/>
         </w:rPr>
-        <w:t xml:space="preserve"> con calles, aceras, pasos de cebra, semáforos, faroles, manzanas de casas con patio, </w:t>
-      </w:r>
-      <w:r>
-        <w:rPr>
-          <w:rFonts w:ascii="Arial" w:hAnsi="Arial" w:cs="Arial"/>
-        </w:rPr>
-        <w:t xml:space="preserve">parques, una plaza central, el </w:t>
-      </w:r>
-      <w:proofErr w:type="spellStart"/>
-      <w:r>
-        <w:rPr>
-          <w:rFonts w:ascii="Arial" w:hAnsi="Arial" w:cs="Arial"/>
-        </w:rPr>
-        <w:t>Kwik</w:t>
-      </w:r>
-      <w:proofErr w:type="spellEnd"/>
-      <w:r>
-        <w:rPr>
-          <w:rFonts w:ascii="Arial" w:hAnsi="Arial" w:cs="Arial"/>
-        </w:rPr>
-        <w:t>-E-</w:t>
-      </w:r>
-      <w:proofErr w:type="spellStart"/>
-      <w:proofErr w:type="gramStart"/>
-      <w:r>
-        <w:rPr>
-          <w:rFonts w:ascii="Arial" w:hAnsi="Arial" w:cs="Arial"/>
-        </w:rPr>
-        <w:t>Mart</w:t>
-      </w:r>
-      <w:proofErr w:type="spellEnd"/>
-      <w:proofErr w:type="gramEnd"/>
-      <w:r>
-        <w:rPr>
-          <w:rFonts w:ascii="Arial" w:hAnsi="Arial" w:cs="Arial"/>
-        </w:rPr>
-        <w:t xml:space="preserve"> y la mansión del Sr. Burns.</w:t>
+        <w:t xml:space="preserve"> con calles, aceras, pasos de cebra, semáforos, faroles, manzanas de casas con patio, parques, una plaza central, el Kwik-E-Mart y la mansión del Sr. Burns.</w:t>
       </w:r>
     </w:p>
     <w:p>
@@ -565,13 +428,7 @@
         <w:rPr>
           <w:rFonts w:ascii="Arial" w:hAnsi="Arial" w:cs="Arial"/>
         </w:rPr>
-        <w:t>: faros del auto, 25 farolas activas a la vez, ventanas</w:t>
-      </w:r>
-      <w:r>
-        <w:rPr>
-          <w:rFonts w:ascii="Arial" w:hAnsi="Arial" w:cs="Arial"/>
-        </w:rPr>
-        <w:t xml:space="preserve"> encendidas y luz propia en los faros y faroles.</w:t>
+        <w:t>: faros del auto, 25 farolas activas a la vez, ventanas encendidas y luz propia en los faros y faroles.</w:t>
       </w:r>
     </w:p>
     <w:p>
@@ -625,21 +482,7 @@
         <w:rPr>
           <w:rFonts w:ascii="Arial" w:hAnsi="Arial" w:cs="Arial"/>
         </w:rPr>
-        <w:t xml:space="preserve"> con marca dorada en el mundo y en el </w:t>
-      </w:r>
-      <w:proofErr w:type="spellStart"/>
-      <w:r>
-        <w:rPr>
-          <w:rFonts w:ascii="Arial" w:hAnsi="Arial" w:cs="Arial"/>
-        </w:rPr>
-        <w:t>minimapa</w:t>
-      </w:r>
-      <w:proofErr w:type="spellEnd"/>
-      <w:r>
-        <w:rPr>
-          <w:rFonts w:ascii="Arial" w:hAnsi="Arial" w:cs="Arial"/>
-        </w:rPr>
-        <w:t>.</w:t>
+        <w:t xml:space="preserve"> con marca dorada en el mundo y en el minimapa.</w:t>
       </w:r>
     </w:p>
     <w:p>
@@ -654,7 +497,6 @@
           <w:rFonts w:ascii="Arial" w:hAnsi="Arial" w:cs="Arial"/>
         </w:rPr>
       </w:pPr>
-      <w:proofErr w:type="spellStart"/>
       <w:r>
         <w:rPr>
           <w:rFonts w:ascii="Arial" w:hAnsi="Arial" w:cs="Arial"/>
@@ -663,7 +505,6 @@
         </w:rPr>
         <w:t>Minimapa</w:t>
       </w:r>
-      <w:proofErr w:type="spellEnd"/>
       <w:r>
         <w:rPr>
           <w:rFonts w:ascii="Arial" w:hAnsi="Arial" w:cs="Arial"/>
@@ -697,7 +538,6 @@
         </w:rPr>
         <w:t xml:space="preserve"> (</w:t>
       </w:r>
-      <w:proofErr w:type="spellStart"/>
       <w:r>
         <w:rPr>
           <w:rFonts w:ascii="Arial" w:eastAsia="Consolas" w:hAnsi="Arial" w:cs="Arial"/>
@@ -707,7 +547,6 @@
         </w:rPr>
         <w:t>VisorModelos</w:t>
       </w:r>
-      <w:proofErr w:type="spellEnd"/>
       <w:r>
         <w:rPr>
           <w:rFonts w:ascii="Arial" w:hAnsi="Arial" w:cs="Arial"/>
@@ -823,7 +662,6 @@
         </w:rPr>
         <w:t xml:space="preserve"> y </w:t>
       </w:r>
-      <w:proofErr w:type="spellStart"/>
       <w:r>
         <w:rPr>
           <w:rFonts w:ascii="Arial" w:hAnsi="Arial" w:cs="Arial"/>
@@ -832,7 +670,6 @@
         </w:rPr>
         <w:t>Maven</w:t>
       </w:r>
-      <w:proofErr w:type="spellEnd"/>
       <w:r>
         <w:rPr>
           <w:rFonts w:ascii="Arial" w:hAnsi="Arial" w:cs="Arial"/>
@@ -891,143 +728,62 @@
         <w:spacing w:line="252" w:lineRule="auto"/>
         <w:ind w:left="240" w:right="240"/>
       </w:pPr>
-      <w:proofErr w:type="spellStart"/>
       <w:r>
         <w:rPr>
           <w:rFonts w:ascii="Consolas" w:eastAsia="Consolas" w:hAnsi="Consolas" w:cs="Consolas"/>
           <w:sz w:val="19"/>
           <w:szCs w:val="19"/>
         </w:rPr>
-        <w:t>mvn</w:t>
-      </w:r>
-      <w:proofErr w:type="spellEnd"/>
+        <w:t>mvn compile exec:exec</w:t>
+      </w:r>
+    </w:p>
+    <w:p>
+      <w:pPr>
+        <w:shd w:val="clear" w:color="auto" w:fill="F2F2F2"/>
+        <w:spacing w:line="252" w:lineRule="auto"/>
+        <w:ind w:left="240" w:right="240"/>
+      </w:pPr>
+    </w:p>
+    <w:p>
+      <w:pPr>
+        <w:shd w:val="clear" w:color="auto" w:fill="F2F2F2"/>
+        <w:spacing w:line="252" w:lineRule="auto"/>
+        <w:ind w:left="240" w:right="240"/>
+      </w:pPr>
       <w:r>
         <w:rPr>
           <w:rFonts w:ascii="Consolas" w:eastAsia="Consolas" w:hAnsi="Consolas" w:cs="Consolas"/>
           <w:sz w:val="19"/>
           <w:szCs w:val="19"/>
         </w:rPr>
-        <w:t xml:space="preserve"> compile </w:t>
-      </w:r>
-      <w:proofErr w:type="spellStart"/>
-      <w:proofErr w:type="gramStart"/>
+        <w:t># El visor de modelos individuales</w:t>
+      </w:r>
+    </w:p>
+    <w:p>
+      <w:pPr>
+        <w:shd w:val="clear" w:color="auto" w:fill="F2F2F2"/>
+        <w:spacing w:line="252" w:lineRule="auto"/>
+        <w:ind w:left="240" w:right="240"/>
+        <w:rPr>
+          <w:lang w:val="en-US"/>
+        </w:rPr>
+      </w:pPr>
       <w:r>
         <w:rPr>
           <w:rFonts w:ascii="Consolas" w:eastAsia="Consolas" w:hAnsi="Consolas" w:cs="Consolas"/>
           <w:sz w:val="19"/>
           <w:szCs w:val="19"/>
-        </w:rPr>
-        <w:t>exec:exec</w:t>
-      </w:r>
-      <w:proofErr w:type="spellEnd"/>
-      <w:proofErr w:type="gramEnd"/>
-    </w:p>
-    <w:p>
-      <w:pPr>
-        <w:shd w:val="clear" w:color="auto" w:fill="F2F2F2"/>
-        <w:spacing w:line="252" w:lineRule="auto"/>
-        <w:ind w:left="240" w:right="240"/>
-      </w:pPr>
-    </w:p>
-    <w:p>
-      <w:pPr>
-        <w:shd w:val="clear" w:color="auto" w:fill="F2F2F2"/>
-        <w:spacing w:line="252" w:lineRule="auto"/>
-        <w:ind w:left="240" w:right="240"/>
-      </w:pPr>
-      <w:r>
-        <w:rPr>
-          <w:rFonts w:ascii="Consolas" w:eastAsia="Consolas" w:hAnsi="Consolas" w:cs="Consolas"/>
-          <w:sz w:val="19"/>
-          <w:szCs w:val="19"/>
-        </w:rPr>
-        <w:t># El visor de modelos individuales</w:t>
-      </w:r>
-    </w:p>
-    <w:p>
-      <w:pPr>
-        <w:shd w:val="clear" w:color="auto" w:fill="F2F2F2"/>
-        <w:spacing w:line="252" w:lineRule="auto"/>
-        <w:ind w:left="240" w:right="240"/>
-      </w:pPr>
-      <w:proofErr w:type="spellStart"/>
-      <w:r>
-        <w:rPr>
-          <w:rFonts w:ascii="Consolas" w:eastAsia="Consolas" w:hAnsi="Consolas" w:cs="Consolas"/>
-          <w:sz w:val="19"/>
-          <w:szCs w:val="19"/>
-        </w:rPr>
-        <w:t>mvn</w:t>
-      </w:r>
-      <w:proofErr w:type="spellEnd"/>
-      <w:r>
-        <w:rPr>
-          <w:rFonts w:ascii="Consolas" w:eastAsia="Consolas" w:hAnsi="Consolas" w:cs="Consolas"/>
-          <w:sz w:val="19"/>
-          <w:szCs w:val="19"/>
-        </w:rPr>
-        <w:t xml:space="preserve"> compile </w:t>
-      </w:r>
-      <w:proofErr w:type="spellStart"/>
-      <w:proofErr w:type="gramStart"/>
-      <w:r>
-        <w:rPr>
-          <w:rFonts w:ascii="Consolas" w:eastAsia="Consolas" w:hAnsi="Consolas" w:cs="Consolas"/>
-          <w:sz w:val="19"/>
-          <w:szCs w:val="19"/>
-        </w:rPr>
-        <w:t>exec:exec</w:t>
-      </w:r>
-      <w:proofErr w:type="spellEnd"/>
-      <w:proofErr w:type="gramEnd"/>
-      <w:r>
-        <w:rPr>
-          <w:rFonts w:ascii="Consolas" w:eastAsia="Consolas" w:hAnsi="Consolas" w:cs="Consolas"/>
-          <w:sz w:val="19"/>
-          <w:szCs w:val="19"/>
-        </w:rPr>
-        <w:t xml:space="preserve"> -</w:t>
-      </w:r>
-      <w:proofErr w:type="spellStart"/>
-      <w:r>
-        <w:rPr>
-          <w:rFonts w:ascii="Consolas" w:eastAsia="Consolas" w:hAnsi="Consolas" w:cs="Consolas"/>
-          <w:sz w:val="19"/>
-          <w:szCs w:val="19"/>
-        </w:rPr>
-        <w:t>DmainClass</w:t>
-      </w:r>
-      <w:proofErr w:type="spellEnd"/>
-      <w:r>
-        <w:rPr>
-          <w:rFonts w:ascii="Consolas" w:eastAsia="Consolas" w:hAnsi="Consolas" w:cs="Consolas"/>
-          <w:sz w:val="19"/>
-          <w:szCs w:val="19"/>
-        </w:rPr>
-        <w:t>=</w:t>
-      </w:r>
-      <w:proofErr w:type="spellStart"/>
-      <w:r>
-        <w:rPr>
-          <w:rFonts w:ascii="Consolas" w:eastAsia="Consolas" w:hAnsi="Consolas" w:cs="Consolas"/>
-          <w:sz w:val="19"/>
-          <w:szCs w:val="19"/>
-        </w:rPr>
-        <w:t>com.graphics.VisorMod</w:t>
-      </w:r>
-      <w:r>
-        <w:rPr>
-          <w:rFonts w:ascii="Consolas" w:eastAsia="Consolas" w:hAnsi="Consolas" w:cs="Consolas"/>
-          <w:sz w:val="19"/>
-          <w:szCs w:val="19"/>
-        </w:rPr>
-        <w:t>elos</w:t>
-      </w:r>
-      <w:proofErr w:type="spellEnd"/>
+          <w:lang w:val="en-US"/>
+        </w:rPr>
+        <w:t>mvn compile exec:exec -DmainClass=com.graphics.VisorModelos</w:t>
+      </w:r>
     </w:p>
     <w:p>
       <w:pPr>
         <w:spacing w:after="120"/>
+        <w:rPr>
+          <w:lang w:val="en-US"/>
+        </w:rPr>
       </w:pPr>
     </w:p>
     <w:p>
@@ -1041,21 +797,7 @@
         <w:rPr>
           <w:rFonts w:ascii="Arial" w:hAnsi="Arial" w:cs="Arial"/>
         </w:rPr>
-        <w:t xml:space="preserve">La primera compilación descarga las dependencias. Se requiere una sesión gráfica y un controlador con </w:t>
-      </w:r>
-      <w:proofErr w:type="spellStart"/>
-      <w:r>
-        <w:rPr>
-          <w:rFonts w:ascii="Arial" w:hAnsi="Arial" w:cs="Arial"/>
-        </w:rPr>
-        <w:t>OpenGL</w:t>
-      </w:r>
-      <w:proofErr w:type="spellEnd"/>
-      <w:r>
-        <w:rPr>
-          <w:rFonts w:ascii="Arial" w:hAnsi="Arial" w:cs="Arial"/>
-        </w:rPr>
-        <w:t xml:space="preserve"> 3.3. ESC cierra la ventana en ambos programas.</w:t>
+        <w:t>La primera compilación descarga las dependencias. Se requiere una sesión gráfica y un controlador con OpenGL 3.3. ESC cierra la ventana en ambos programas.</w:t>
       </w:r>
     </w:p>
     <w:p>
@@ -1085,7 +827,6 @@
         </w:rPr>
         <w:t xml:space="preserve">El código está en </w:t>
       </w:r>
-      <w:proofErr w:type="spellStart"/>
       <w:r>
         <w:rPr>
           <w:rFonts w:ascii="Arial" w:eastAsia="Consolas" w:hAnsi="Arial" w:cs="Arial"/>
@@ -1093,9 +834,14 @@
           <w:sz w:val="20"/>
           <w:szCs w:val="20"/>
         </w:rPr>
-        <w:t>src</w:t>
-      </w:r>
-      <w:proofErr w:type="spellEnd"/>
+        <w:t>src/main/java/com/graphics</w:t>
+      </w:r>
+      <w:r>
+        <w:rPr>
+          <w:rFonts w:ascii="Arial" w:hAnsi="Arial" w:cs="Arial"/>
+        </w:rPr>
+        <w:t xml:space="preserve">. Los modelos 3D están separados en el subpaquete </w:t>
+      </w:r>
       <w:r>
         <w:rPr>
           <w:rFonts w:ascii="Arial" w:eastAsia="Consolas" w:hAnsi="Arial" w:cs="Arial"/>
@@ -1103,9 +849,14 @@
           <w:sz w:val="20"/>
           <w:szCs w:val="20"/>
         </w:rPr>
-        <w:t>/</w:t>
-      </w:r>
-      <w:proofErr w:type="spellStart"/>
+        <w:t>modelos</w:t>
+      </w:r>
+      <w:r>
+        <w:rPr>
+          <w:rFonts w:ascii="Arial" w:hAnsi="Arial" w:cs="Arial"/>
+        </w:rPr>
+        <w:t xml:space="preserve">, y cada uno se dibuja con una sola llamada a </w:t>
+      </w:r>
       <w:r>
         <w:rPr>
           <w:rFonts w:ascii="Arial" w:eastAsia="Consolas" w:hAnsi="Arial" w:cs="Arial"/>
@@ -1113,118 +864,7 @@
           <w:sz w:val="20"/>
           <w:szCs w:val="20"/>
         </w:rPr>
-        <w:t>main</w:t>
-      </w:r>
-      <w:proofErr w:type="spellEnd"/>
-      <w:r>
-        <w:rPr>
-          <w:rFonts w:ascii="Arial" w:eastAsia="Consolas" w:hAnsi="Arial" w:cs="Arial"/>
-          <w:color w:val="7A1F3D"/>
-          <w:sz w:val="20"/>
-          <w:szCs w:val="20"/>
-        </w:rPr>
-        <w:t>/java/</w:t>
-      </w:r>
-      <w:proofErr w:type="spellStart"/>
-      <w:r>
-        <w:rPr>
-          <w:rFonts w:ascii="Arial" w:eastAsia="Consolas" w:hAnsi="Arial" w:cs="Arial"/>
-          <w:color w:val="7A1F3D"/>
-          <w:sz w:val="20"/>
-          <w:szCs w:val="20"/>
-        </w:rPr>
-        <w:t>com</w:t>
-      </w:r>
-      <w:proofErr w:type="spellEnd"/>
-      <w:r>
-        <w:rPr>
-          <w:rFonts w:ascii="Arial" w:eastAsia="Consolas" w:hAnsi="Arial" w:cs="Arial"/>
-          <w:color w:val="7A1F3D"/>
-          <w:sz w:val="20"/>
-          <w:szCs w:val="20"/>
-        </w:rPr>
-        <w:t>/</w:t>
-      </w:r>
-      <w:proofErr w:type="spellStart"/>
-      <w:r>
-        <w:rPr>
-          <w:rFonts w:ascii="Arial" w:eastAsia="Consolas" w:hAnsi="Arial" w:cs="Arial"/>
-          <w:color w:val="7A1F3D"/>
-          <w:sz w:val="20"/>
-          <w:szCs w:val="20"/>
-        </w:rPr>
-        <w:t>graphics</w:t>
-      </w:r>
-      <w:proofErr w:type="spellEnd"/>
-      <w:r>
-        <w:rPr>
-          <w:rFonts w:ascii="Arial" w:hAnsi="Arial" w:cs="Arial"/>
-        </w:rPr>
-        <w:t>. Los modelos 3D están se</w:t>
-      </w:r>
-      <w:r>
-        <w:rPr>
-          <w:rFonts w:ascii="Arial" w:hAnsi="Arial" w:cs="Arial"/>
-        </w:rPr>
-        <w:t xml:space="preserve">parados en el </w:t>
-      </w:r>
-      <w:proofErr w:type="spellStart"/>
-      <w:r>
-        <w:rPr>
-          <w:rFonts w:ascii="Arial" w:hAnsi="Arial" w:cs="Arial"/>
-        </w:rPr>
-        <w:t>subpaquete</w:t>
-      </w:r>
-      <w:proofErr w:type="spellEnd"/>
-      <w:r>
-        <w:rPr>
-          <w:rFonts w:ascii="Arial" w:hAnsi="Arial" w:cs="Arial"/>
-        </w:rPr>
-        <w:t xml:space="preserve"> </w:t>
-      </w:r>
-      <w:r>
-        <w:rPr>
-          <w:rFonts w:ascii="Arial" w:eastAsia="Consolas" w:hAnsi="Arial" w:cs="Arial"/>
-          <w:color w:val="7A1F3D"/>
-          <w:sz w:val="20"/>
-          <w:szCs w:val="20"/>
-        </w:rPr>
-        <w:t>modelos</w:t>
-      </w:r>
-      <w:r>
-        <w:rPr>
-          <w:rFonts w:ascii="Arial" w:hAnsi="Arial" w:cs="Arial"/>
-        </w:rPr>
-        <w:t xml:space="preserve">, y cada uno se dibuja con una sola llamada a </w:t>
-      </w:r>
-      <w:r>
-        <w:rPr>
-          <w:rFonts w:ascii="Arial" w:eastAsia="Consolas" w:hAnsi="Arial" w:cs="Arial"/>
-          <w:color w:val="7A1F3D"/>
-          <w:sz w:val="20"/>
-          <w:szCs w:val="20"/>
-        </w:rPr>
-        <w:t>dibujar(</w:t>
-      </w:r>
-      <w:proofErr w:type="spellStart"/>
-      <w:r>
-        <w:rPr>
-          <w:rFonts w:ascii="Arial" w:eastAsia="Consolas" w:hAnsi="Arial" w:cs="Arial"/>
-          <w:color w:val="7A1F3D"/>
-          <w:sz w:val="20"/>
-          <w:szCs w:val="20"/>
-        </w:rPr>
-        <w:t>Renderer</w:t>
-      </w:r>
-      <w:proofErr w:type="spellEnd"/>
-      <w:r>
-        <w:rPr>
-          <w:rFonts w:ascii="Arial" w:eastAsia="Consolas" w:hAnsi="Arial" w:cs="Arial"/>
-          <w:color w:val="7A1F3D"/>
-          <w:sz w:val="20"/>
-          <w:szCs w:val="20"/>
-        </w:rPr>
-        <w:t>)</w:t>
+        <w:t>dibujar(Renderer)</w:t>
       </w:r>
       <w:r>
         <w:rPr>
@@ -1371,21 +1011,7 @@
               <w:rPr>
                 <w:rFonts w:ascii="Arial" w:hAnsi="Arial" w:cs="Arial"/>
               </w:rPr>
-              <w:t xml:space="preserve">Ventana, ciclo del juego, teclado, cámara de seguimiento, </w:t>
-            </w:r>
-            <w:proofErr w:type="spellStart"/>
-            <w:r>
-              <w:rPr>
-                <w:rFonts w:ascii="Arial" w:hAnsi="Arial" w:cs="Arial"/>
-              </w:rPr>
-              <w:t>minimapa</w:t>
-            </w:r>
-            <w:proofErr w:type="spellEnd"/>
-            <w:r>
-              <w:rPr>
-                <w:rFonts w:ascii="Arial" w:hAnsi="Arial" w:cs="Arial"/>
-              </w:rPr>
-              <w:t xml:space="preserve"> y orden de dibujo.</w:t>
+              <w:t>Ventana, ciclo del juego, teclado, cámara de seguimiento, minimapa y orden de dibujo.</w:t>
             </w:r>
           </w:p>
         </w:tc>
@@ -1446,19 +1072,11 @@
                 <w:rFonts w:ascii="Arial" w:hAnsi="Arial" w:cs="Arial"/>
               </w:rPr>
             </w:pPr>
-            <w:proofErr w:type="spellStart"/>
-            <w:r>
-              <w:rPr>
-                <w:rFonts w:ascii="Arial" w:hAnsi="Arial" w:cs="Arial"/>
-              </w:rPr>
-              <w:t>Shaders</w:t>
-            </w:r>
-            <w:proofErr w:type="spellEnd"/>
-            <w:r>
-              <w:rPr>
-                <w:rFonts w:ascii="Arial" w:hAnsi="Arial" w:cs="Arial"/>
-              </w:rPr>
-              <w:t xml:space="preserve"> GLSL (proyección, iluminación día/noche, luces), cubo y cilindro, y el dibujo de cajas.</w:t>
+            <w:r>
+              <w:rPr>
+                <w:rFonts w:ascii="Arial" w:hAnsi="Arial" w:cs="Arial"/>
+              </w:rPr>
+              <w:t>Shaders GLSL (proyección, iluminación día/noche, luces), cubo y cilindro, y el dibujo de cajas.</w:t>
             </w:r>
           </w:p>
         </w:tc>
@@ -1523,21 +1141,7 @@
               <w:rPr>
                 <w:rFonts w:ascii="Arial" w:hAnsi="Arial" w:cs="Arial"/>
               </w:rPr>
-              <w:t xml:space="preserve">Mapa de 21 × 21, dibujo de calles y manzanas, farolas para el </w:t>
-            </w:r>
-            <w:proofErr w:type="spellStart"/>
-            <w:r>
-              <w:rPr>
-                <w:rFonts w:ascii="Arial" w:hAnsi="Arial" w:cs="Arial"/>
-              </w:rPr>
-              <w:t>shader</w:t>
-            </w:r>
-            <w:proofErr w:type="spellEnd"/>
-            <w:r>
-              <w:rPr>
-                <w:rFonts w:ascii="Arial" w:hAnsi="Arial" w:cs="Arial"/>
-              </w:rPr>
-              <w:t xml:space="preserve"> y colisiones.</w:t>
+              <w:t>Mapa de 21 × 21, dibujo de calles y manzanas, farolas para el shader y colisiones.</w:t>
             </w:r>
           </w:p>
         </w:tc>
@@ -1732,13 +1336,7 @@
               <w:rPr>
                 <w:rFonts w:ascii="Arial" w:hAnsi="Arial" w:cs="Arial"/>
               </w:rPr>
-              <w:t>Programa aparte para ver cada modelo girando, con flechas para cambiar de mo</w:t>
-            </w:r>
-            <w:r>
-              <w:rPr>
-                <w:rFonts w:ascii="Arial" w:hAnsi="Arial" w:cs="Arial"/>
-              </w:rPr>
-              <w:t>delo.</w:t>
+              <w:t>Programa aparte para ver cada modelo girando, con flechas para cambiar de modelo.</w:t>
             </w:r>
           </w:p>
         </w:tc>
@@ -1838,9 +1436,14 @@
                 <w:sz w:val="19"/>
                 <w:szCs w:val="19"/>
               </w:rPr>
-              <w:t>modelos/</w:t>
-            </w:r>
-            <w:proofErr w:type="spellStart"/>
+              <w:t>modelos/CasaSimpson</w:t>
+            </w:r>
+            <w:r>
+              <w:rPr>
+                <w:rFonts w:ascii="Arial" w:hAnsi="Arial" w:cs="Arial"/>
+              </w:rPr>
+              <w:t xml:space="preserve">, </w:t>
+            </w:r>
             <w:r>
               <w:rPr>
                 <w:rFonts w:ascii="Arial" w:eastAsia="Consolas" w:hAnsi="Arial" w:cs="Arial"/>
@@ -1848,16 +1451,64 @@
                 <w:sz w:val="19"/>
                 <w:szCs w:val="19"/>
               </w:rPr>
-              <w:t>CasaSimpson</w:t>
-            </w:r>
-            <w:proofErr w:type="spellEnd"/>
-            <w:r>
-              <w:rPr>
-                <w:rFonts w:ascii="Arial" w:hAnsi="Arial" w:cs="Arial"/>
-              </w:rPr>
-              <w:t xml:space="preserve">, </w:t>
-            </w:r>
-            <w:proofErr w:type="spellStart"/>
+              <w:t>CasaFlanders</w:t>
+            </w:r>
+          </w:p>
+        </w:tc>
+        <w:tc>
+          <w:tcPr>
+            <w:tcW w:w="6360" w:type="dxa"/>
+            <w:tcBorders>
+              <w:top w:val="single" w:sz="4" w:space="0" w:color="BFBFBF"/>
+              <w:left w:val="single" w:sz="4" w:space="0" w:color="BFBFBF"/>
+              <w:bottom w:val="single" w:sz="4" w:space="0" w:color="BFBFBF"/>
+              <w:right w:val="single" w:sz="4" w:space="0" w:color="BFBFBF"/>
+            </w:tcBorders>
+            <w:tcMar>
+              <w:top w:w="70" w:type="dxa"/>
+              <w:left w:w="110" w:type="dxa"/>
+              <w:bottom w:w="70" w:type="dxa"/>
+              <w:right w:w="110" w:type="dxa"/>
+            </w:tcMar>
+          </w:tcPr>
+          <w:p>
+            <w:pPr>
+              <w:rPr>
+                <w:rFonts w:ascii="Arial" w:hAnsi="Arial" w:cs="Arial"/>
+              </w:rPr>
+            </w:pPr>
+            <w:r>
+              <w:rPr>
+                <w:rFonts w:ascii="Arial" w:hAnsi="Arial" w:cs="Arial"/>
+              </w:rPr>
+              <w:t>Las dos casas principales.</w:t>
+            </w:r>
+          </w:p>
+        </w:tc>
+      </w:tr>
+      <w:tr>
+        <w:tc>
+          <w:tcPr>
+            <w:tcW w:w="3000" w:type="dxa"/>
+            <w:tcBorders>
+              <w:top w:val="single" w:sz="4" w:space="0" w:color="BFBFBF"/>
+              <w:left w:val="single" w:sz="4" w:space="0" w:color="BFBFBF"/>
+              <w:bottom w:val="single" w:sz="4" w:space="0" w:color="BFBFBF"/>
+              <w:right w:val="single" w:sz="4" w:space="0" w:color="BFBFBF"/>
+            </w:tcBorders>
+            <w:tcMar>
+              <w:top w:w="70" w:type="dxa"/>
+              <w:left w:w="110" w:type="dxa"/>
+              <w:bottom w:w="70" w:type="dxa"/>
+              <w:right w:w="110" w:type="dxa"/>
+            </w:tcMar>
+          </w:tcPr>
+          <w:p>
+            <w:pPr>
+              <w:rPr>
+                <w:rFonts w:ascii="Arial" w:hAnsi="Arial" w:cs="Arial"/>
+              </w:rPr>
+            </w:pPr>
             <w:r>
               <w:rPr>
                 <w:rFonts w:ascii="Arial" w:eastAsia="Consolas" w:hAnsi="Arial" w:cs="Arial"/>
@@ -1865,9 +1516,8 @@
                 <w:sz w:val="19"/>
                 <w:szCs w:val="19"/>
               </w:rPr>
-              <w:t>CasaFlanders</w:t>
-            </w:r>
-            <w:proofErr w:type="spellEnd"/>
+              <w:t>modelos/CasaGenerica</w:t>
+            </w:r>
           </w:p>
         </w:tc>
         <w:tc>
@@ -1896,7 +1546,7 @@
               <w:rPr>
                 <w:rFonts w:ascii="Arial" w:hAnsi="Arial" w:cs="Arial"/>
               </w:rPr>
-              <w:t>Las dos casas principales.</w:t>
+              <w:t>Casa de relleno con 4 estilos, 6 colores de pared y 4 de techo.</w:t>
             </w:r>
           </w:p>
         </w:tc>
@@ -1931,9 +1581,64 @@
                 <w:sz w:val="19"/>
                 <w:szCs w:val="19"/>
               </w:rPr>
-              <w:t>modelos/</w:t>
-            </w:r>
-            <w:proofErr w:type="spellStart"/>
+              <w:t>modelos/Lote</w:t>
+            </w:r>
+          </w:p>
+        </w:tc>
+        <w:tc>
+          <w:tcPr>
+            <w:tcW w:w="6360" w:type="dxa"/>
+            <w:tcBorders>
+              <w:top w:val="single" w:sz="4" w:space="0" w:color="BFBFBF"/>
+              <w:left w:val="single" w:sz="4" w:space="0" w:color="BFBFBF"/>
+              <w:bottom w:val="single" w:sz="4" w:space="0" w:color="BFBFBF"/>
+              <w:right w:val="single" w:sz="4" w:space="0" w:color="BFBFBF"/>
+            </w:tcBorders>
+            <w:tcMar>
+              <w:top w:w="70" w:type="dxa"/>
+              <w:left w:w="110" w:type="dxa"/>
+              <w:bottom w:w="70" w:type="dxa"/>
+              <w:right w:w="110" w:type="dxa"/>
+            </w:tcMar>
+          </w:tcPr>
+          <w:p>
+            <w:pPr>
+              <w:rPr>
+                <w:rFonts w:ascii="Arial" w:hAnsi="Arial" w:cs="Arial"/>
+              </w:rPr>
+            </w:pPr>
+            <w:r>
+              <w:rPr>
+                <w:rFonts w:ascii="Arial" w:hAnsi="Arial" w:cs="Arial"/>
+              </w:rPr>
+              <w:t>Terreno de cada casa: pasto, camino, cochera, cercas, árboles, flores y buzón.</w:t>
+            </w:r>
+          </w:p>
+        </w:tc>
+      </w:tr>
+      <w:tr>
+        <w:tc>
+          <w:tcPr>
+            <w:tcW w:w="3000" w:type="dxa"/>
+            <w:tcBorders>
+              <w:top w:val="single" w:sz="4" w:space="0" w:color="BFBFBF"/>
+              <w:left w:val="single" w:sz="4" w:space="0" w:color="BFBFBF"/>
+              <w:bottom w:val="single" w:sz="4" w:space="0" w:color="BFBFBF"/>
+              <w:right w:val="single" w:sz="4" w:space="0" w:color="BFBFBF"/>
+            </w:tcBorders>
+            <w:tcMar>
+              <w:top w:w="70" w:type="dxa"/>
+              <w:left w:w="110" w:type="dxa"/>
+              <w:bottom w:w="70" w:type="dxa"/>
+              <w:right w:w="110" w:type="dxa"/>
+            </w:tcMar>
+          </w:tcPr>
+          <w:p>
+            <w:pPr>
+              <w:rPr>
+                <w:rFonts w:ascii="Arial" w:hAnsi="Arial" w:cs="Arial"/>
+              </w:rPr>
+            </w:pPr>
             <w:r>
               <w:rPr>
                 <w:rFonts w:ascii="Arial" w:eastAsia="Consolas" w:hAnsi="Arial" w:cs="Arial"/>
@@ -1941,65 +1646,14 @@
                 <w:sz w:val="19"/>
                 <w:szCs w:val="19"/>
               </w:rPr>
-              <w:t>CasaGenerica</w:t>
-            </w:r>
-            <w:proofErr w:type="spellEnd"/>
-          </w:p>
-        </w:tc>
-        <w:tc>
-          <w:tcPr>
-            <w:tcW w:w="6360" w:type="dxa"/>
-            <w:tcBorders>
-              <w:top w:val="single" w:sz="4" w:space="0" w:color="BFBFBF"/>
-              <w:left w:val="single" w:sz="4" w:space="0" w:color="BFBFBF"/>
-              <w:bottom w:val="single" w:sz="4" w:space="0" w:color="BFBFBF"/>
-              <w:right w:val="single" w:sz="4" w:space="0" w:color="BFBFBF"/>
-            </w:tcBorders>
-            <w:tcMar>
-              <w:top w:w="70" w:type="dxa"/>
-              <w:left w:w="110" w:type="dxa"/>
-              <w:bottom w:w="70" w:type="dxa"/>
-              <w:right w:w="110" w:type="dxa"/>
-            </w:tcMar>
-          </w:tcPr>
-          <w:p>
-            <w:pPr>
-              <w:rPr>
-                <w:rFonts w:ascii="Arial" w:hAnsi="Arial" w:cs="Arial"/>
-              </w:rPr>
-            </w:pPr>
-            <w:r>
-              <w:rPr>
-                <w:rFonts w:ascii="Arial" w:hAnsi="Arial" w:cs="Arial"/>
-              </w:rPr>
-              <w:t>Casa de relleno con 4 estilos, 6 colores de pared y 4 de techo.</w:t>
-            </w:r>
-          </w:p>
-        </w:tc>
-      </w:tr>
-      <w:tr>
-        <w:tc>
-          <w:tcPr>
-            <w:tcW w:w="3000" w:type="dxa"/>
-            <w:tcBorders>
-              <w:top w:val="single" w:sz="4" w:space="0" w:color="BFBFBF"/>
-              <w:left w:val="single" w:sz="4" w:space="0" w:color="BFBFBF"/>
-              <w:bottom w:val="single" w:sz="4" w:space="0" w:color="BFBFBF"/>
-              <w:right w:val="single" w:sz="4" w:space="0" w:color="BFBFBF"/>
-            </w:tcBorders>
-            <w:tcMar>
-              <w:top w:w="70" w:type="dxa"/>
-              <w:left w:w="110" w:type="dxa"/>
-              <w:bottom w:w="70" w:type="dxa"/>
-              <w:right w:w="110" w:type="dxa"/>
-            </w:tcMar>
-          </w:tcPr>
-          <w:p>
-            <w:pPr>
-              <w:rPr>
-                <w:rFonts w:ascii="Arial" w:hAnsi="Arial" w:cs="Arial"/>
-              </w:rPr>
-            </w:pPr>
+              <w:t>modelos/KwikEMart</w:t>
+            </w:r>
+            <w:r>
+              <w:rPr>
+                <w:rFonts w:ascii="Arial" w:hAnsi="Arial" w:cs="Arial"/>
+              </w:rPr>
+              <w:t xml:space="preserve">, </w:t>
+            </w:r>
             <w:r>
               <w:rPr>
                 <w:rFonts w:ascii="Arial" w:eastAsia="Consolas" w:hAnsi="Arial" w:cs="Arial"/>
@@ -2007,7 +1661,7 @@
                 <w:sz w:val="19"/>
                 <w:szCs w:val="19"/>
               </w:rPr>
-              <w:t>modelos/Lote</w:t>
+              <w:t>MansionBurns</w:t>
             </w:r>
           </w:p>
         </w:tc>
@@ -2037,7 +1691,7 @@
               <w:rPr>
                 <w:rFonts w:ascii="Arial" w:hAnsi="Arial" w:cs="Arial"/>
               </w:rPr>
-              <w:t>Terreno de cada casa: pasto, camino, cochera, cercas, árboles, flores y buzón.</w:t>
+              <w:t>Los dos edificios especiales.</w:t>
             </w:r>
           </w:p>
         </w:tc>
@@ -2072,9 +1726,14 @@
                 <w:sz w:val="19"/>
                 <w:szCs w:val="19"/>
               </w:rPr>
-              <w:t>modelos/</w:t>
-            </w:r>
-            <w:proofErr w:type="spellStart"/>
+              <w:t>modelos/Plaza</w:t>
+            </w:r>
+            <w:r>
+              <w:rPr>
+                <w:rFonts w:ascii="Arial" w:hAnsi="Arial" w:cs="Arial"/>
+              </w:rPr>
+              <w:t xml:space="preserve">, </w:t>
+            </w:r>
             <w:r>
               <w:rPr>
                 <w:rFonts w:ascii="Arial" w:eastAsia="Consolas" w:hAnsi="Arial" w:cs="Arial"/>
@@ -2082,16 +1741,64 @@
                 <w:sz w:val="19"/>
                 <w:szCs w:val="19"/>
               </w:rPr>
-              <w:t>KwikEMart</w:t>
-            </w:r>
-            <w:proofErr w:type="spellEnd"/>
-            <w:r>
-              <w:rPr>
-                <w:rFonts w:ascii="Arial" w:hAnsi="Arial" w:cs="Arial"/>
-              </w:rPr>
-              <w:t xml:space="preserve">, </w:t>
-            </w:r>
-            <w:proofErr w:type="spellStart"/>
+              <w:t>Parque</w:t>
+            </w:r>
+          </w:p>
+        </w:tc>
+        <w:tc>
+          <w:tcPr>
+            <w:tcW w:w="6360" w:type="dxa"/>
+            <w:tcBorders>
+              <w:top w:val="single" w:sz="4" w:space="0" w:color="BFBFBF"/>
+              <w:left w:val="single" w:sz="4" w:space="0" w:color="BFBFBF"/>
+              <w:bottom w:val="single" w:sz="4" w:space="0" w:color="BFBFBF"/>
+              <w:right w:val="single" w:sz="4" w:space="0" w:color="BFBFBF"/>
+            </w:tcBorders>
+            <w:tcMar>
+              <w:top w:w="70" w:type="dxa"/>
+              <w:left w:w="110" w:type="dxa"/>
+              <w:bottom w:w="70" w:type="dxa"/>
+              <w:right w:w="110" w:type="dxa"/>
+            </w:tcMar>
+          </w:tcPr>
+          <w:p>
+            <w:pPr>
+              <w:rPr>
+                <w:rFonts w:ascii="Arial" w:hAnsi="Arial" w:cs="Arial"/>
+              </w:rPr>
+            </w:pPr>
+            <w:r>
+              <w:rPr>
+                <w:rFonts w:ascii="Arial" w:hAnsi="Arial" w:cs="Arial"/>
+              </w:rPr>
+              <w:t>Plaza central con fuente y estatua; parque de una celda.</w:t>
+            </w:r>
+          </w:p>
+        </w:tc>
+      </w:tr>
+      <w:tr>
+        <w:tc>
+          <w:tcPr>
+            <w:tcW w:w="3000" w:type="dxa"/>
+            <w:tcBorders>
+              <w:top w:val="single" w:sz="4" w:space="0" w:color="BFBFBF"/>
+              <w:left w:val="single" w:sz="4" w:space="0" w:color="BFBFBF"/>
+              <w:bottom w:val="single" w:sz="4" w:space="0" w:color="BFBFBF"/>
+              <w:right w:val="single" w:sz="4" w:space="0" w:color="BFBFBF"/>
+            </w:tcBorders>
+            <w:tcMar>
+              <w:top w:w="70" w:type="dxa"/>
+              <w:left w:w="110" w:type="dxa"/>
+              <w:bottom w:w="70" w:type="dxa"/>
+              <w:right w:w="110" w:type="dxa"/>
+            </w:tcMar>
+          </w:tcPr>
+          <w:p>
+            <w:pPr>
+              <w:rPr>
+                <w:rFonts w:ascii="Arial" w:hAnsi="Arial" w:cs="Arial"/>
+              </w:rPr>
+            </w:pPr>
             <w:r>
               <w:rPr>
                 <w:rFonts w:ascii="Arial" w:eastAsia="Consolas" w:hAnsi="Arial" w:cs="Arial"/>
@@ -2099,9 +1806,9 @@
                 <w:sz w:val="19"/>
                 <w:szCs w:val="19"/>
               </w:rPr>
-              <w:t>MansionBurns</w:t>
-            </w:r>
-            <w:proofErr w:type="spellEnd"/>
+              <w:lastRenderedPageBreak/>
+              <w:t>modelos/Arbol</w:t>
+            </w:r>
           </w:p>
         </w:tc>
         <w:tc>
@@ -2130,7 +1837,7 @@
               <w:rPr>
                 <w:rFonts w:ascii="Arial" w:hAnsi="Arial" w:cs="Arial"/>
               </w:rPr>
-              <w:t>Los dos edificios especiales.</w:t>
+              <w:t>Seis tipos de árbol: roble, pino, abedul, palmera, cerezo y ciprés.</w:t>
             </w:r>
           </w:p>
         </w:tc>
@@ -2165,182 +1872,8 @@
                 <w:sz w:val="19"/>
                 <w:szCs w:val="19"/>
               </w:rPr>
-              <w:t>modelos/Plaza</w:t>
-            </w:r>
-            <w:r>
-              <w:rPr>
-                <w:rFonts w:ascii="Arial" w:hAnsi="Arial" w:cs="Arial"/>
-              </w:rPr>
-              <w:t xml:space="preserve">, </w:t>
-            </w:r>
-            <w:r>
-              <w:rPr>
-                <w:rFonts w:ascii="Arial" w:eastAsia="Consolas" w:hAnsi="Arial" w:cs="Arial"/>
-                <w:color w:val="7A1F3D"/>
-                <w:sz w:val="19"/>
-                <w:szCs w:val="19"/>
-              </w:rPr>
-              <w:t>Parque</w:t>
-            </w:r>
-          </w:p>
-        </w:tc>
-        <w:tc>
-          <w:tcPr>
-            <w:tcW w:w="6360" w:type="dxa"/>
-            <w:tcBorders>
-              <w:top w:val="single" w:sz="4" w:space="0" w:color="BFBFBF"/>
-              <w:left w:val="single" w:sz="4" w:space="0" w:color="BFBFBF"/>
-              <w:bottom w:val="single" w:sz="4" w:space="0" w:color="BFBFBF"/>
-              <w:right w:val="single" w:sz="4" w:space="0" w:color="BFBFBF"/>
-            </w:tcBorders>
-            <w:tcMar>
-              <w:top w:w="70" w:type="dxa"/>
-              <w:left w:w="110" w:type="dxa"/>
-              <w:bottom w:w="70" w:type="dxa"/>
-              <w:right w:w="110" w:type="dxa"/>
-            </w:tcMar>
-          </w:tcPr>
-          <w:p>
-            <w:pPr>
-              <w:rPr>
-                <w:rFonts w:ascii="Arial" w:hAnsi="Arial" w:cs="Arial"/>
-              </w:rPr>
-            </w:pPr>
-            <w:r>
-              <w:rPr>
-                <w:rFonts w:ascii="Arial" w:hAnsi="Arial" w:cs="Arial"/>
-              </w:rPr>
-              <w:t>Plaza central con fuente y estatua; parque de una celda.</w:t>
-            </w:r>
-          </w:p>
-        </w:tc>
-      </w:tr>
-      <w:tr>
-        <w:tc>
-          <w:tcPr>
-            <w:tcW w:w="3000" w:type="dxa"/>
-            <w:tcBorders>
-              <w:top w:val="single" w:sz="4" w:space="0" w:color="BFBFBF"/>
-              <w:left w:val="single" w:sz="4" w:space="0" w:color="BFBFBF"/>
-              <w:bottom w:val="single" w:sz="4" w:space="0" w:color="BFBFBF"/>
-              <w:right w:val="single" w:sz="4" w:space="0" w:color="BFBFBF"/>
-            </w:tcBorders>
-            <w:tcMar>
-              <w:top w:w="70" w:type="dxa"/>
-              <w:left w:w="110" w:type="dxa"/>
-              <w:bottom w:w="70" w:type="dxa"/>
-              <w:right w:w="110" w:type="dxa"/>
-            </w:tcMar>
-          </w:tcPr>
-          <w:p>
-            <w:pPr>
-              <w:rPr>
-                <w:rFonts w:ascii="Arial" w:hAnsi="Arial" w:cs="Arial"/>
-              </w:rPr>
-            </w:pPr>
-            <w:r>
-              <w:rPr>
-                <w:rFonts w:ascii="Arial" w:eastAsia="Consolas" w:hAnsi="Arial" w:cs="Arial"/>
-                <w:color w:val="7A1F3D"/>
-                <w:sz w:val="19"/>
-                <w:szCs w:val="19"/>
-              </w:rPr>
-              <w:lastRenderedPageBreak/>
-              <w:t>modelos/</w:t>
-            </w:r>
-            <w:proofErr w:type="spellStart"/>
-            <w:r>
-              <w:rPr>
-                <w:rFonts w:ascii="Arial" w:eastAsia="Consolas" w:hAnsi="Arial" w:cs="Arial"/>
-                <w:color w:val="7A1F3D"/>
-                <w:sz w:val="19"/>
-                <w:szCs w:val="19"/>
-              </w:rPr>
-              <w:t>Arbol</w:t>
-            </w:r>
-            <w:proofErr w:type="spellEnd"/>
-          </w:p>
-        </w:tc>
-        <w:tc>
-          <w:tcPr>
-            <w:tcW w:w="6360" w:type="dxa"/>
-            <w:tcBorders>
-              <w:top w:val="single" w:sz="4" w:space="0" w:color="BFBFBF"/>
-              <w:left w:val="single" w:sz="4" w:space="0" w:color="BFBFBF"/>
-              <w:bottom w:val="single" w:sz="4" w:space="0" w:color="BFBFBF"/>
-              <w:right w:val="single" w:sz="4" w:space="0" w:color="BFBFBF"/>
-            </w:tcBorders>
-            <w:tcMar>
-              <w:top w:w="70" w:type="dxa"/>
-              <w:left w:w="110" w:type="dxa"/>
-              <w:bottom w:w="70" w:type="dxa"/>
-              <w:right w:w="110" w:type="dxa"/>
-            </w:tcMar>
-          </w:tcPr>
-          <w:p>
-            <w:pPr>
-              <w:rPr>
-                <w:rFonts w:ascii="Arial" w:hAnsi="Arial" w:cs="Arial"/>
-              </w:rPr>
-            </w:pPr>
-            <w:r>
-              <w:rPr>
-                <w:rFonts w:ascii="Arial" w:hAnsi="Arial" w:cs="Arial"/>
-              </w:rPr>
-              <w:t>Seis tipos de árbol</w:t>
-            </w:r>
-            <w:r>
-              <w:rPr>
-                <w:rFonts w:ascii="Arial" w:hAnsi="Arial" w:cs="Arial"/>
-              </w:rPr>
-              <w:t>: roble, pino, abedul, palmera, cerezo y ciprés.</w:t>
-            </w:r>
-          </w:p>
-        </w:tc>
-      </w:tr>
-      <w:tr>
-        <w:tc>
-          <w:tcPr>
-            <w:tcW w:w="3000" w:type="dxa"/>
-            <w:tcBorders>
-              <w:top w:val="single" w:sz="4" w:space="0" w:color="BFBFBF"/>
-              <w:left w:val="single" w:sz="4" w:space="0" w:color="BFBFBF"/>
-              <w:bottom w:val="single" w:sz="4" w:space="0" w:color="BFBFBF"/>
-              <w:right w:val="single" w:sz="4" w:space="0" w:color="BFBFBF"/>
-            </w:tcBorders>
-            <w:tcMar>
-              <w:top w:w="70" w:type="dxa"/>
-              <w:left w:w="110" w:type="dxa"/>
-              <w:bottom w:w="70" w:type="dxa"/>
-              <w:right w:w="110" w:type="dxa"/>
-            </w:tcMar>
-          </w:tcPr>
-          <w:p>
-            <w:pPr>
-              <w:rPr>
-                <w:rFonts w:ascii="Arial" w:hAnsi="Arial" w:cs="Arial"/>
-              </w:rPr>
-            </w:pPr>
-            <w:r>
-              <w:rPr>
-                <w:rFonts w:ascii="Arial" w:eastAsia="Consolas" w:hAnsi="Arial" w:cs="Arial"/>
-                <w:color w:val="7A1F3D"/>
-                <w:sz w:val="19"/>
-                <w:szCs w:val="19"/>
-              </w:rPr>
-              <w:t>modelos/</w:t>
-            </w:r>
-            <w:proofErr w:type="spellStart"/>
-            <w:r>
-              <w:rPr>
-                <w:rFonts w:ascii="Arial" w:eastAsia="Consolas" w:hAnsi="Arial" w:cs="Arial"/>
-                <w:color w:val="7A1F3D"/>
-                <w:sz w:val="19"/>
-                <w:szCs w:val="19"/>
-              </w:rPr>
-              <w:t>Semaforo</w:t>
-            </w:r>
-            <w:proofErr w:type="spellEnd"/>
+              <w:t>modelos/Semaforo</w:t>
+            </w:r>
             <w:r>
               <w:rPr>
                 <w:rFonts w:ascii="Arial" w:hAnsi="Arial" w:cs="Arial"/>
@@ -2735,28 +2268,12 @@
                 <w:rFonts w:ascii="Arial" w:hAnsi="Arial" w:cs="Arial"/>
               </w:rPr>
             </w:pPr>
-            <w:proofErr w:type="spellStart"/>
-            <w:r>
-              <w:rPr>
-                <w:rFonts w:ascii="Arial" w:hAnsi="Arial" w:cs="Arial"/>
-              </w:rPr>
-              <w:t>Kwik</w:t>
-            </w:r>
-            <w:proofErr w:type="spellEnd"/>
-            <w:r>
-              <w:rPr>
-                <w:rFonts w:ascii="Arial" w:hAnsi="Arial" w:cs="Arial"/>
-              </w:rPr>
-              <w:t>-E-</w:t>
-            </w:r>
-            <w:proofErr w:type="spellStart"/>
-            <w:r>
-              <w:rPr>
-                <w:rFonts w:ascii="Arial" w:hAnsi="Arial" w:cs="Arial"/>
-              </w:rPr>
-              <w:t>Mart</w:t>
-            </w:r>
-            <w:proofErr w:type="spellEnd"/>
+            <w:r>
+              <w:rPr>
+                <w:rFonts w:ascii="Arial" w:hAnsi="Arial" w:cs="Arial"/>
+              </w:rPr>
+              <w:t>Kwik-E-Mart</w:t>
+            </w:r>
           </w:p>
         </w:tc>
       </w:tr>
@@ -2941,16 +2458,8 @@
               <w:rPr>
                 <w:rFonts w:ascii="Arial" w:hAnsi="Arial" w:cs="Arial"/>
               </w:rPr>
-              <w:t xml:space="preserve">Casa de los Simpson / casa de los </w:t>
-            </w:r>
-            <w:proofErr w:type="spellStart"/>
-            <w:r>
-              <w:rPr>
-                <w:rFonts w:ascii="Arial" w:hAnsi="Arial" w:cs="Arial"/>
-              </w:rPr>
-              <w:t>Flanders</w:t>
-            </w:r>
-            <w:proofErr w:type="spellEnd"/>
+              <w:t>Casa de los Simpson / casa de los Flanders</w:t>
+            </w:r>
           </w:p>
         </w:tc>
       </w:tr>
@@ -3114,21 +2623,7 @@
         <w:rPr>
           <w:rFonts w:ascii="Arial" w:hAnsi="Arial" w:cs="Arial"/>
         </w:rPr>
-        <w:t xml:space="preserve">Al ampliar el mapa no basta con dibujar más columnas: el suelo, los límites, las colisiones, las cámaras y el </w:t>
-      </w:r>
-      <w:proofErr w:type="spellStart"/>
-      <w:r>
-        <w:rPr>
-          <w:rFonts w:ascii="Arial" w:hAnsi="Arial" w:cs="Arial"/>
-        </w:rPr>
-        <w:t>minimapa</w:t>
-      </w:r>
-      <w:proofErr w:type="spellEnd"/>
-      <w:r>
-        <w:rPr>
-          <w:rFonts w:ascii="Arial" w:hAnsi="Arial" w:cs="Arial"/>
-        </w:rPr>
-        <w:t xml:space="preserve"> deben funcionar igual que en el mapa original de 7 × 7. Esto es lo que se adaptó:</w:t>
+        <w:t>Al ampliar el mapa no basta con dibujar más columnas: el suelo, los límites, las colisiones, las cámaras y el minimapa deben funcionar igual que en el mapa original de 7 × 7. Esto es lo que se adaptó:</w:t>
       </w:r>
     </w:p>
     <w:tbl>
@@ -3216,16 +2711,71 @@
                 <w:bCs/>
                 <w:color w:val="FFFFFF"/>
               </w:rPr>
-              <w:t>Cómo se</w:t>
-            </w:r>
+              <w:t>Cómo se resolvió</w:t>
+            </w:r>
+          </w:p>
+        </w:tc>
+      </w:tr>
+      <w:tr>
+        <w:tc>
+          <w:tcPr>
+            <w:tcW w:w="2300" w:type="dxa"/>
+            <w:tcBorders>
+              <w:top w:val="single" w:sz="4" w:space="0" w:color="BFBFBF"/>
+              <w:left w:val="single" w:sz="4" w:space="0" w:color="BFBFBF"/>
+              <w:bottom w:val="single" w:sz="4" w:space="0" w:color="BFBFBF"/>
+              <w:right w:val="single" w:sz="4" w:space="0" w:color="BFBFBF"/>
+            </w:tcBorders>
+            <w:tcMar>
+              <w:top w:w="70" w:type="dxa"/>
+              <w:left w:w="110" w:type="dxa"/>
+              <w:bottom w:w="70" w:type="dxa"/>
+              <w:right w:w="110" w:type="dxa"/>
+            </w:tcMar>
+          </w:tcPr>
+          <w:p>
+            <w:pPr>
+              <w:rPr>
+                <w:rFonts w:ascii="Arial" w:hAnsi="Arial" w:cs="Arial"/>
+              </w:rPr>
+            </w:pPr>
             <w:r>
               <w:rPr>
                 <w:rFonts w:ascii="Arial" w:hAnsi="Arial" w:cs="Arial"/>
                 <w:b/>
                 <w:bCs/>
-                <w:color w:val="FFFFFF"/>
-              </w:rPr>
-              <w:t xml:space="preserve"> resolvió</w:t>
+              </w:rPr>
+              <w:t>Suelo</w:t>
+            </w:r>
+          </w:p>
+        </w:tc>
+        <w:tc>
+          <w:tcPr>
+            <w:tcW w:w="7060" w:type="dxa"/>
+            <w:tcBorders>
+              <w:top w:val="single" w:sz="4" w:space="0" w:color="BFBFBF"/>
+              <w:left w:val="single" w:sz="4" w:space="0" w:color="BFBFBF"/>
+              <w:bottom w:val="single" w:sz="4" w:space="0" w:color="BFBFBF"/>
+              <w:right w:val="single" w:sz="4" w:space="0" w:color="BFBFBF"/>
+            </w:tcBorders>
+            <w:tcMar>
+              <w:top w:w="70" w:type="dxa"/>
+              <w:left w:w="110" w:type="dxa"/>
+              <w:bottom w:w="70" w:type="dxa"/>
+              <w:right w:w="110" w:type="dxa"/>
+            </w:tcMar>
+          </w:tcPr>
+          <w:p>
+            <w:pPr>
+              <w:rPr>
+                <w:rFonts w:ascii="Arial" w:hAnsi="Arial" w:cs="Arial"/>
+              </w:rPr>
+            </w:pPr>
+            <w:r>
+              <w:rPr>
+                <w:rFonts w:ascii="Arial" w:hAnsi="Arial" w:cs="Arial"/>
+              </w:rPr>
+              <w:t>Un plano base de 300 × 300 cubre toda la ciudad (294 × 294), más el asfalto y las aceras de cada celda.</w:t>
             </w:r>
           </w:p>
         </w:tc>
@@ -3259,7 +2809,7 @@
                 <w:b/>
                 <w:bCs/>
               </w:rPr>
-              <w:t>Suelo</w:t>
+              <w:t>Zonas transitables</w:t>
             </w:r>
           </w:p>
         </w:tc>
@@ -3289,7 +2839,7 @@
               <w:rPr>
                 <w:rFonts w:ascii="Arial" w:hAnsi="Arial" w:cs="Arial"/>
               </w:rPr>
-              <w:t>Un plano base de 300 × 300 cubre toda la ciudad (294 × 294), más el asfalto y las aceras de cada celda.</w:t>
+              <w:t>Solo las celdas con código 0 son transitables; el resto son obstáculos.</w:t>
             </w:r>
           </w:p>
         </w:tc>
@@ -3323,7 +2873,7 @@
                 <w:b/>
                 <w:bCs/>
               </w:rPr>
-              <w:t>Zonas transitables</w:t>
+              <w:t>Límites del mapa</w:t>
             </w:r>
           </w:p>
         </w:tc>
@@ -3353,7 +2903,7 @@
               <w:rPr>
                 <w:rFonts w:ascii="Arial" w:hAnsi="Arial" w:cs="Arial"/>
               </w:rPr>
-              <w:t>Solo las celdas con código 0 son transitables; el resto son obstáculos.</w:t>
+              <w:t>Las celdas fuera de la matriz se tratan como obstáculos, así que el auto no puede salir de la ciudad.</w:t>
             </w:r>
           </w:p>
         </w:tc>
@@ -3387,7 +2937,7 @@
                 <w:b/>
                 <w:bCs/>
               </w:rPr>
-              <w:t>Límites del mapa</w:t>
+              <w:t>Colisiones</w:t>
             </w:r>
           </w:p>
         </w:tc>
@@ -3417,7 +2967,14 @@
               <w:rPr>
                 <w:rFonts w:ascii="Arial" w:hAnsi="Arial" w:cs="Arial"/>
               </w:rPr>
-              <w:t>Las celdas fuera de la matriz se tratan como obstáculos, así que el auto no puede salir de la ciudad.</w:t>
+              <w:t xml:space="preserve">El auto es una cápsula de dos esferas (radio 1,0; una delante y otra detrás). En cada cuadro se revisan las 3 × 3 celdas vecinas de cada esfera y, si tocan una celda que no es calle, se empuja el auto hacia </w:t>
+            </w:r>
+            <w:r>
+              <w:rPr>
+                <w:rFonts w:ascii="Arial" w:hAnsi="Arial" w:cs="Arial"/>
+              </w:rPr>
+              <w:lastRenderedPageBreak/>
+              <w:t>afuera. El muro incluye el ancho de la acera, y el choque desliza: roza conserva 98 % de la velocidad y de frente solo 10 %.</w:t>
             </w:r>
           </w:p>
         </w:tc>
@@ -3451,7 +3008,8 @@
                 <w:b/>
                 <w:bCs/>
               </w:rPr>
-              <w:t>Colisiones</w:t>
+              <w:lastRenderedPageBreak/>
+              <w:t>Cámaras</w:t>
             </w:r>
           </w:p>
         </w:tc>
@@ -3477,21 +3035,12 @@
                 <w:rFonts w:ascii="Arial" w:hAnsi="Arial" w:cs="Arial"/>
               </w:rPr>
             </w:pPr>
-            <w:bookmarkStart w:id="0" w:name="_GoBack"/>
-            <w:r>
-              <w:rPr>
-                <w:rFonts w:ascii="Arial" w:hAnsi="Arial" w:cs="Arial"/>
-              </w:rPr>
-              <w:t xml:space="preserve">El auto es una cápsula de dos esferas (radio 1,0; una delante y otra detrás). En cada cuadro se revisan las 3 × 3 celdas vecinas de cada esfera y, si tocan una celda que no es calle, se empuja el auto hacia </w:t>
-            </w:r>
-            <w:r>
-              <w:rPr>
-                <w:rFonts w:ascii="Arial" w:hAnsi="Arial" w:cs="Arial"/>
-              </w:rPr>
-              <w:lastRenderedPageBreak/>
-              <w:t>afuera. El muro incluye el ancho de la acera, y el choque desliza: roza conserva 98 % de la velocidad y de frente solo 10 %.</w:t>
-            </w:r>
-            <w:bookmarkEnd w:id="0"/>
+            <w:r>
+              <w:rPr>
+                <w:rFonts w:ascii="Arial" w:hAnsi="Arial" w:cs="Arial"/>
+              </w:rPr>
+              <w:t>Cámara de seguimiento en tercera persona (8,5 unidades detrás, 3,8 de alto, con giro suavizado) y alcance de visión de 350 unidades para ver toda la ciudad.</w:t>
+            </w:r>
           </w:p>
         </w:tc>
       </w:tr>
@@ -3524,8 +3073,7 @@
                 <w:b/>
                 <w:bCs/>
               </w:rPr>
-              <w:lastRenderedPageBreak/>
-              <w:t>Cámaras</w:t>
+              <w:t>Minimapa</w:t>
             </w:r>
           </w:p>
         </w:tc>
@@ -3555,7 +3103,7 @@
               <w:rPr>
                 <w:rFonts w:ascii="Arial" w:hAnsi="Arial" w:cs="Arial"/>
               </w:rPr>
-              <w:t>Cámara de seguimiento en tercera persona (8,5 unidades detrás, 3,8 de alto, con giro suavizado) y alcance de visión de 350 unidades para ver toda la ciudad.</w:t>
+              <w:t>Proyección ortográfica con escala 1/160 que abarca los 294 × 294; el recuadro mide hasta 260 píxeles y se adapta al tamaño de la ventana.</w:t>
             </w:r>
           </w:p>
         </w:tc>
@@ -3583,16 +3131,14 @@
                 <w:rFonts w:ascii="Arial" w:hAnsi="Arial" w:cs="Arial"/>
               </w:rPr>
             </w:pPr>
-            <w:proofErr w:type="spellStart"/>
             <w:r>
               <w:rPr>
                 <w:rFonts w:ascii="Arial" w:hAnsi="Arial" w:cs="Arial"/>
                 <w:b/>
                 <w:bCs/>
               </w:rPr>
-              <w:t>Minimapa</w:t>
-            </w:r>
-            <w:proofErr w:type="spellEnd"/>
+              <w:t>Destino activo</w:t>
+            </w:r>
           </w:p>
         </w:tc>
         <w:tc>
@@ -3621,91 +3167,7 @@
               <w:rPr>
                 <w:rFonts w:ascii="Arial" w:hAnsi="Arial" w:cs="Arial"/>
               </w:rPr>
-              <w:t>Proyección ortográfica con escala 1/160 que abar</w:t>
-            </w:r>
-            <w:r>
-              <w:rPr>
-                <w:rFonts w:ascii="Arial" w:hAnsi="Arial" w:cs="Arial"/>
-              </w:rPr>
-              <w:t>ca los 294 × 294; el recuadro mide hasta 260 píxeles y se adapta al tamaño de la ventana.</w:t>
-            </w:r>
-          </w:p>
-        </w:tc>
-      </w:tr>
-      <w:tr>
-        <w:tc>
-          <w:tcPr>
-            <w:tcW w:w="2300" w:type="dxa"/>
-            <w:tcBorders>
-              <w:top w:val="single" w:sz="4" w:space="0" w:color="BFBFBF"/>
-              <w:left w:val="single" w:sz="4" w:space="0" w:color="BFBFBF"/>
-              <w:bottom w:val="single" w:sz="4" w:space="0" w:color="BFBFBF"/>
-              <w:right w:val="single" w:sz="4" w:space="0" w:color="BFBFBF"/>
-            </w:tcBorders>
-            <w:tcMar>
-              <w:top w:w="70" w:type="dxa"/>
-              <w:left w:w="110" w:type="dxa"/>
-              <w:bottom w:w="70" w:type="dxa"/>
-              <w:right w:w="110" w:type="dxa"/>
-            </w:tcMar>
-          </w:tcPr>
-          <w:p>
-            <w:pPr>
-              <w:rPr>
-                <w:rFonts w:ascii="Arial" w:hAnsi="Arial" w:cs="Arial"/>
-              </w:rPr>
-            </w:pPr>
-            <w:r>
-              <w:rPr>
-                <w:rFonts w:ascii="Arial" w:hAnsi="Arial" w:cs="Arial"/>
-                <w:b/>
-                <w:bCs/>
-              </w:rPr>
-              <w:t>Destino activo</w:t>
-            </w:r>
-          </w:p>
-        </w:tc>
-        <w:tc>
-          <w:tcPr>
-            <w:tcW w:w="7060" w:type="dxa"/>
-            <w:tcBorders>
-              <w:top w:val="single" w:sz="4" w:space="0" w:color="BFBFBF"/>
-              <w:left w:val="single" w:sz="4" w:space="0" w:color="BFBFBF"/>
-              <w:bottom w:val="single" w:sz="4" w:space="0" w:color="BFBFBF"/>
-              <w:right w:val="single" w:sz="4" w:space="0" w:color="BFBFBF"/>
-            </w:tcBorders>
-            <w:tcMar>
-              <w:top w:w="70" w:type="dxa"/>
-              <w:left w:w="110" w:type="dxa"/>
-              <w:bottom w:w="70" w:type="dxa"/>
-              <w:right w:w="110" w:type="dxa"/>
-            </w:tcMar>
-          </w:tcPr>
-          <w:p>
-            <w:pPr>
-              <w:rPr>
-                <w:rFonts w:ascii="Arial" w:hAnsi="Arial" w:cs="Arial"/>
-              </w:rPr>
-            </w:pPr>
-            <w:r>
-              <w:rPr>
-                <w:rFonts w:ascii="Arial" w:hAnsi="Arial" w:cs="Arial"/>
-              </w:rPr>
-              <w:t xml:space="preserve">La marca de la misión actual se muestra también en el </w:t>
-            </w:r>
-            <w:proofErr w:type="spellStart"/>
-            <w:r>
-              <w:rPr>
-                <w:rFonts w:ascii="Arial" w:hAnsi="Arial" w:cs="Arial"/>
-              </w:rPr>
-              <w:t>minimapa</w:t>
-            </w:r>
-            <w:proofErr w:type="spellEnd"/>
-            <w:r>
-              <w:rPr>
-                <w:rFonts w:ascii="Arial" w:hAnsi="Arial" w:cs="Arial"/>
-              </w:rPr>
-              <w:t xml:space="preserve"> (ver sección 9).</w:t>
+              <w:t>La marca de la misión actual se muestra también en el minimapa (ver sección 9).</w:t>
             </w:r>
           </w:p>
         </w:tc>
@@ -3741,13 +3203,7 @@
         <w:rPr>
           <w:rFonts w:ascii="Arial" w:hAnsi="Arial" w:cs="Arial"/>
         </w:rPr>
-        <w:t xml:space="preserve">Cada celda de calle dibuja su asfalto y se </w:t>
-      </w:r>
-      <w:r>
-        <w:rPr>
-          <w:rFonts w:ascii="Arial" w:hAnsi="Arial" w:cs="Arial"/>
-        </w:rPr>
-        <w:t>adapta a sus vecinas:</w:t>
+        <w:t>Cada celda de calle dibuja su asfalto y se adapta a sus vecinas:</w:t>
       </w:r>
     </w:p>
     <w:p>
@@ -3882,43 +3338,7 @@
         <w:rPr>
           <w:rFonts w:ascii="Arial" w:hAnsi="Arial" w:cs="Arial"/>
         </w:rPr>
-        <w:t xml:space="preserve"> en las esquinas de cinco intersecciones estratégicas (junto al </w:t>
-      </w:r>
-      <w:proofErr w:type="spellStart"/>
-      <w:r>
-        <w:rPr>
-          <w:rFonts w:ascii="Arial" w:hAnsi="Arial" w:cs="Arial"/>
-        </w:rPr>
-        <w:t>Kwik</w:t>
-      </w:r>
-      <w:proofErr w:type="spellEnd"/>
-      <w:r>
-        <w:rPr>
-          <w:rFonts w:ascii="Arial" w:hAnsi="Arial" w:cs="Arial"/>
-        </w:rPr>
-        <w:t>-E-</w:t>
-      </w:r>
-      <w:proofErr w:type="spellStart"/>
-      <w:proofErr w:type="gramStart"/>
-      <w:r>
-        <w:rPr>
-          <w:rFonts w:ascii="Arial" w:hAnsi="Arial" w:cs="Arial"/>
-        </w:rPr>
-        <w:t>Mart</w:t>
-      </w:r>
-      <w:proofErr w:type="spellEnd"/>
-      <w:proofErr w:type="gramEnd"/>
-      <w:r>
-        <w:rPr>
-          <w:rFonts w:ascii="Arial" w:hAnsi="Arial" w:cs="Arial"/>
-        </w:rPr>
-        <w:t xml:space="preserve">, la mansión, la casa de los Simpson y dos esquinas </w:t>
-      </w:r>
-      <w:r>
-        <w:rPr>
-          <w:rFonts w:ascii="Arial" w:hAnsi="Arial" w:cs="Arial"/>
-        </w:rPr>
-        <w:t>opuestas de la plaza). Cada intersección tiene cuatro postes con un ciclo de 16 segundos: verde, amarillo y rojo, con el eje contrario desfasado.</w:t>
+        <w:t xml:space="preserve"> en las esquinas de cinco intersecciones estratégicas (junto al Kwik-E-Mart, la mansión, la casa de los Simpson y dos esquinas opuestas de la plaza). Cada intersección tiene cuatro postes con un ciclo de 16 segundos: verde, amarillo y rojo, con el eje contrario desfasado.</w:t>
       </w:r>
     </w:p>
     <w:p>
@@ -4093,13 +3513,7 @@
         <w:rPr>
           <w:rFonts w:ascii="Arial" w:hAnsi="Arial" w:cs="Arial"/>
         </w:rPr>
-        <w:t>, de modo que el mismo mo</w:t>
-      </w:r>
-      <w:r>
-        <w:rPr>
-          <w:rFonts w:ascii="Arial" w:hAnsi="Arial" w:cs="Arial"/>
-        </w:rPr>
-        <w:t>delo se puede usar en tamaños distintos dentro de la ciudad.</w:t>
+        <w:t>, de modo que el mismo modelo se puede usar en tamaños distintos dentro de la ciudad.</w:t>
       </w:r>
     </w:p>
     <w:p>
@@ -4143,13 +3557,7 @@
         <w:rPr>
           <w:rFonts w:ascii="Arial" w:hAnsi="Arial" w:cs="Arial"/>
         </w:rPr>
-        <w:t>): un terreno aparte que lleva pasto, camino a la puerta, cochera, cercas, árboles, flores y buzón. El terreno siempre llena la celda de 14 × 14 sin im</w:t>
-      </w:r>
-      <w:r>
-        <w:rPr>
-          <w:rFonts w:ascii="Arial" w:hAnsi="Arial" w:cs="Arial"/>
-        </w:rPr>
-        <w:t>portar la escala de la casa, así que el patio no se sale a la calle ni choca con el vecino.</w:t>
+        <w:t>): un terreno aparte que lleva pasto, camino a la puerta, cochera, cercas, árboles, flores y buzón. El terreno siempre llena la celda de 14 × 14 sin importar la escala de la casa, así que el patio no se sale a la calle ni choca con el vecino.</w:t>
       </w:r>
     </w:p>
     <w:tbl>
@@ -4334,29 +3742,7 @@
                 <w:sz w:val="18"/>
                 <w:szCs w:val="18"/>
               </w:rPr>
-              <w:t xml:space="preserve">Figura 5. Casa de los </w:t>
-            </w:r>
-            <w:proofErr w:type="spellStart"/>
-            <w:r>
-              <w:rPr>
-                <w:i/>
-                <w:iCs/>
-                <w:color w:val="595959"/>
-                <w:sz w:val="18"/>
-                <w:szCs w:val="18"/>
-              </w:rPr>
-              <w:t>Flanders</w:t>
-            </w:r>
-            <w:proofErr w:type="spellEnd"/>
-            <w:r>
-              <w:rPr>
-                <w:i/>
-                <w:iCs/>
-                <w:color w:val="595959"/>
-                <w:sz w:val="18"/>
-                <w:szCs w:val="18"/>
-              </w:rPr>
-              <w:t xml:space="preserve"> con su patio.</w:t>
+              <w:t>Figura 5. Casa de los Flanders con su patio.</w:t>
             </w:r>
           </w:p>
         </w:tc>
@@ -4525,51 +3911,7 @@
                 <w:sz w:val="18"/>
                 <w:szCs w:val="18"/>
               </w:rPr>
-              <w:t xml:space="preserve">Figura 7. </w:t>
-            </w:r>
-            <w:proofErr w:type="spellStart"/>
-            <w:r>
-              <w:rPr>
-                <w:i/>
-                <w:iCs/>
-                <w:color w:val="595959"/>
-                <w:sz w:val="18"/>
-                <w:szCs w:val="18"/>
-              </w:rPr>
-              <w:t>Kwik</w:t>
-            </w:r>
-            <w:proofErr w:type="spellEnd"/>
-            <w:r>
-              <w:rPr>
-                <w:i/>
-                <w:iCs/>
-                <w:color w:val="595959"/>
-                <w:sz w:val="18"/>
-                <w:szCs w:val="18"/>
-              </w:rPr>
-              <w:t>-E-</w:t>
-            </w:r>
-            <w:proofErr w:type="spellStart"/>
-            <w:r>
-              <w:rPr>
-                <w:i/>
-                <w:iCs/>
-                <w:color w:val="595959"/>
-                <w:sz w:val="18"/>
-                <w:szCs w:val="18"/>
-              </w:rPr>
-              <w:t>Mart</w:t>
-            </w:r>
-            <w:proofErr w:type="spellEnd"/>
-            <w:r>
-              <w:rPr>
-                <w:i/>
-                <w:iCs/>
-                <w:color w:val="595959"/>
-                <w:sz w:val="18"/>
-                <w:szCs w:val="18"/>
-              </w:rPr>
-              <w:t xml:space="preserve"> con letrero de píxeles.</w:t>
+              <w:t>Figura 7. Kwik-E-Mart con letrero de píxeles.</w:t>
             </w:r>
           </w:p>
         </w:tc>
@@ -5247,7 +4589,6 @@
           <w:lang w:val="en-US"/>
         </w:rPr>
       </w:pPr>
-      <w:proofErr w:type="spellStart"/>
       <w:r>
         <w:rPr>
           <w:rFonts w:ascii="Consolas" w:eastAsia="Consolas" w:hAnsi="Consolas" w:cs="Consolas"/>
@@ -5255,71 +4596,8 @@
           <w:szCs w:val="19"/>
           <w:lang w:val="en-US"/>
         </w:rPr>
-        <w:t>mvn</w:t>
-      </w:r>
-      <w:proofErr w:type="spellEnd"/>
-      <w:r>
-        <w:rPr>
-          <w:rFonts w:ascii="Consolas" w:eastAsia="Consolas" w:hAnsi="Consolas" w:cs="Consolas"/>
-          <w:sz w:val="19"/>
-          <w:szCs w:val="19"/>
-          <w:lang w:val="en-US"/>
-        </w:rPr>
-        <w:t xml:space="preserve"> compile </w:t>
-      </w:r>
-      <w:proofErr w:type="spellStart"/>
-      <w:proofErr w:type="gramStart"/>
-      <w:r>
-        <w:rPr>
-          <w:rFonts w:ascii="Consolas" w:eastAsia="Consolas" w:hAnsi="Consolas" w:cs="Consolas"/>
-          <w:sz w:val="19"/>
-          <w:szCs w:val="19"/>
-          <w:lang w:val="en-US"/>
-        </w:rPr>
-        <w:t>exec:exec</w:t>
-      </w:r>
-      <w:proofErr w:type="spellEnd"/>
-      <w:proofErr w:type="gramEnd"/>
-      <w:r>
-        <w:rPr>
-          <w:rFonts w:ascii="Consolas" w:eastAsia="Consolas" w:hAnsi="Consolas" w:cs="Consolas"/>
-          <w:sz w:val="19"/>
-          <w:szCs w:val="19"/>
-          <w:lang w:val="en-US"/>
-        </w:rPr>
-        <w:t xml:space="preserve"> -</w:t>
-      </w:r>
-      <w:proofErr w:type="spellStart"/>
-      <w:r>
-        <w:rPr>
-          <w:rFonts w:ascii="Consolas" w:eastAsia="Consolas" w:hAnsi="Consolas" w:cs="Consolas"/>
-          <w:sz w:val="19"/>
-          <w:szCs w:val="19"/>
-          <w:lang w:val="en-US"/>
-        </w:rPr>
-        <w:t>DmainClass</w:t>
-      </w:r>
-      <w:proofErr w:type="spellEnd"/>
-      <w:r>
-        <w:rPr>
-          <w:rFonts w:ascii="Consolas" w:eastAsia="Consolas" w:hAnsi="Consolas" w:cs="Consolas"/>
-          <w:sz w:val="19"/>
-          <w:szCs w:val="19"/>
-          <w:lang w:val="en-US"/>
-        </w:rPr>
-        <w:t>=</w:t>
-      </w:r>
-      <w:proofErr w:type="spellStart"/>
-      <w:r>
-        <w:rPr>
-          <w:rFonts w:ascii="Consolas" w:eastAsia="Consolas" w:hAnsi="Consolas" w:cs="Consolas"/>
-          <w:sz w:val="19"/>
-          <w:szCs w:val="19"/>
-          <w:lang w:val="en-US"/>
-        </w:rPr>
-        <w:t>com.graphics.VisorModelos</w:t>
-      </w:r>
-      <w:proofErr w:type="spellEnd"/>
+        <w:t>mvn compile exec:exec -DmainClass=com.graphics.VisorModelos</w:t>
+      </w:r>
     </w:p>
     <w:p>
       <w:pPr>
@@ -5563,37 +4841,7 @@
         <w:rPr>
           <w:rFonts w:ascii="Arial" w:hAnsi="Arial" w:cs="Arial"/>
         </w:rPr>
-        <w:t xml:space="preserve">El título de la ventana indica el modelo actual y su posición en la lista, por ejemplo «Plaza de Springfield (n/total)». La lista incluye los árboles, el auto, el semáforo, el farol, la plaza, las casas con y sin patio, el </w:t>
-      </w:r>
-      <w:proofErr w:type="spellStart"/>
-      <w:r>
-        <w:rPr>
-          <w:rFonts w:ascii="Arial" w:hAnsi="Arial" w:cs="Arial"/>
-        </w:rPr>
-        <w:t>Kwik</w:t>
-      </w:r>
-      <w:proofErr w:type="spellEnd"/>
-      <w:r>
-        <w:rPr>
-          <w:rFonts w:ascii="Arial" w:hAnsi="Arial" w:cs="Arial"/>
-        </w:rPr>
-        <w:t>-E-</w:t>
-      </w:r>
-      <w:proofErr w:type="spellStart"/>
-      <w:proofErr w:type="gramStart"/>
-      <w:r>
-        <w:rPr>
-          <w:rFonts w:ascii="Arial" w:hAnsi="Arial" w:cs="Arial"/>
-        </w:rPr>
-        <w:t>Mart</w:t>
-      </w:r>
-      <w:proofErr w:type="spellEnd"/>
-      <w:proofErr w:type="gramEnd"/>
-      <w:r>
-        <w:rPr>
-          <w:rFonts w:ascii="Arial" w:hAnsi="Arial" w:cs="Arial"/>
-        </w:rPr>
-        <w:t xml:space="preserve"> y la mansión.</w:t>
+        <w:t>El título de la ventana indica el modelo actual y su posición en la lista, por ejemplo «Plaza de Springfield (n/total)». La lista incluye los árboles, el auto, el semáforo, el farol, la plaza, las casas con y sin patio, el Kwik-E-Mart y la mansión.</w:t>
       </w:r>
     </w:p>
     <w:p>
@@ -5609,15 +4857,7 @@
           <w:b/>
           <w:bCs/>
         </w:rPr>
-        <w:t>Para ag</w:t>
-      </w:r>
-      <w:r>
-        <w:rPr>
-          <w:rFonts w:ascii="Arial" w:hAnsi="Arial" w:cs="Arial"/>
-          <w:b/>
-          <w:bCs/>
-        </w:rPr>
-        <w:t>regar un modelo nuevo</w:t>
+        <w:t>Para agregar un modelo nuevo</w:t>
       </w:r>
       <w:r>
         <w:rPr>
@@ -5625,8 +4865,6 @@
         </w:rPr>
         <w:t xml:space="preserve"> basta una línea en el método </w:t>
       </w:r>
-      <w:proofErr w:type="spellStart"/>
-      <w:proofErr w:type="gramStart"/>
       <w:r>
         <w:rPr>
           <w:rFonts w:ascii="Arial" w:eastAsia="Consolas" w:hAnsi="Arial" w:cs="Arial"/>
@@ -5634,9 +4872,64 @@
           <w:sz w:val="20"/>
           <w:szCs w:val="20"/>
         </w:rPr>
-        <w:t>registrarModelos</w:t>
-      </w:r>
-      <w:proofErr w:type="spellEnd"/>
+        <w:t>registrarModelos()</w:t>
+      </w:r>
+      <w:r>
+        <w:rPr>
+          <w:rFonts w:ascii="Arial" w:hAnsi="Arial" w:cs="Arial"/>
+        </w:rPr>
+        <w:t>: un nombre, la distancia de la cámara y cómo dibujarlo. El visor ajusta la plataforma y las flechas solo.</w:t>
+      </w:r>
+    </w:p>
+    <w:p>
+      <w:pPr>
+        <w:shd w:val="clear" w:color="auto" w:fill="F2F2F2"/>
+        <w:spacing w:line="252" w:lineRule="auto"/>
+        <w:ind w:left="240" w:right="240"/>
+      </w:pPr>
+      <w:r>
+        <w:rPr>
+          <w:rFonts w:ascii="Consolas" w:eastAsia="Consolas" w:hAnsi="Consolas" w:cs="Consolas"/>
+          <w:sz w:val="19"/>
+          <w:szCs w:val="19"/>
+        </w:rPr>
+        <w:t>MiModelo m = new MiModelo(0, 0, 0);</w:t>
+      </w:r>
+    </w:p>
+    <w:p>
+      <w:pPr>
+        <w:shd w:val="clear" w:color="auto" w:fill="F2F2F2"/>
+        <w:spacing w:line="252" w:lineRule="auto"/>
+        <w:ind w:left="240" w:right="240"/>
+      </w:pPr>
+      <w:r>
+        <w:rPr>
+          <w:rFonts w:ascii="Consolas" w:eastAsia="Consolas" w:hAnsi="Consolas" w:cs="Consolas"/>
+          <w:sz w:val="19"/>
+          <w:szCs w:val="19"/>
+        </w:rPr>
+        <w:t>registrar("Mi modelo", 14f, (r, ang) -&gt; { m.angulo = ang; m.dibujar(r); });</w:t>
+      </w:r>
+    </w:p>
+    <w:p>
+      <w:pPr>
+        <w:spacing w:after="120"/>
+      </w:pPr>
+    </w:p>
+    <w:p>
+      <w:pPr>
+        <w:spacing w:after="120" w:line="276" w:lineRule="auto"/>
+        <w:rPr>
+          <w:rFonts w:ascii="Arial" w:hAnsi="Arial" w:cs="Arial"/>
+        </w:rPr>
+      </w:pPr>
+      <w:r>
+        <w:rPr>
+          <w:rFonts w:ascii="Arial" w:hAnsi="Arial" w:cs="Arial"/>
+        </w:rPr>
+        <w:lastRenderedPageBreak/>
+        <w:t xml:space="preserve">El </w:t>
+      </w:r>
       <w:r>
         <w:rPr>
           <w:rFonts w:ascii="Arial" w:eastAsia="Consolas" w:hAnsi="Arial" w:cs="Arial"/>
@@ -5644,187 +4937,28 @@
           <w:sz w:val="20"/>
           <w:szCs w:val="20"/>
         </w:rPr>
-        <w:t>(</w:t>
-      </w:r>
-      <w:proofErr w:type="gramEnd"/>
-      <w:r>
-        <w:rPr>
-          <w:rFonts w:ascii="Arial" w:eastAsia="Consolas" w:hAnsi="Arial" w:cs="Arial"/>
-          <w:color w:val="7A1F3D"/>
-          <w:sz w:val="20"/>
-          <w:szCs w:val="20"/>
-        </w:rPr>
-        <w:t>)</w:t>
-      </w:r>
-      <w:r>
-        <w:rPr>
-          <w:rFonts w:ascii="Arial" w:hAnsi="Arial" w:cs="Arial"/>
-        </w:rPr>
-        <w:t>: un nombre, la distancia de la cámara y cómo dibujarlo. El visor ajusta la plataforma y las flechas solo.</w:t>
-      </w:r>
-    </w:p>
-    <w:p>
-      <w:pPr>
-        <w:shd w:val="clear" w:color="auto" w:fill="F2F2F2"/>
-        <w:spacing w:line="252" w:lineRule="auto"/>
-        <w:ind w:left="240" w:right="240"/>
-      </w:pPr>
-      <w:proofErr w:type="spellStart"/>
-      <w:r>
-        <w:rPr>
-          <w:rFonts w:ascii="Consolas" w:eastAsia="Consolas" w:hAnsi="Consolas" w:cs="Consolas"/>
-          <w:sz w:val="19"/>
-          <w:szCs w:val="19"/>
-        </w:rPr>
-        <w:t>MiModelo</w:t>
-      </w:r>
-      <w:proofErr w:type="spellEnd"/>
-      <w:r>
-        <w:rPr>
-          <w:rFonts w:ascii="Consolas" w:eastAsia="Consolas" w:hAnsi="Consolas" w:cs="Consolas"/>
-          <w:sz w:val="19"/>
-          <w:szCs w:val="19"/>
-        </w:rPr>
-        <w:t xml:space="preserve"> m = new </w:t>
-      </w:r>
-      <w:proofErr w:type="spellStart"/>
-      <w:proofErr w:type="gramStart"/>
-      <w:r>
-        <w:rPr>
-          <w:rFonts w:ascii="Consolas" w:eastAsia="Consolas" w:hAnsi="Consolas" w:cs="Consolas"/>
-          <w:sz w:val="19"/>
-          <w:szCs w:val="19"/>
-        </w:rPr>
-        <w:t>MiModelo</w:t>
-      </w:r>
-      <w:proofErr w:type="spellEnd"/>
-      <w:r>
-        <w:rPr>
-          <w:rFonts w:ascii="Consolas" w:eastAsia="Consolas" w:hAnsi="Consolas" w:cs="Consolas"/>
-          <w:sz w:val="19"/>
-          <w:szCs w:val="19"/>
-        </w:rPr>
-        <w:t>(</w:t>
-      </w:r>
-      <w:proofErr w:type="gramEnd"/>
-      <w:r>
-        <w:rPr>
-          <w:rFonts w:ascii="Consolas" w:eastAsia="Consolas" w:hAnsi="Consolas" w:cs="Consolas"/>
-          <w:sz w:val="19"/>
-          <w:szCs w:val="19"/>
-        </w:rPr>
-        <w:t>0, 0, 0);</w:t>
-      </w:r>
-    </w:p>
-    <w:p>
-      <w:pPr>
-        <w:shd w:val="clear" w:color="auto" w:fill="F2F2F2"/>
-        <w:spacing w:line="252" w:lineRule="auto"/>
-        <w:ind w:left="240" w:right="240"/>
-      </w:pPr>
-      <w:proofErr w:type="gramStart"/>
-      <w:r>
-        <w:rPr>
-          <w:rFonts w:ascii="Consolas" w:eastAsia="Consolas" w:hAnsi="Consolas" w:cs="Consolas"/>
-          <w:sz w:val="19"/>
-          <w:szCs w:val="19"/>
-        </w:rPr>
-        <w:t>registrar(</w:t>
-      </w:r>
-      <w:proofErr w:type="gramEnd"/>
-      <w:r>
-        <w:rPr>
-          <w:rFonts w:ascii="Consolas" w:eastAsia="Consolas" w:hAnsi="Consolas" w:cs="Consolas"/>
-          <w:sz w:val="19"/>
-          <w:szCs w:val="19"/>
-        </w:rPr>
-        <w:t xml:space="preserve">"Mi modelo", 14f, (r, </w:t>
-      </w:r>
-      <w:proofErr w:type="spellStart"/>
-      <w:r>
-        <w:rPr>
-          <w:rFonts w:ascii="Consolas" w:eastAsia="Consolas" w:hAnsi="Consolas" w:cs="Consolas"/>
-          <w:sz w:val="19"/>
-          <w:szCs w:val="19"/>
-        </w:rPr>
         <w:t>ang</w:t>
       </w:r>
-      <w:proofErr w:type="spellEnd"/>
-      <w:r>
-        <w:rPr>
-          <w:rFonts w:ascii="Consolas" w:eastAsia="Consolas" w:hAnsi="Consolas" w:cs="Consolas"/>
-          <w:sz w:val="19"/>
-          <w:szCs w:val="19"/>
-        </w:rPr>
-        <w:t xml:space="preserve">) -&gt; { </w:t>
-      </w:r>
-      <w:proofErr w:type="spellStart"/>
-      <w:r>
-        <w:rPr>
-          <w:rFonts w:ascii="Consolas" w:eastAsia="Consolas" w:hAnsi="Consolas" w:cs="Consolas"/>
-          <w:sz w:val="19"/>
-          <w:szCs w:val="19"/>
-        </w:rPr>
-        <w:t>m.</w:t>
-      </w:r>
-      <w:r>
-        <w:rPr>
-          <w:rFonts w:ascii="Consolas" w:eastAsia="Consolas" w:hAnsi="Consolas" w:cs="Consolas"/>
-          <w:sz w:val="19"/>
-          <w:szCs w:val="19"/>
-        </w:rPr>
-        <w:t>angulo</w:t>
-      </w:r>
-      <w:proofErr w:type="spellEnd"/>
-      <w:r>
-        <w:rPr>
-          <w:rFonts w:ascii="Consolas" w:eastAsia="Consolas" w:hAnsi="Consolas" w:cs="Consolas"/>
-          <w:sz w:val="19"/>
-          <w:szCs w:val="19"/>
-        </w:rPr>
-        <w:t xml:space="preserve"> = </w:t>
-      </w:r>
-      <w:proofErr w:type="spellStart"/>
-      <w:r>
-        <w:rPr>
-          <w:rFonts w:ascii="Consolas" w:eastAsia="Consolas" w:hAnsi="Consolas" w:cs="Consolas"/>
-          <w:sz w:val="19"/>
-          <w:szCs w:val="19"/>
-        </w:rPr>
-        <w:t>ang</w:t>
-      </w:r>
-      <w:proofErr w:type="spellEnd"/>
-      <w:r>
-        <w:rPr>
-          <w:rFonts w:ascii="Consolas" w:eastAsia="Consolas" w:hAnsi="Consolas" w:cs="Consolas"/>
-          <w:sz w:val="19"/>
-          <w:szCs w:val="19"/>
-        </w:rPr>
-        <w:t xml:space="preserve">; </w:t>
-      </w:r>
-      <w:proofErr w:type="spellStart"/>
-      <w:r>
-        <w:rPr>
-          <w:rFonts w:ascii="Consolas" w:eastAsia="Consolas" w:hAnsi="Consolas" w:cs="Consolas"/>
-          <w:sz w:val="19"/>
-          <w:szCs w:val="19"/>
-        </w:rPr>
-        <w:t>m.dibujar</w:t>
-      </w:r>
-      <w:proofErr w:type="spellEnd"/>
-      <w:r>
-        <w:rPr>
-          <w:rFonts w:ascii="Consolas" w:eastAsia="Consolas" w:hAnsi="Consolas" w:cs="Consolas"/>
-          <w:sz w:val="19"/>
-          <w:szCs w:val="19"/>
-        </w:rPr>
-        <w:t>(r); });</w:t>
-      </w:r>
-    </w:p>
-    <w:p>
-      <w:pPr>
-        <w:spacing w:after="120"/>
-      </w:pPr>
+      <w:r>
+        <w:rPr>
+          <w:rFonts w:ascii="Arial" w:hAnsi="Arial" w:cs="Arial"/>
+        </w:rPr>
+        <w:t xml:space="preserve"> es el giro automático. La distancia de la cámara depende del tamaño del modelo: si se ve cortado, se aumenta ese número.</w:t>
+      </w:r>
+    </w:p>
+    <w:p>
+      <w:pPr>
+        <w:pStyle w:val="Ttulo1"/>
+        <w:rPr>
+          <w:color w:val="000000" w:themeColor="text1"/>
+        </w:rPr>
+      </w:pPr>
+      <w:r>
+        <w:rPr>
+          <w:color w:val="000000" w:themeColor="text1"/>
+        </w:rPr>
+        <w:t>8. Conducción</w:t>
+      </w:r>
     </w:p>
     <w:p>
       <w:pPr>
@@ -5837,59 +4971,7 @@
         <w:rPr>
           <w:rFonts w:ascii="Arial" w:hAnsi="Arial" w:cs="Arial"/>
         </w:rPr>
-        <w:lastRenderedPageBreak/>
-        <w:t xml:space="preserve">El </w:t>
-      </w:r>
-      <w:proofErr w:type="spellStart"/>
-      <w:r>
-        <w:rPr>
-          <w:rFonts w:ascii="Arial" w:eastAsia="Consolas" w:hAnsi="Arial" w:cs="Arial"/>
-          <w:color w:val="7A1F3D"/>
-          <w:sz w:val="20"/>
-          <w:szCs w:val="20"/>
-        </w:rPr>
-        <w:t>ang</w:t>
-      </w:r>
-      <w:proofErr w:type="spellEnd"/>
-      <w:r>
-        <w:rPr>
-          <w:rFonts w:ascii="Arial" w:hAnsi="Arial" w:cs="Arial"/>
-        </w:rPr>
-        <w:t xml:space="preserve"> es el giro automático. La distancia de la cámara depende del tamaño del modelo: si se ve cortado, se aumenta ese número.</w:t>
-      </w:r>
-    </w:p>
-    <w:p>
-      <w:pPr>
-        <w:pStyle w:val="Ttulo1"/>
-        <w:rPr>
-          <w:color w:val="000000" w:themeColor="text1"/>
-        </w:rPr>
-      </w:pPr>
-      <w:r>
-        <w:rPr>
-          <w:color w:val="000000" w:themeColor="text1"/>
-        </w:rPr>
-        <w:t>8. Conducción</w:t>
-      </w:r>
-    </w:p>
-    <w:p>
-      <w:pPr>
-        <w:spacing w:after="120" w:line="276" w:lineRule="auto"/>
-        <w:rPr>
-          <w:rFonts w:ascii="Arial" w:hAnsi="Arial" w:cs="Arial"/>
-        </w:rPr>
-      </w:pPr>
-      <w:r>
-        <w:rPr>
-          <w:rFonts w:ascii="Arial" w:hAnsi="Arial" w:cs="Arial"/>
-        </w:rPr>
-        <w:t>La física sigue la guía del curso: aceleración, resistencia exponencial y giro pr</w:t>
-      </w:r>
-      <w:r>
-        <w:rPr>
-          <w:rFonts w:ascii="Arial" w:hAnsi="Arial" w:cs="Arial"/>
-        </w:rPr>
-        <w:t>oporcional a la velocidad.</w:t>
+        <w:t>La física sigue la guía del curso: aceleración, resistencia exponencial y giro proporcional a la velocidad.</w:t>
       </w:r>
     </w:p>
     <w:tbl>
@@ -6306,20 +5388,96 @@
         <w:spacing w:after="120" w:line="276" w:lineRule="auto"/>
         <w:rPr>
           <w:rFonts w:ascii="Arial" w:hAnsi="Arial" w:cs="Arial"/>
-        </w:rPr>
-      </w:pPr>
-      <w:r>
-        <w:rPr>
-          <w:rFonts w:ascii="Arial" w:hAnsi="Arial" w:cs="Arial"/>
-        </w:rPr>
-        <w:t>El auto se mueve en su dirección frontal y las ruedas giran visualmente con el volante. La cámara lo sigue desde atrás y gira con retraso suav</w:t>
-      </w:r>
-      <w:r>
-        <w:rPr>
-          <w:rFonts w:ascii="Arial" w:hAnsi="Arial" w:cs="Arial"/>
-        </w:rPr>
-        <w:t>e para dar sensación de movimiento.</w:t>
-      </w:r>
+          <w:b/>
+          <w:bCs/>
+        </w:rPr>
+      </w:pPr>
+      <w:r>
+        <w:rPr>
+          <w:rFonts w:ascii="Arial" w:hAnsi="Arial" w:cs="Arial"/>
+        </w:rPr>
+        <w:t>El auto se mueve en su dirección frontal y las ruedas giran visualmente con el volante. La cámara lo sigue desde atrás y gira con retraso suave para dar sensación de movimiento.</w:t>
+      </w:r>
+      <w:r>
+        <w:rPr>
+          <w:rFonts w:ascii="Arial" w:hAnsi="Arial" w:cs="Arial"/>
+        </w:rPr>
+        <w:t xml:space="preserve"> Tambien el </w:t>
+      </w:r>
+      <w:r>
+        <w:rPr>
+          <w:rFonts w:ascii="Arial" w:hAnsi="Arial" w:cs="Arial"/>
+        </w:rPr>
+        <w:t>jugador puede alternar en tiempo real entre dos vehículos con comportamientos y físicas distintas mediante la tecla </w:t>
+      </w:r>
+      <w:r>
+        <w:rPr>
+          <w:rFonts w:ascii="Arial" w:hAnsi="Arial" w:cs="Arial"/>
+          <w:b/>
+          <w:bCs/>
+        </w:rPr>
+        <w:t>C</w:t>
+      </w:r>
+      <w:r>
+        <w:rPr>
+          <w:rFonts w:ascii="Arial" w:hAnsi="Arial" w:cs="Arial"/>
+          <w:b/>
+          <w:bCs/>
+        </w:rPr>
+        <w:t>.</w:t>
+      </w:r>
+    </w:p>
+    <w:p>
+      <w:pPr>
+        <w:spacing w:after="120" w:line="276" w:lineRule="auto"/>
+        <w:rPr>
+          <w:rFonts w:ascii="Arial" w:hAnsi="Arial" w:cs="Arial"/>
+        </w:rPr>
+      </w:pPr>
+      <w:r>
+        <w:rPr>
+          <w:rFonts w:ascii="Arial" w:hAnsi="Arial" w:cs="Arial"/>
+          <w:b/>
+          <w:bCs/>
+        </w:rPr>
+        <w:t>Condición de seguridad:</w:t>
+      </w:r>
+      <w:r>
+        <w:rPr>
+          <w:rFonts w:ascii="Arial" w:hAnsi="Arial" w:cs="Arial"/>
+        </w:rPr>
+        <w:t> Siguiendo las buenas prácticas de diseño de videojuegos, el cambio exige que el vehículo esté completamente detenido o frenado ($|velocidad| \le 1.5\text{ u/s}$), evitando descalces en la cámara o que la velocidad exceda los límites del nuevo motor.</w:t>
+      </w:r>
+    </w:p>
+    <w:p>
+      <w:pPr>
+        <w:spacing w:after="120" w:line="276" w:lineRule="auto"/>
+        <w:rPr>
+          <w:rFonts w:ascii="Arial" w:hAnsi="Arial" w:cs="Arial"/>
+        </w:rPr>
+      </w:pPr>
+      <w:r>
+        <w:rPr>
+          <w:rFonts w:ascii="Arial" w:hAnsi="Arial" w:cs="Arial"/>
+          <w:b/>
+          <w:bCs/>
+        </w:rPr>
+        <w:t>Efecto visual de transformación (0.40 s):</w:t>
+      </w:r>
+      <w:r>
+        <w:rPr>
+          <w:rFonts w:ascii="Arial" w:hAnsi="Arial" w:cs="Arial"/>
+        </w:rPr>
+        <w:t> Al cambiar de vehículo, el auto no aparece de forma estática; realiza un pequeño salto elástico vertical de $0.45\text{ m}$ con amortiguación sobre su suspensión, acompañado de un anillo de 8 nubecitas de humo brillante ("POOF") estilo dibujo animado que se expanden y desvanecen alrededor de las ruedas.</w:t>
+      </w:r>
+    </w:p>
+    <w:p>
+      <w:pPr>
+        <w:spacing w:after="120" w:line="276" w:lineRule="auto"/>
+        <w:rPr>
+          <w:rFonts w:ascii="Arial" w:hAnsi="Arial" w:cs="Arial"/>
+        </w:rPr>
+      </w:pPr>
     </w:p>
     <w:p>
       <w:pPr>
@@ -6331,6 +5489,7 @@
         <w:rPr>
           <w:noProof/>
         </w:rPr>
+        <w:lastRenderedPageBreak/>
         <w:drawing>
           <wp:inline distT="0" distB="0" distL="0" distR="0">
             <wp:extent cx="5334000" cy="3200400"/>
@@ -6373,362 +5532,25 @@
     </w:p>
     <w:p>
       <w:pPr>
-        <w:spacing w:after="200"/>
-        <w:jc w:val="center"/>
-      </w:pPr>
-      <w:r>
-        <w:rPr>
-          <w:i/>
-          <w:iCs/>
-          <w:color w:val="595959"/>
-          <w:sz w:val="20"/>
-          <w:szCs w:val="20"/>
-        </w:rPr>
-        <w:t xml:space="preserve">Figura 15. Conducción de día con la tarjeta de juego y el </w:t>
-      </w:r>
-      <w:proofErr w:type="spellStart"/>
-      <w:r>
-        <w:rPr>
-          <w:i/>
-          <w:iCs/>
-          <w:color w:val="595959"/>
-          <w:sz w:val="20"/>
-          <w:szCs w:val="20"/>
-        </w:rPr>
-        <w:t>minimapa</w:t>
-      </w:r>
-      <w:proofErr w:type="spellEnd"/>
-      <w:r>
-        <w:rPr>
-          <w:i/>
-          <w:iCs/>
-          <w:color w:val="595959"/>
-          <w:sz w:val="20"/>
-          <w:szCs w:val="20"/>
-        </w:rPr>
-        <w:t>.</w:t>
-      </w:r>
-    </w:p>
-    <w:p>
-      <w:pPr>
-        <w:pStyle w:val="Ttulo1"/>
-        <w:rPr>
-          <w:color w:val="000000" w:themeColor="text1"/>
-        </w:rPr>
-      </w:pPr>
-      <w:r>
-        <w:rPr>
-          <w:color w:val="000000" w:themeColor="text1"/>
-        </w:rPr>
-        <w:lastRenderedPageBreak/>
-        <w:t>9. Iluminación día y noche</w:t>
-      </w:r>
-    </w:p>
-    <w:p>
-      <w:pPr>
-        <w:spacing w:after="120" w:line="276" w:lineRule="auto"/>
-        <w:rPr>
-          <w:rFonts w:ascii="Arial" w:hAnsi="Arial" w:cs="Arial"/>
-        </w:rPr>
-      </w:pPr>
-      <w:r>
-        <w:rPr>
-          <w:rFonts w:ascii="Arial" w:hAnsi="Arial" w:cs="Arial"/>
-        </w:rPr>
-        <w:t xml:space="preserve">La iluminación se calcula en el fragmento </w:t>
-      </w:r>
-      <w:proofErr w:type="spellStart"/>
-      <w:r>
-        <w:rPr>
-          <w:rFonts w:ascii="Arial" w:hAnsi="Arial" w:cs="Arial"/>
-        </w:rPr>
-        <w:t>shader</w:t>
-      </w:r>
-      <w:proofErr w:type="spellEnd"/>
-      <w:r>
-        <w:rPr>
-          <w:rFonts w:ascii="Arial" w:hAnsi="Arial" w:cs="Arial"/>
-        </w:rPr>
-        <w:t xml:space="preserve"> (</w:t>
-      </w:r>
-      <w:r>
-        <w:rPr>
-          <w:rFonts w:ascii="Arial" w:eastAsia="Consolas" w:hAnsi="Arial" w:cs="Arial"/>
-          <w:color w:val="7A1F3D"/>
-          <w:sz w:val="20"/>
-          <w:szCs w:val="20"/>
-        </w:rPr>
-        <w:t>Renderer.java</w:t>
-      </w:r>
-      <w:r>
-        <w:rPr>
-          <w:rFonts w:ascii="Arial" w:hAnsi="Arial" w:cs="Arial"/>
-        </w:rPr>
-        <w:t>) con el modelo de Lambert: cada cara recibe más o menos luz según hacia dónde mira. El resultado es la suma de varias fuentes:</w:t>
-      </w:r>
-    </w:p>
-    <w:p>
-      <w:pPr>
-        <w:pStyle w:val="Prrafodelista"/>
-        <w:numPr>
-          <w:ilvl w:val="0"/>
-          <w:numId w:val="2"/>
-        </w:numPr>
-        <w:spacing w:after="60" w:line="276" w:lineRule="auto"/>
-        <w:rPr>
-          <w:rFonts w:ascii="Arial" w:hAnsi="Arial" w:cs="Arial"/>
-        </w:rPr>
-      </w:pPr>
-      <w:r>
-        <w:rPr>
-          <w:rFonts w:ascii="Arial" w:hAnsi="Arial" w:cs="Arial"/>
-          <w:b/>
-          <w:bCs/>
-        </w:rPr>
-        <w:t>Ambiente y sol/luna</w:t>
-      </w:r>
-      <w:r>
-        <w:rPr>
-          <w:rFonts w:ascii="Arial" w:hAnsi="Arial" w:cs="Arial"/>
-        </w:rPr>
-        <w:t>: de día es un gris neutro más un sol cálido; de noche, un azul oscuro con una luna tenue.</w:t>
-      </w:r>
-    </w:p>
-    <w:p>
-      <w:pPr>
-        <w:pStyle w:val="Prrafodelista"/>
-        <w:numPr>
-          <w:ilvl w:val="0"/>
-          <w:numId w:val="2"/>
-        </w:numPr>
-        <w:spacing w:after="60" w:line="276" w:lineRule="auto"/>
-        <w:rPr>
-          <w:rFonts w:ascii="Arial" w:hAnsi="Arial" w:cs="Arial"/>
-        </w:rPr>
-      </w:pPr>
-      <w:r>
-        <w:rPr>
-          <w:rFonts w:ascii="Arial" w:hAnsi="Arial" w:cs="Arial"/>
-          <w:b/>
-          <w:bCs/>
-        </w:rPr>
-        <w:t>Farolas</w:t>
-      </w:r>
-      <w:r>
-        <w:rPr>
-          <w:rFonts w:ascii="Arial" w:hAnsi="Arial" w:cs="Arial"/>
-        </w:rPr>
-        <w:t xml:space="preserve">: el </w:t>
-      </w:r>
-      <w:proofErr w:type="spellStart"/>
-      <w:r>
-        <w:rPr>
-          <w:rFonts w:ascii="Arial" w:hAnsi="Arial" w:cs="Arial"/>
-        </w:rPr>
-        <w:t>shader</w:t>
-      </w:r>
-      <w:proofErr w:type="spellEnd"/>
-      <w:r>
-        <w:rPr>
-          <w:rFonts w:ascii="Arial" w:hAnsi="Arial" w:cs="Arial"/>
-        </w:rPr>
-        <w:t xml:space="preserve"> recibe las </w:t>
-      </w:r>
-      <w:r>
-        <w:rPr>
-          <w:rFonts w:ascii="Arial" w:hAnsi="Arial" w:cs="Arial"/>
-          <w:b/>
-          <w:bCs/>
-        </w:rPr>
-        <w:t>25 farolas más cercanas al auto</w:t>
-      </w:r>
-      <w:r>
-        <w:rPr>
-          <w:rFonts w:ascii="Arial" w:hAnsi="Arial" w:cs="Arial"/>
-        </w:rPr>
-        <w:t xml:space="preserve"> (de las decenas que tiene la ciudad). La luz se desvanece con la distancia hasta los 26 metros, sin corte brusco. Los faroles de la plaza también envían luz.</w:t>
-      </w:r>
-    </w:p>
-    <w:p>
-      <w:pPr>
-        <w:pStyle w:val="Prrafodelista"/>
-        <w:numPr>
-          <w:ilvl w:val="0"/>
-          <w:numId w:val="2"/>
-        </w:numPr>
-        <w:spacing w:after="60" w:line="276" w:lineRule="auto"/>
-        <w:rPr>
-          <w:rFonts w:ascii="Arial" w:hAnsi="Arial" w:cs="Arial"/>
-        </w:rPr>
-      </w:pPr>
-      <w:r>
-        <w:rPr>
-          <w:rFonts w:ascii="Arial" w:hAnsi="Arial" w:cs="Arial"/>
-          <w:b/>
-          <w:bCs/>
-        </w:rPr>
-        <w:t>Faros del auto</w:t>
-      </w:r>
-      <w:r>
-        <w:rPr>
-          <w:rFonts w:ascii="Arial" w:hAnsi="Arial" w:cs="Arial"/>
-        </w:rPr>
-        <w:t>: dos conos de luz delante del parachoqu</w:t>
-      </w:r>
-      <w:r>
-        <w:rPr>
-          <w:rFonts w:ascii="Arial" w:hAnsi="Arial" w:cs="Arial"/>
-        </w:rPr>
-        <w:t>es, que se encienden con la tecla F.</w:t>
-      </w:r>
-    </w:p>
-    <w:p>
-      <w:pPr>
-        <w:pStyle w:val="Prrafodelista"/>
-        <w:numPr>
-          <w:ilvl w:val="0"/>
-          <w:numId w:val="2"/>
-        </w:numPr>
-        <w:spacing w:after="60" w:line="276" w:lineRule="auto"/>
-        <w:rPr>
-          <w:rFonts w:ascii="Arial" w:hAnsi="Arial" w:cs="Arial"/>
-        </w:rPr>
-      </w:pPr>
-      <w:r>
-        <w:rPr>
-          <w:rFonts w:ascii="Arial" w:hAnsi="Arial" w:cs="Arial"/>
-          <w:b/>
-          <w:bCs/>
-        </w:rPr>
-        <w:t>Bombillas y faros brillantes</w:t>
-      </w:r>
-      <w:r>
-        <w:rPr>
-          <w:rFonts w:ascii="Arial" w:hAnsi="Arial" w:cs="Arial"/>
-        </w:rPr>
-        <w:t xml:space="preserve">: se dibujan con color fijo (emisión), así que se ven </w:t>
-      </w:r>
-      <w:proofErr w:type="gramStart"/>
-      <w:r>
-        <w:rPr>
-          <w:rFonts w:ascii="Arial" w:hAnsi="Arial" w:cs="Arial"/>
-        </w:rPr>
-        <w:t>encendidos</w:t>
-      </w:r>
-      <w:proofErr w:type="gramEnd"/>
-      <w:r>
-        <w:rPr>
-          <w:rFonts w:ascii="Arial" w:hAnsi="Arial" w:cs="Arial"/>
-        </w:rPr>
-        <w:t xml:space="preserve"> aunque la escena esté oscura.</w:t>
-      </w:r>
-    </w:p>
-    <w:p>
-      <w:pPr>
-        <w:pStyle w:val="Prrafodelista"/>
-        <w:numPr>
-          <w:ilvl w:val="0"/>
-          <w:numId w:val="2"/>
-        </w:numPr>
-        <w:spacing w:after="60" w:line="276" w:lineRule="auto"/>
-        <w:rPr>
-          <w:rFonts w:ascii="Arial" w:hAnsi="Arial" w:cs="Arial"/>
-        </w:rPr>
-      </w:pPr>
-      <w:r>
-        <w:rPr>
-          <w:rFonts w:ascii="Arial" w:hAnsi="Arial" w:cs="Arial"/>
-          <w:b/>
-          <w:bCs/>
-        </w:rPr>
-        <w:t>Ventanas</w:t>
-      </w:r>
-      <w:r>
-        <w:rPr>
-          <w:rFonts w:ascii="Arial" w:hAnsi="Arial" w:cs="Arial"/>
-        </w:rPr>
-        <w:t>: de noche, cerca del 60 % de las ventanas de casas y mansión se encienden con luz cálid</w:t>
-      </w:r>
-      <w:r>
-        <w:rPr>
-          <w:rFonts w:ascii="Arial" w:hAnsi="Arial" w:cs="Arial"/>
-        </w:rPr>
-        <w:t xml:space="preserve">a y suave; el </w:t>
-      </w:r>
-      <w:proofErr w:type="spellStart"/>
-      <w:r>
-        <w:rPr>
-          <w:rFonts w:ascii="Arial" w:hAnsi="Arial" w:cs="Arial"/>
-        </w:rPr>
-        <w:t>Kwik</w:t>
-      </w:r>
-      <w:proofErr w:type="spellEnd"/>
-      <w:r>
-        <w:rPr>
-          <w:rFonts w:ascii="Arial" w:hAnsi="Arial" w:cs="Arial"/>
-        </w:rPr>
-        <w:t>-E-</w:t>
-      </w:r>
-      <w:proofErr w:type="spellStart"/>
-      <w:proofErr w:type="gramStart"/>
-      <w:r>
-        <w:rPr>
-          <w:rFonts w:ascii="Arial" w:hAnsi="Arial" w:cs="Arial"/>
-        </w:rPr>
-        <w:t>Mart</w:t>
-      </w:r>
-      <w:proofErr w:type="spellEnd"/>
-      <w:proofErr w:type="gramEnd"/>
-      <w:r>
-        <w:rPr>
-          <w:rFonts w:ascii="Arial" w:hAnsi="Arial" w:cs="Arial"/>
-        </w:rPr>
-        <w:t xml:space="preserve"> siempre está iluminado.</w:t>
-      </w:r>
-    </w:p>
-    <w:p>
-      <w:pPr>
-        <w:spacing w:after="120" w:line="276" w:lineRule="auto"/>
-        <w:rPr>
-          <w:rFonts w:ascii="Arial" w:hAnsi="Arial" w:cs="Arial"/>
-        </w:rPr>
-      </w:pPr>
-      <w:r>
-        <w:rPr>
-          <w:rFonts w:ascii="Arial" w:hAnsi="Arial" w:cs="Arial"/>
-        </w:rPr>
-        <w:t xml:space="preserve">La tecla </w:t>
-      </w:r>
-      <w:r>
-        <w:rPr>
-          <w:rFonts w:ascii="Arial" w:hAnsi="Arial" w:cs="Arial"/>
-          <w:b/>
-          <w:bCs/>
-        </w:rPr>
-        <w:t>N</w:t>
-      </w:r>
-      <w:r>
-        <w:rPr>
-          <w:rFonts w:ascii="Arial" w:hAnsi="Arial" w:cs="Arial"/>
-        </w:rPr>
-        <w:t xml:space="preserve"> alterna entre día y noche. El juego arranca de noche con los faros encendidos.</w:t>
-      </w:r>
-    </w:p>
-    <w:p>
-      <w:pPr>
         <w:keepNext/>
         <w:spacing w:before="120" w:after="60"/>
         <w:jc w:val="center"/>
       </w:pPr>
-      <w:r>
-        <w:rPr>
-          <w:noProof/>
-        </w:rPr>
+      <w:bookmarkStart w:id="0" w:name="_GoBack"/>
+      <w:bookmarkEnd w:id="0"/>
+    </w:p>
+    <w:p>
+      <w:pPr>
+        <w:keepNext/>
+        <w:spacing w:before="120" w:after="60"/>
+        <w:jc w:val="center"/>
+      </w:pPr>
+      <w:r>
         <w:drawing>
-          <wp:inline distT="0" distB="0" distL="0" distR="0">
-            <wp:extent cx="5334000" cy="3200400"/>
-            <wp:effectExtent l="0" t="0" r="0" b="0"/>
-            <wp:docPr id="17" name="juego_noche_faros.png" descr="Conducción de noche con faros" title="Conducción de noche con faros"/>
+          <wp:inline distT="0" distB="0" distL="0" distR="0" wp14:anchorId="4E1B5169" wp14:editId="46ECDCE2">
+            <wp:extent cx="5206087" cy="3158693"/>
+            <wp:effectExtent l="0" t="0" r="0" b="3810"/>
+            <wp:docPr id="20" name="Imagen 20"/>
             <wp:cNvGraphicFramePr>
               <a:graphicFrameLocks xmlns:a="http://schemas.openxmlformats.org/drawingml/2006/main" noChangeAspect="1"/>
             </wp:cNvGraphicFramePr>
@@ -6736,22 +5558,19 @@
               <a:graphicData uri="http://schemas.openxmlformats.org/drawingml/2006/picture">
                 <pic:pic xmlns:pic="http://schemas.openxmlformats.org/drawingml/2006/picture">
                   <pic:nvPicPr>
-                    <pic:cNvPr id="0" name=""/>
-                    <pic:cNvPicPr>
-                      <a:picLocks noChangeAspect="1" noChangeArrowheads="1"/>
-                    </pic:cNvPicPr>
+                    <pic:cNvPr id="1" name=""/>
+                    <pic:cNvPicPr/>
                   </pic:nvPicPr>
                   <pic:blipFill>
                     <a:blip r:embed="rId23"/>
-                    <a:srcRect/>
                     <a:stretch>
                       <a:fillRect/>
                     </a:stretch>
                   </pic:blipFill>
-                  <pic:spPr bwMode="auto">
+                  <pic:spPr>
                     <a:xfrm>
                       <a:off x="0" y="0"/>
-                      <a:ext cx="5334000" cy="3200400"/>
+                      <a:ext cx="5220860" cy="3167656"/>
                     </a:xfrm>
                     <a:prstGeom prst="rect">
                       <a:avLst/>
@@ -6777,7 +5596,21 @@
           <w:sz w:val="20"/>
           <w:szCs w:val="20"/>
         </w:rPr>
-        <w:t>Figura 16. Conducción de noche: faros del auto, luz de las farolas y ventanas encendidas.</w:t>
+        <w:t>Figura 15. Conducción de día con la tarjeta de juego y el minimapa.</w:t>
+      </w:r>
+    </w:p>
+    <w:p>
+      <w:pPr>
+        <w:pStyle w:val="Ttulo1"/>
+        <w:rPr>
+          <w:color w:val="000000" w:themeColor="text1"/>
+        </w:rPr>
+      </w:pPr>
+      <w:r>
+        <w:rPr>
+          <w:color w:val="000000" w:themeColor="text1"/>
+        </w:rPr>
+        <w:t>9. Iluminación día y noche</w:t>
       </w:r>
     </w:p>
     <w:p>
@@ -6791,695 +5624,23 @@
         <w:rPr>
           <w:rFonts w:ascii="Arial" w:hAnsi="Arial" w:cs="Arial"/>
         </w:rPr>
-        <w:t xml:space="preserve">La iluminación es local </w:t>
-      </w:r>
-      <w:r>
-        <w:rPr>
-          <w:rFonts w:ascii="Arial" w:hAnsi="Arial" w:cs="Arial"/>
-        </w:rPr>
-        <w:t>y no proyecta sombras: una luz puede atravesar una pared. Las sombras (</w:t>
-      </w:r>
-      <w:proofErr w:type="spellStart"/>
-      <w:r>
-        <w:rPr>
-          <w:rFonts w:ascii="Arial" w:hAnsi="Arial" w:cs="Arial"/>
-        </w:rPr>
-        <w:t>shadow</w:t>
-      </w:r>
-      <w:proofErr w:type="spellEnd"/>
-      <w:r>
-        <w:rPr>
-          <w:rFonts w:ascii="Arial" w:hAnsi="Arial" w:cs="Arial"/>
-        </w:rPr>
-        <w:t xml:space="preserve"> </w:t>
-      </w:r>
-      <w:proofErr w:type="spellStart"/>
-      <w:r>
-        <w:rPr>
-          <w:rFonts w:ascii="Arial" w:hAnsi="Arial" w:cs="Arial"/>
-        </w:rPr>
-        <w:t>maps</w:t>
-      </w:r>
-      <w:proofErr w:type="spellEnd"/>
-      <w:r>
-        <w:rPr>
-          <w:rFonts w:ascii="Arial" w:hAnsi="Arial" w:cs="Arial"/>
-        </w:rPr>
-        <w:t>) quedan como ampliación.</w:t>
-      </w:r>
-    </w:p>
-    <w:p>
-      <w:pPr>
-        <w:pStyle w:val="Ttulo1"/>
-        <w:rPr>
-          <w:color w:val="000000" w:themeColor="text1"/>
-        </w:rPr>
-      </w:pPr>
-      <w:r>
-        <w:rPr>
-          <w:color w:val="000000" w:themeColor="text1"/>
-        </w:rPr>
-        <w:lastRenderedPageBreak/>
-        <w:t>10. Tarjeta de juego y misiones</w:t>
-      </w:r>
-    </w:p>
-    <w:p>
-      <w:pPr>
-        <w:pStyle w:val="Ttulo2"/>
-        <w:rPr>
-          <w:rFonts w:ascii="Arial" w:hAnsi="Arial" w:cs="Arial"/>
-          <w:color w:val="000000" w:themeColor="text1"/>
-        </w:rPr>
-      </w:pPr>
-      <w:r>
-        <w:rPr>
-          <w:rFonts w:ascii="Arial" w:hAnsi="Arial" w:cs="Arial"/>
-          <w:color w:val="000000" w:themeColor="text1"/>
-        </w:rPr>
-        <w:t>10.1 Tarjeta de velocidad y misiones</w:t>
-      </w:r>
-    </w:p>
-    <w:p>
-      <w:pPr>
-        <w:spacing w:after="120" w:line="276" w:lineRule="auto"/>
-        <w:rPr>
-          <w:rFonts w:ascii="Arial" w:hAnsi="Arial" w:cs="Arial"/>
-        </w:rPr>
-      </w:pPr>
-      <w:r>
-        <w:rPr>
-          <w:rFonts w:ascii="Arial" w:hAnsi="Arial" w:cs="Arial"/>
-        </w:rPr>
-        <w:t>En la esquina inferior izquierda hay una tarjeta con los colores de Springfield</w:t>
-      </w:r>
-      <w:r>
-        <w:rPr>
-          <w:rFonts w:ascii="Arial" w:hAnsi="Arial" w:cs="Arial"/>
-        </w:rPr>
-        <w:t xml:space="preserve"> (azul, amarillo y blanco). Muestra la velocidad en km/h con números grandes, una barra de 12 segmentos que cambia de amarillo a rojo, y el estado de la misión actual: número de entrega, destino, distancia en metros y tiempo transcurrido.</w:t>
-      </w:r>
-    </w:p>
-    <w:p>
-      <w:pPr>
-        <w:spacing w:after="120" w:line="276" w:lineRule="auto"/>
-        <w:rPr>
-          <w:rFonts w:ascii="Arial" w:hAnsi="Arial" w:cs="Arial"/>
-        </w:rPr>
-      </w:pPr>
-      <w:r>
-        <w:rPr>
-          <w:rFonts w:ascii="Arial" w:hAnsi="Arial" w:cs="Arial"/>
-        </w:rPr>
-        <w:t xml:space="preserve">El motor gráfico </w:t>
-      </w:r>
-      <w:r>
-        <w:rPr>
-          <w:rFonts w:ascii="Arial" w:hAnsi="Arial" w:cs="Arial"/>
-        </w:rPr>
-        <w:t xml:space="preserve">solo dibuja cajas, no texto. Por eso las letras y los números se dibujan con una </w:t>
-      </w:r>
-      <w:r>
-        <w:rPr>
-          <w:rFonts w:ascii="Arial" w:hAnsi="Arial" w:cs="Arial"/>
-          <w:b/>
-          <w:bCs/>
-        </w:rPr>
-        <w:t>fuente de píxeles de 3 × 5</w:t>
-      </w:r>
-      <w:r>
-        <w:rPr>
-          <w:rFonts w:ascii="Arial" w:hAnsi="Arial" w:cs="Arial"/>
-        </w:rPr>
-        <w:t xml:space="preserve"> hecha con cajas, dentro de su propio recuadro de pantalla.</w:t>
-      </w:r>
-    </w:p>
-    <w:p>
-      <w:pPr>
-        <w:pStyle w:val="Ttulo2"/>
-        <w:rPr>
-          <w:rFonts w:ascii="Arial" w:hAnsi="Arial" w:cs="Arial"/>
-          <w:color w:val="000000" w:themeColor="text1"/>
-        </w:rPr>
-      </w:pPr>
-      <w:r>
-        <w:rPr>
-          <w:rFonts w:ascii="Arial" w:hAnsi="Arial" w:cs="Arial"/>
-          <w:color w:val="000000" w:themeColor="text1"/>
-        </w:rPr>
-        <w:t>10.2 Misiones de entrega</w:t>
-      </w:r>
-    </w:p>
-    <w:p>
-      <w:pPr>
-        <w:spacing w:after="120" w:line="276" w:lineRule="auto"/>
-        <w:rPr>
-          <w:rFonts w:ascii="Arial" w:hAnsi="Arial" w:cs="Arial"/>
-        </w:rPr>
-      </w:pPr>
-      <w:r>
-        <w:rPr>
-          <w:rFonts w:ascii="Arial" w:hAnsi="Arial" w:cs="Arial"/>
-        </w:rPr>
-        <w:t xml:space="preserve">Hay </w:t>
-      </w:r>
-      <w:r>
-        <w:rPr>
-          <w:rFonts w:ascii="Arial" w:hAnsi="Arial" w:cs="Arial"/>
-          <w:b/>
-          <w:bCs/>
-        </w:rPr>
-        <w:t>cuatro entregas</w:t>
-      </w:r>
-      <w:r>
-        <w:rPr>
-          <w:rFonts w:ascii="Arial" w:hAnsi="Arial" w:cs="Arial"/>
-        </w:rPr>
-        <w:t xml:space="preserve"> en orden. En cada una hay que llegar a la ma</w:t>
-      </w:r>
-      <w:r>
-        <w:rPr>
-          <w:rFonts w:ascii="Arial" w:hAnsi="Arial" w:cs="Arial"/>
-        </w:rPr>
-        <w:t>rca dorada y detenerse sobre ella.</w:t>
-      </w:r>
-    </w:p>
-    <w:tbl>
-      <w:tblPr>
-        <w:tblW w:w="9360" w:type="dxa"/>
-        <w:tblBorders>
-          <w:top w:val="single" w:sz="4" w:space="0" w:color="auto"/>
-          <w:left w:val="single" w:sz="4" w:space="0" w:color="auto"/>
-          <w:bottom w:val="single" w:sz="4" w:space="0" w:color="auto"/>
-          <w:right w:val="single" w:sz="4" w:space="0" w:color="auto"/>
-          <w:insideH w:val="single" w:sz="4" w:space="0" w:color="auto"/>
-          <w:insideV w:val="single" w:sz="4" w:space="0" w:color="auto"/>
-        </w:tblBorders>
-        <w:tblLook w:val="04A0" w:firstRow="1" w:lastRow="0" w:firstColumn="1" w:lastColumn="0" w:noHBand="0" w:noVBand="1"/>
-      </w:tblPr>
-      <w:tblGrid>
-        <w:gridCol w:w="900"/>
-        <w:gridCol w:w="3000"/>
-        <w:gridCol w:w="5460"/>
-      </w:tblGrid>
-      <w:tr>
-        <w:trPr>
-          <w:tblHeader/>
-        </w:trPr>
-        <w:tc>
-          <w:tcPr>
-            <w:tcW w:w="900" w:type="dxa"/>
-            <w:tcBorders>
-              <w:top w:val="single" w:sz="4" w:space="0" w:color="BFBFBF"/>
-              <w:left w:val="single" w:sz="4" w:space="0" w:color="BFBFBF"/>
-              <w:bottom w:val="single" w:sz="4" w:space="0" w:color="BFBFBF"/>
-              <w:right w:val="single" w:sz="4" w:space="0" w:color="BFBFBF"/>
-            </w:tcBorders>
-            <w:shd w:val="clear" w:color="auto" w:fill="1F4E8C"/>
-            <w:tcMar>
-              <w:top w:w="70" w:type="dxa"/>
-              <w:left w:w="110" w:type="dxa"/>
-              <w:bottom w:w="70" w:type="dxa"/>
-              <w:right w:w="110" w:type="dxa"/>
-            </w:tcMar>
-          </w:tcPr>
-          <w:p>
-            <w:pPr>
-              <w:rPr>
-                <w:rFonts w:ascii="Arial" w:hAnsi="Arial" w:cs="Arial"/>
-              </w:rPr>
-            </w:pPr>
-            <w:r>
-              <w:rPr>
-                <w:rFonts w:ascii="Arial" w:hAnsi="Arial" w:cs="Arial"/>
-                <w:b/>
-                <w:bCs/>
-                <w:color w:val="FFFFFF"/>
-              </w:rPr>
-              <w:t>N.º</w:t>
-            </w:r>
-          </w:p>
-        </w:tc>
-        <w:tc>
-          <w:tcPr>
-            <w:tcW w:w="3000" w:type="dxa"/>
-            <w:tcBorders>
-              <w:top w:val="single" w:sz="4" w:space="0" w:color="BFBFBF"/>
-              <w:left w:val="single" w:sz="4" w:space="0" w:color="BFBFBF"/>
-              <w:bottom w:val="single" w:sz="4" w:space="0" w:color="BFBFBF"/>
-              <w:right w:val="single" w:sz="4" w:space="0" w:color="BFBFBF"/>
-            </w:tcBorders>
-            <w:shd w:val="clear" w:color="auto" w:fill="1F4E8C"/>
-            <w:tcMar>
-              <w:top w:w="70" w:type="dxa"/>
-              <w:left w:w="110" w:type="dxa"/>
-              <w:bottom w:w="70" w:type="dxa"/>
-              <w:right w:w="110" w:type="dxa"/>
-            </w:tcMar>
-          </w:tcPr>
-          <w:p>
-            <w:pPr>
-              <w:rPr>
-                <w:rFonts w:ascii="Arial" w:hAnsi="Arial" w:cs="Arial"/>
-              </w:rPr>
-            </w:pPr>
-            <w:r>
-              <w:rPr>
-                <w:rFonts w:ascii="Arial" w:hAnsi="Arial" w:cs="Arial"/>
-                <w:b/>
-                <w:bCs/>
-                <w:color w:val="FFFFFF"/>
-              </w:rPr>
-              <w:t>Destino</w:t>
-            </w:r>
-          </w:p>
-        </w:tc>
-        <w:tc>
-          <w:tcPr>
-            <w:tcW w:w="5460" w:type="dxa"/>
-            <w:tcBorders>
-              <w:top w:val="single" w:sz="4" w:space="0" w:color="BFBFBF"/>
-              <w:left w:val="single" w:sz="4" w:space="0" w:color="BFBFBF"/>
-              <w:bottom w:val="single" w:sz="4" w:space="0" w:color="BFBFBF"/>
-              <w:right w:val="single" w:sz="4" w:space="0" w:color="BFBFBF"/>
-            </w:tcBorders>
-            <w:shd w:val="clear" w:color="auto" w:fill="1F4E8C"/>
-            <w:tcMar>
-              <w:top w:w="70" w:type="dxa"/>
-              <w:left w:w="110" w:type="dxa"/>
-              <w:bottom w:w="70" w:type="dxa"/>
-              <w:right w:w="110" w:type="dxa"/>
-            </w:tcMar>
-          </w:tcPr>
-          <w:p>
-            <w:pPr>
-              <w:rPr>
-                <w:rFonts w:ascii="Arial" w:hAnsi="Arial" w:cs="Arial"/>
-              </w:rPr>
-            </w:pPr>
-            <w:r>
-              <w:rPr>
-                <w:rFonts w:ascii="Arial" w:hAnsi="Arial" w:cs="Arial"/>
-                <w:b/>
-                <w:bCs/>
-                <w:color w:val="FFFFFF"/>
-              </w:rPr>
-              <w:t>Ubicación</w:t>
-            </w:r>
-          </w:p>
-        </w:tc>
-      </w:tr>
-      <w:tr>
-        <w:tc>
-          <w:tcPr>
-            <w:tcW w:w="900" w:type="dxa"/>
-            <w:tcBorders>
-              <w:top w:val="single" w:sz="4" w:space="0" w:color="BFBFBF"/>
-              <w:left w:val="single" w:sz="4" w:space="0" w:color="BFBFBF"/>
-              <w:bottom w:val="single" w:sz="4" w:space="0" w:color="BFBFBF"/>
-              <w:right w:val="single" w:sz="4" w:space="0" w:color="BFBFBF"/>
-            </w:tcBorders>
-            <w:tcMar>
-              <w:top w:w="70" w:type="dxa"/>
-              <w:left w:w="110" w:type="dxa"/>
-              <w:bottom w:w="70" w:type="dxa"/>
-              <w:right w:w="110" w:type="dxa"/>
-            </w:tcMar>
-          </w:tcPr>
-          <w:p>
-            <w:pPr>
-              <w:rPr>
-                <w:rFonts w:ascii="Arial" w:hAnsi="Arial" w:cs="Arial"/>
-              </w:rPr>
-            </w:pPr>
-            <w:r>
-              <w:rPr>
-                <w:rFonts w:ascii="Arial" w:hAnsi="Arial" w:cs="Arial"/>
-              </w:rPr>
-              <w:t>1</w:t>
-            </w:r>
-          </w:p>
-        </w:tc>
-        <w:tc>
-          <w:tcPr>
-            <w:tcW w:w="3000" w:type="dxa"/>
-            <w:tcBorders>
-              <w:top w:val="single" w:sz="4" w:space="0" w:color="BFBFBF"/>
-              <w:left w:val="single" w:sz="4" w:space="0" w:color="BFBFBF"/>
-              <w:bottom w:val="single" w:sz="4" w:space="0" w:color="BFBFBF"/>
-              <w:right w:val="single" w:sz="4" w:space="0" w:color="BFBFBF"/>
-            </w:tcBorders>
-            <w:tcMar>
-              <w:top w:w="70" w:type="dxa"/>
-              <w:left w:w="110" w:type="dxa"/>
-              <w:bottom w:w="70" w:type="dxa"/>
-              <w:right w:w="110" w:type="dxa"/>
-            </w:tcMar>
-          </w:tcPr>
-          <w:p>
-            <w:pPr>
-              <w:rPr>
-                <w:rFonts w:ascii="Arial" w:hAnsi="Arial" w:cs="Arial"/>
-              </w:rPr>
-            </w:pPr>
-            <w:r>
-              <w:rPr>
-                <w:rFonts w:ascii="Arial" w:hAnsi="Arial" w:cs="Arial"/>
-              </w:rPr>
-              <w:t>Plaza</w:t>
-            </w:r>
-          </w:p>
-        </w:tc>
-        <w:tc>
-          <w:tcPr>
-            <w:tcW w:w="5460" w:type="dxa"/>
-            <w:tcBorders>
-              <w:top w:val="single" w:sz="4" w:space="0" w:color="BFBFBF"/>
-              <w:left w:val="single" w:sz="4" w:space="0" w:color="BFBFBF"/>
-              <w:bottom w:val="single" w:sz="4" w:space="0" w:color="BFBFBF"/>
-              <w:right w:val="single" w:sz="4" w:space="0" w:color="BFBFBF"/>
-            </w:tcBorders>
-            <w:tcMar>
-              <w:top w:w="70" w:type="dxa"/>
-              <w:left w:w="110" w:type="dxa"/>
-              <w:bottom w:w="70" w:type="dxa"/>
-              <w:right w:w="110" w:type="dxa"/>
-            </w:tcMar>
-          </w:tcPr>
-          <w:p>
-            <w:pPr>
-              <w:rPr>
-                <w:rFonts w:ascii="Arial" w:hAnsi="Arial" w:cs="Arial"/>
-              </w:rPr>
-            </w:pPr>
-            <w:r>
-              <w:rPr>
-                <w:rFonts w:ascii="Arial" w:hAnsi="Arial" w:cs="Arial"/>
-              </w:rPr>
-              <w:t>Calle al norte de la plaza central</w:t>
-            </w:r>
-          </w:p>
-        </w:tc>
-      </w:tr>
-      <w:tr>
-        <w:tc>
-          <w:tcPr>
-            <w:tcW w:w="900" w:type="dxa"/>
-            <w:tcBorders>
-              <w:top w:val="single" w:sz="4" w:space="0" w:color="BFBFBF"/>
-              <w:left w:val="single" w:sz="4" w:space="0" w:color="BFBFBF"/>
-              <w:bottom w:val="single" w:sz="4" w:space="0" w:color="BFBFBF"/>
-              <w:right w:val="single" w:sz="4" w:space="0" w:color="BFBFBF"/>
-            </w:tcBorders>
-            <w:tcMar>
-              <w:top w:w="70" w:type="dxa"/>
-              <w:left w:w="110" w:type="dxa"/>
-              <w:bottom w:w="70" w:type="dxa"/>
-              <w:right w:w="110" w:type="dxa"/>
-            </w:tcMar>
-          </w:tcPr>
-          <w:p>
-            <w:pPr>
-              <w:rPr>
-                <w:rFonts w:ascii="Arial" w:hAnsi="Arial" w:cs="Arial"/>
-              </w:rPr>
-            </w:pPr>
-            <w:r>
-              <w:rPr>
-                <w:rFonts w:ascii="Arial" w:hAnsi="Arial" w:cs="Arial"/>
-              </w:rPr>
-              <w:t>2</w:t>
-            </w:r>
-          </w:p>
-        </w:tc>
-        <w:tc>
-          <w:tcPr>
-            <w:tcW w:w="3000" w:type="dxa"/>
-            <w:tcBorders>
-              <w:top w:val="single" w:sz="4" w:space="0" w:color="BFBFBF"/>
-              <w:left w:val="single" w:sz="4" w:space="0" w:color="BFBFBF"/>
-              <w:bottom w:val="single" w:sz="4" w:space="0" w:color="BFBFBF"/>
-              <w:right w:val="single" w:sz="4" w:space="0" w:color="BFBFBF"/>
-            </w:tcBorders>
-            <w:tcMar>
-              <w:top w:w="70" w:type="dxa"/>
-              <w:left w:w="110" w:type="dxa"/>
-              <w:bottom w:w="70" w:type="dxa"/>
-              <w:right w:w="110" w:type="dxa"/>
-            </w:tcMar>
-          </w:tcPr>
-          <w:p>
-            <w:pPr>
-              <w:rPr>
-                <w:rFonts w:ascii="Arial" w:hAnsi="Arial" w:cs="Arial"/>
-              </w:rPr>
-            </w:pPr>
-            <w:r>
-              <w:rPr>
-                <w:rFonts w:ascii="Arial" w:hAnsi="Arial" w:cs="Arial"/>
-              </w:rPr>
-              <w:t>Mansión Burns</w:t>
-            </w:r>
-          </w:p>
-        </w:tc>
-        <w:tc>
-          <w:tcPr>
-            <w:tcW w:w="5460" w:type="dxa"/>
-            <w:tcBorders>
-              <w:top w:val="single" w:sz="4" w:space="0" w:color="BFBFBF"/>
-              <w:left w:val="single" w:sz="4" w:space="0" w:color="BFBFBF"/>
-              <w:bottom w:val="single" w:sz="4" w:space="0" w:color="BFBFBF"/>
-              <w:right w:val="single" w:sz="4" w:space="0" w:color="BFBFBF"/>
-            </w:tcBorders>
-            <w:tcMar>
-              <w:top w:w="70" w:type="dxa"/>
-              <w:left w:w="110" w:type="dxa"/>
-              <w:bottom w:w="70" w:type="dxa"/>
-              <w:right w:w="110" w:type="dxa"/>
-            </w:tcMar>
-          </w:tcPr>
-          <w:p>
-            <w:pPr>
-              <w:rPr>
-                <w:rFonts w:ascii="Arial" w:hAnsi="Arial" w:cs="Arial"/>
-              </w:rPr>
-            </w:pPr>
-            <w:r>
-              <w:rPr>
-                <w:rFonts w:ascii="Arial" w:hAnsi="Arial" w:cs="Arial"/>
-              </w:rPr>
-              <w:t>Calle frente a la mansión</w:t>
-            </w:r>
-          </w:p>
-        </w:tc>
-      </w:tr>
-      <w:tr>
-        <w:tc>
-          <w:tcPr>
-            <w:tcW w:w="900" w:type="dxa"/>
-            <w:tcBorders>
-              <w:top w:val="single" w:sz="4" w:space="0" w:color="BFBFBF"/>
-              <w:left w:val="single" w:sz="4" w:space="0" w:color="BFBFBF"/>
-              <w:bottom w:val="single" w:sz="4" w:space="0" w:color="BFBFBF"/>
-              <w:right w:val="single" w:sz="4" w:space="0" w:color="BFBFBF"/>
-            </w:tcBorders>
-            <w:tcMar>
-              <w:top w:w="70" w:type="dxa"/>
-              <w:left w:w="110" w:type="dxa"/>
-              <w:bottom w:w="70" w:type="dxa"/>
-              <w:right w:w="110" w:type="dxa"/>
-            </w:tcMar>
-          </w:tcPr>
-          <w:p>
-            <w:pPr>
-              <w:rPr>
-                <w:rFonts w:ascii="Arial" w:hAnsi="Arial" w:cs="Arial"/>
-              </w:rPr>
-            </w:pPr>
-            <w:r>
-              <w:rPr>
-                <w:rFonts w:ascii="Arial" w:hAnsi="Arial" w:cs="Arial"/>
-              </w:rPr>
-              <w:t>3</w:t>
-            </w:r>
-          </w:p>
-        </w:tc>
-        <w:tc>
-          <w:tcPr>
-            <w:tcW w:w="3000" w:type="dxa"/>
-            <w:tcBorders>
-              <w:top w:val="single" w:sz="4" w:space="0" w:color="BFBFBF"/>
-              <w:left w:val="single" w:sz="4" w:space="0" w:color="BFBFBF"/>
-              <w:bottom w:val="single" w:sz="4" w:space="0" w:color="BFBFBF"/>
-              <w:right w:val="single" w:sz="4" w:space="0" w:color="BFBFBF"/>
-            </w:tcBorders>
-            <w:tcMar>
-              <w:top w:w="70" w:type="dxa"/>
-              <w:left w:w="110" w:type="dxa"/>
-              <w:bottom w:w="70" w:type="dxa"/>
-              <w:right w:w="110" w:type="dxa"/>
-            </w:tcMar>
-          </w:tcPr>
-          <w:p>
-            <w:pPr>
-              <w:rPr>
-                <w:rFonts w:ascii="Arial" w:hAnsi="Arial" w:cs="Arial"/>
-              </w:rPr>
-            </w:pPr>
-            <w:proofErr w:type="spellStart"/>
-            <w:r>
-              <w:rPr>
-                <w:rFonts w:ascii="Arial" w:hAnsi="Arial" w:cs="Arial"/>
-              </w:rPr>
-              <w:t>Kwik</w:t>
-            </w:r>
-            <w:proofErr w:type="spellEnd"/>
-            <w:r>
-              <w:rPr>
-                <w:rFonts w:ascii="Arial" w:hAnsi="Arial" w:cs="Arial"/>
-              </w:rPr>
-              <w:t>-E-</w:t>
-            </w:r>
-            <w:proofErr w:type="spellStart"/>
-            <w:r>
-              <w:rPr>
-                <w:rFonts w:ascii="Arial" w:hAnsi="Arial" w:cs="Arial"/>
-              </w:rPr>
-              <w:t>Mart</w:t>
-            </w:r>
-            <w:proofErr w:type="spellEnd"/>
-          </w:p>
-        </w:tc>
-        <w:tc>
-          <w:tcPr>
-            <w:tcW w:w="5460" w:type="dxa"/>
-            <w:tcBorders>
-              <w:top w:val="single" w:sz="4" w:space="0" w:color="BFBFBF"/>
-              <w:left w:val="single" w:sz="4" w:space="0" w:color="BFBFBF"/>
-              <w:bottom w:val="single" w:sz="4" w:space="0" w:color="BFBFBF"/>
-              <w:right w:val="single" w:sz="4" w:space="0" w:color="BFBFBF"/>
-            </w:tcBorders>
-            <w:tcMar>
-              <w:top w:w="70" w:type="dxa"/>
-              <w:left w:w="110" w:type="dxa"/>
-              <w:bottom w:w="70" w:type="dxa"/>
-              <w:right w:w="110" w:type="dxa"/>
-            </w:tcMar>
-          </w:tcPr>
-          <w:p>
-            <w:pPr>
-              <w:rPr>
-                <w:rFonts w:ascii="Arial" w:hAnsi="Arial" w:cs="Arial"/>
-              </w:rPr>
-            </w:pPr>
-            <w:r>
-              <w:rPr>
-                <w:rFonts w:ascii="Arial" w:hAnsi="Arial" w:cs="Arial"/>
-              </w:rPr>
-              <w:t>Calle frente a la tienda</w:t>
-            </w:r>
-          </w:p>
-        </w:tc>
-      </w:tr>
-      <w:tr>
-        <w:tc>
-          <w:tcPr>
-            <w:tcW w:w="900" w:type="dxa"/>
-            <w:tcBorders>
-              <w:top w:val="single" w:sz="4" w:space="0" w:color="BFBFBF"/>
-              <w:left w:val="single" w:sz="4" w:space="0" w:color="BFBFBF"/>
-              <w:bottom w:val="single" w:sz="4" w:space="0" w:color="BFBFBF"/>
-              <w:right w:val="single" w:sz="4" w:space="0" w:color="BFBFBF"/>
-            </w:tcBorders>
-            <w:tcMar>
-              <w:top w:w="70" w:type="dxa"/>
-              <w:left w:w="110" w:type="dxa"/>
-              <w:bottom w:w="70" w:type="dxa"/>
-              <w:right w:w="110" w:type="dxa"/>
-            </w:tcMar>
-          </w:tcPr>
-          <w:p>
-            <w:pPr>
-              <w:rPr>
-                <w:rFonts w:ascii="Arial" w:hAnsi="Arial" w:cs="Arial"/>
-              </w:rPr>
-            </w:pPr>
-            <w:r>
-              <w:rPr>
-                <w:rFonts w:ascii="Arial" w:hAnsi="Arial" w:cs="Arial"/>
-              </w:rPr>
-              <w:t>4</w:t>
-            </w:r>
-          </w:p>
-        </w:tc>
-        <w:tc>
-          <w:tcPr>
-            <w:tcW w:w="3000" w:type="dxa"/>
-            <w:tcBorders>
-              <w:top w:val="single" w:sz="4" w:space="0" w:color="BFBFBF"/>
-              <w:left w:val="single" w:sz="4" w:space="0" w:color="BFBFBF"/>
-              <w:bottom w:val="single" w:sz="4" w:space="0" w:color="BFBFBF"/>
-              <w:right w:val="single" w:sz="4" w:space="0" w:color="BFBFBF"/>
-            </w:tcBorders>
-            <w:tcMar>
-              <w:top w:w="70" w:type="dxa"/>
-              <w:left w:w="110" w:type="dxa"/>
-              <w:bottom w:w="70" w:type="dxa"/>
-              <w:right w:w="110" w:type="dxa"/>
-            </w:tcMar>
-          </w:tcPr>
-          <w:p>
-            <w:pPr>
-              <w:rPr>
-                <w:rFonts w:ascii="Arial" w:hAnsi="Arial" w:cs="Arial"/>
-              </w:rPr>
-            </w:pPr>
-            <w:r>
-              <w:rPr>
-                <w:rFonts w:ascii="Arial" w:hAnsi="Arial" w:cs="Arial"/>
-              </w:rPr>
-              <w:t>Casa Simpson</w:t>
-            </w:r>
-          </w:p>
-        </w:tc>
-        <w:tc>
-          <w:tcPr>
-            <w:tcW w:w="5460" w:type="dxa"/>
-            <w:tcBorders>
-              <w:top w:val="single" w:sz="4" w:space="0" w:color="BFBFBF"/>
-              <w:left w:val="single" w:sz="4" w:space="0" w:color="BFBFBF"/>
-              <w:bottom w:val="single" w:sz="4" w:space="0" w:color="BFBFBF"/>
-              <w:right w:val="single" w:sz="4" w:space="0" w:color="BFBFBF"/>
-            </w:tcBorders>
-            <w:tcMar>
-              <w:top w:w="70" w:type="dxa"/>
-              <w:left w:w="110" w:type="dxa"/>
-              <w:bottom w:w="70" w:type="dxa"/>
-              <w:right w:w="110" w:type="dxa"/>
-            </w:tcMar>
-          </w:tcPr>
-          <w:p>
-            <w:pPr>
-              <w:rPr>
-                <w:rFonts w:ascii="Arial" w:hAnsi="Arial" w:cs="Arial"/>
-              </w:rPr>
-            </w:pPr>
-            <w:r>
-              <w:rPr>
-                <w:rFonts w:ascii="Arial" w:hAnsi="Arial" w:cs="Arial"/>
-              </w:rPr>
-              <w:t>Calle frente a la casa de los Simpson</w:t>
-            </w:r>
-          </w:p>
-        </w:tc>
-      </w:tr>
-    </w:tbl>
-    <w:p>
-      <w:pPr>
-        <w:spacing w:after="120"/>
-        <w:rPr>
-          <w:rFonts w:ascii="Arial" w:hAnsi="Arial" w:cs="Arial"/>
-        </w:rPr>
-      </w:pPr>
+        <w:t>La iluminación se calcula en el fragmento shader (</w:t>
+      </w:r>
+      <w:r>
+        <w:rPr>
+          <w:rFonts w:ascii="Arial" w:eastAsia="Consolas" w:hAnsi="Arial" w:cs="Arial"/>
+          <w:color w:val="7A1F3D"/>
+          <w:sz w:val="20"/>
+          <w:szCs w:val="20"/>
+        </w:rPr>
+        <w:t>Renderer.java</w:t>
+      </w:r>
+      <w:r>
+        <w:rPr>
+          <w:rFonts w:ascii="Arial" w:hAnsi="Arial" w:cs="Arial"/>
+        </w:rPr>
+        <w:t>) con el modelo de Lambert: cada cara recibe más o menos luz según hacia dónde mira. El resultado es la suma de varias fuentes:</w:t>
+      </w:r>
     </w:p>
     <w:p>
       <w:pPr>
@@ -7499,13 +5660,14 @@
           <w:b/>
           <w:bCs/>
         </w:rPr>
-        <w:t>Para completar una entrega</w:t>
-      </w:r>
-      <w:r>
-        <w:rPr>
-          <w:rFonts w:ascii="Arial" w:hAnsi="Arial" w:cs="Arial"/>
-        </w:rPr>
-        <w:t>: llegar a menos de 4 unidades de la marca y bajar de unos 5 km/h.</w:t>
+        <w:lastRenderedPageBreak/>
+        <w:t>Ambiente y sol/luna</w:t>
+      </w:r>
+      <w:r>
+        <w:rPr>
+          <w:rFonts w:ascii="Arial" w:hAnsi="Arial" w:cs="Arial"/>
+        </w:rPr>
+        <w:t>: de día es un gris neutro más un sol cálido; de noche, un azul oscuro con una luna tenue.</w:t>
       </w:r>
     </w:p>
     <w:p>
@@ -7526,13 +5688,27 @@
           <w:b/>
           <w:bCs/>
         </w:rPr>
-        <w:t>Marca en el mundo</w:t>
-      </w:r>
-      <w:r>
-        <w:rPr>
-          <w:rFonts w:ascii="Arial" w:hAnsi="Arial" w:cs="Arial"/>
-        </w:rPr>
-        <w:t>: plataforma dorada, baliza giratoria y un rayo de luz alto que se ve desde lejos, incluso de noche.</w:t>
+        <w:t>Farolas</w:t>
+      </w:r>
+      <w:r>
+        <w:rPr>
+          <w:rFonts w:ascii="Arial" w:hAnsi="Arial" w:cs="Arial"/>
+        </w:rPr>
+        <w:t xml:space="preserve">: el shader recibe las </w:t>
+      </w:r>
+      <w:r>
+        <w:rPr>
+          <w:rFonts w:ascii="Arial" w:hAnsi="Arial" w:cs="Arial"/>
+          <w:b/>
+          <w:bCs/>
+        </w:rPr>
+        <w:t>25 farolas más cercanas al auto</w:t>
+      </w:r>
+      <w:r>
+        <w:rPr>
+          <w:rFonts w:ascii="Arial" w:hAnsi="Arial" w:cs="Arial"/>
+        </w:rPr>
+        <w:t xml:space="preserve"> (de las decenas que tiene la ciudad). La luz se desvanece con la distancia hasta los 26 metros, sin corte brusco. Los faroles de la plaza también envían luz.</w:t>
       </w:r>
     </w:p>
     <w:p>
@@ -7553,29 +5729,13 @@
           <w:b/>
           <w:bCs/>
         </w:rPr>
-        <w:t xml:space="preserve">Marca en el </w:t>
-      </w:r>
-      <w:proofErr w:type="spellStart"/>
-      <w:r>
-        <w:rPr>
-          <w:rFonts w:ascii="Arial" w:hAnsi="Arial" w:cs="Arial"/>
-          <w:b/>
-          <w:bCs/>
-        </w:rPr>
-        <w:t>minimapa</w:t>
-      </w:r>
-      <w:proofErr w:type="spellEnd"/>
-      <w:r>
-        <w:rPr>
-          <w:rFonts w:ascii="Arial" w:hAnsi="Arial" w:cs="Arial"/>
-        </w:rPr>
-        <w:t xml:space="preserve">: un cuadrado dorado que </w:t>
-      </w:r>
-      <w:r>
-        <w:rPr>
-          <w:rFonts w:ascii="Arial" w:hAnsi="Arial" w:cs="Arial"/>
-        </w:rPr>
-        <w:t>pulsa.</w:t>
+        <w:t>Faros del auto</w:t>
+      </w:r>
+      <w:r>
+        <w:rPr>
+          <w:rFonts w:ascii="Arial" w:hAnsi="Arial" w:cs="Arial"/>
+        </w:rPr>
+        <w:t>: dos conos de luz delante del parachoques, que se encienden con la tecla F.</w:t>
       </w:r>
     </w:p>
     <w:p>
@@ -7596,27 +5756,68 @@
           <w:b/>
           <w:bCs/>
         </w:rPr>
-        <w:t>Al terminar las cuatro</w:t>
-      </w:r>
-      <w:r>
-        <w:rPr>
-          <w:rFonts w:ascii="Arial" w:hAnsi="Arial" w:cs="Arial"/>
-        </w:rPr>
-        <w:t xml:space="preserve">: </w:t>
-      </w:r>
-      <w:proofErr w:type="gramStart"/>
-      <w:r>
-        <w:rPr>
-          <w:rFonts w:ascii="Arial" w:hAnsi="Arial" w:cs="Arial"/>
-        </w:rPr>
-        <w:t>la tarjeta muestra «GANASTE!</w:t>
-      </w:r>
-      <w:proofErr w:type="gramEnd"/>
-      <w:r>
-        <w:rPr>
-          <w:rFonts w:ascii="Arial" w:hAnsi="Arial" w:cs="Arial"/>
-        </w:rPr>
-        <w:t>» y el tiempo total. La tecla R reinicia el auto y las misiones.</w:t>
+        <w:t>Bombillas y faros brillantes</w:t>
+      </w:r>
+      <w:r>
+        <w:rPr>
+          <w:rFonts w:ascii="Arial" w:hAnsi="Arial" w:cs="Arial"/>
+        </w:rPr>
+        <w:t>: se dibujan con color fijo (emisión), así que se ven encendidos aunque la escena esté oscura.</w:t>
+      </w:r>
+    </w:p>
+    <w:p>
+      <w:pPr>
+        <w:pStyle w:val="Prrafodelista"/>
+        <w:numPr>
+          <w:ilvl w:val="0"/>
+          <w:numId w:val="2"/>
+        </w:numPr>
+        <w:spacing w:after="60" w:line="276" w:lineRule="auto"/>
+        <w:rPr>
+          <w:rFonts w:ascii="Arial" w:hAnsi="Arial" w:cs="Arial"/>
+        </w:rPr>
+      </w:pPr>
+      <w:r>
+        <w:rPr>
+          <w:rFonts w:ascii="Arial" w:hAnsi="Arial" w:cs="Arial"/>
+          <w:b/>
+          <w:bCs/>
+        </w:rPr>
+        <w:t>Ventanas</w:t>
+      </w:r>
+      <w:r>
+        <w:rPr>
+          <w:rFonts w:ascii="Arial" w:hAnsi="Arial" w:cs="Arial"/>
+        </w:rPr>
+        <w:t>: de noche, cerca del 60 % de las ventanas de casas y mansión se encienden con luz cálida y suave; el Kwik-E-Mart siempre está iluminado.</w:t>
+      </w:r>
+    </w:p>
+    <w:p>
+      <w:pPr>
+        <w:spacing w:after="120" w:line="276" w:lineRule="auto"/>
+        <w:rPr>
+          <w:rFonts w:ascii="Arial" w:hAnsi="Arial" w:cs="Arial"/>
+        </w:rPr>
+      </w:pPr>
+      <w:r>
+        <w:rPr>
+          <w:rFonts w:ascii="Arial" w:hAnsi="Arial" w:cs="Arial"/>
+        </w:rPr>
+        <w:t xml:space="preserve">La tecla </w:t>
+      </w:r>
+      <w:r>
+        <w:rPr>
+          <w:rFonts w:ascii="Arial" w:hAnsi="Arial" w:cs="Arial"/>
+          <w:b/>
+          <w:bCs/>
+        </w:rPr>
+        <w:t>N</w:t>
+      </w:r>
+      <w:r>
+        <w:rPr>
+          <w:rFonts w:ascii="Arial" w:hAnsi="Arial" w:cs="Arial"/>
+        </w:rPr>
+        <w:t xml:space="preserve"> alterna entre día y noche. El juego arranca de noche con los faros encendidos.</w:t>
       </w:r>
     </w:p>
     <w:p>
@@ -7629,12 +5830,11 @@
         <w:rPr>
           <w:noProof/>
         </w:rPr>
-        <w:lastRenderedPageBreak/>
         <w:drawing>
           <wp:inline distT="0" distB="0" distL="0" distR="0">
             <wp:extent cx="5334000" cy="3200400"/>
             <wp:effectExtent l="0" t="0" r="0" b="0"/>
-            <wp:docPr id="18" name="juego_mision_plaza.png" descr="Misión hacia la plaza" title="Misión hacia la plaza"/>
+            <wp:docPr id="17" name="juego_noche_faros.png" descr="Conducción de noche con faros" title="Conducción de noche con faros"/>
             <wp:cNvGraphicFramePr>
               <a:graphicFrameLocks xmlns:a="http://schemas.openxmlformats.org/drawingml/2006/main" noChangeAspect="1"/>
             </wp:cNvGraphicFramePr>
@@ -7683,6 +5883,813 @@
           <w:sz w:val="20"/>
           <w:szCs w:val="20"/>
         </w:rPr>
+        <w:t>Figura 16. Conducción de noche: faros del auto, luz de las farolas y ventanas encendidas.</w:t>
+      </w:r>
+    </w:p>
+    <w:p>
+      <w:pPr>
+        <w:spacing w:after="120" w:line="276" w:lineRule="auto"/>
+        <w:rPr>
+          <w:rFonts w:ascii="Arial" w:hAnsi="Arial" w:cs="Arial"/>
+        </w:rPr>
+      </w:pPr>
+      <w:r>
+        <w:rPr>
+          <w:rFonts w:ascii="Arial" w:hAnsi="Arial" w:cs="Arial"/>
+        </w:rPr>
+        <w:t>La iluminación es local y no proyecta sombras: una luz puede atravesar una pared. Las sombras (shadow maps) quedan como ampliación.</w:t>
+      </w:r>
+    </w:p>
+    <w:p>
+      <w:pPr>
+        <w:pStyle w:val="Ttulo1"/>
+        <w:rPr>
+          <w:color w:val="000000" w:themeColor="text1"/>
+        </w:rPr>
+      </w:pPr>
+      <w:r>
+        <w:rPr>
+          <w:color w:val="000000" w:themeColor="text1"/>
+        </w:rPr>
+        <w:t>10. Tarjeta de juego y misiones</w:t>
+      </w:r>
+    </w:p>
+    <w:p>
+      <w:pPr>
+        <w:pStyle w:val="Ttulo2"/>
+        <w:rPr>
+          <w:rFonts w:ascii="Arial" w:hAnsi="Arial" w:cs="Arial"/>
+          <w:color w:val="000000" w:themeColor="text1"/>
+        </w:rPr>
+      </w:pPr>
+      <w:r>
+        <w:rPr>
+          <w:rFonts w:ascii="Arial" w:hAnsi="Arial" w:cs="Arial"/>
+          <w:color w:val="000000" w:themeColor="text1"/>
+        </w:rPr>
+        <w:t>10.1 Tarjeta de velocidad y misiones</w:t>
+      </w:r>
+    </w:p>
+    <w:p>
+      <w:pPr>
+        <w:spacing w:after="120" w:line="276" w:lineRule="auto"/>
+        <w:rPr>
+          <w:rFonts w:ascii="Arial" w:hAnsi="Arial" w:cs="Arial"/>
+        </w:rPr>
+      </w:pPr>
+      <w:r>
+        <w:rPr>
+          <w:rFonts w:ascii="Arial" w:hAnsi="Arial" w:cs="Arial"/>
+        </w:rPr>
+        <w:t>En la esquina inferior izquierda hay una tarjeta con los colores de Springfield (azul, amarillo y blanco). Muestra la velocidad en km/h con números grandes, una barra de 12 segmentos que cambia de amarillo a rojo, y el estado de la misión actual: número de entrega, destino, distancia en metros y tiempo transcurrido.</w:t>
+      </w:r>
+    </w:p>
+    <w:p>
+      <w:pPr>
+        <w:spacing w:after="120" w:line="276" w:lineRule="auto"/>
+        <w:rPr>
+          <w:rFonts w:ascii="Arial" w:hAnsi="Arial" w:cs="Arial"/>
+        </w:rPr>
+      </w:pPr>
+      <w:r>
+        <w:rPr>
+          <w:rFonts w:ascii="Arial" w:hAnsi="Arial" w:cs="Arial"/>
+        </w:rPr>
+        <w:lastRenderedPageBreak/>
+        <w:t xml:space="preserve">El motor gráfico solo dibuja cajas, no texto. Por eso las letras y los números se dibujan con una </w:t>
+      </w:r>
+      <w:r>
+        <w:rPr>
+          <w:rFonts w:ascii="Arial" w:hAnsi="Arial" w:cs="Arial"/>
+          <w:b/>
+          <w:bCs/>
+        </w:rPr>
+        <w:t>fuente de píxeles de 3 × 5</w:t>
+      </w:r>
+      <w:r>
+        <w:rPr>
+          <w:rFonts w:ascii="Arial" w:hAnsi="Arial" w:cs="Arial"/>
+        </w:rPr>
+        <w:t xml:space="preserve"> hecha con cajas, dentro de su propio recuadro de pantalla.</w:t>
+      </w:r>
+    </w:p>
+    <w:p>
+      <w:pPr>
+        <w:pStyle w:val="Ttulo2"/>
+        <w:rPr>
+          <w:rFonts w:ascii="Arial" w:hAnsi="Arial" w:cs="Arial"/>
+          <w:color w:val="000000" w:themeColor="text1"/>
+        </w:rPr>
+      </w:pPr>
+      <w:r>
+        <w:rPr>
+          <w:rFonts w:ascii="Arial" w:hAnsi="Arial" w:cs="Arial"/>
+          <w:color w:val="000000" w:themeColor="text1"/>
+        </w:rPr>
+        <w:t>10.2 Misiones de entrega</w:t>
+      </w:r>
+    </w:p>
+    <w:p>
+      <w:pPr>
+        <w:spacing w:after="120" w:line="276" w:lineRule="auto"/>
+        <w:rPr>
+          <w:rFonts w:ascii="Arial" w:hAnsi="Arial" w:cs="Arial"/>
+        </w:rPr>
+      </w:pPr>
+      <w:r>
+        <w:rPr>
+          <w:rFonts w:ascii="Arial" w:hAnsi="Arial" w:cs="Arial"/>
+        </w:rPr>
+        <w:t xml:space="preserve">Hay </w:t>
+      </w:r>
+      <w:r>
+        <w:rPr>
+          <w:rFonts w:ascii="Arial" w:hAnsi="Arial" w:cs="Arial"/>
+          <w:b/>
+          <w:bCs/>
+        </w:rPr>
+        <w:t>cuatro entregas</w:t>
+      </w:r>
+      <w:r>
+        <w:rPr>
+          <w:rFonts w:ascii="Arial" w:hAnsi="Arial" w:cs="Arial"/>
+        </w:rPr>
+        <w:t xml:space="preserve"> en orden. En cada una hay que llegar a la marca dorada y detenerse sobre ella.</w:t>
+      </w:r>
+    </w:p>
+    <w:tbl>
+      <w:tblPr>
+        <w:tblW w:w="9360" w:type="dxa"/>
+        <w:tblBorders>
+          <w:top w:val="single" w:sz="4" w:space="0" w:color="auto"/>
+          <w:left w:val="single" w:sz="4" w:space="0" w:color="auto"/>
+          <w:bottom w:val="single" w:sz="4" w:space="0" w:color="auto"/>
+          <w:right w:val="single" w:sz="4" w:space="0" w:color="auto"/>
+          <w:insideH w:val="single" w:sz="4" w:space="0" w:color="auto"/>
+          <w:insideV w:val="single" w:sz="4" w:space="0" w:color="auto"/>
+        </w:tblBorders>
+        <w:tblLook w:val="04A0" w:firstRow="1" w:lastRow="0" w:firstColumn="1" w:lastColumn="0" w:noHBand="0" w:noVBand="1"/>
+      </w:tblPr>
+      <w:tblGrid>
+        <w:gridCol w:w="900"/>
+        <w:gridCol w:w="3000"/>
+        <w:gridCol w:w="5460"/>
+      </w:tblGrid>
+      <w:tr>
+        <w:trPr>
+          <w:tblHeader/>
+        </w:trPr>
+        <w:tc>
+          <w:tcPr>
+            <w:tcW w:w="900" w:type="dxa"/>
+            <w:tcBorders>
+              <w:top w:val="single" w:sz="4" w:space="0" w:color="BFBFBF"/>
+              <w:left w:val="single" w:sz="4" w:space="0" w:color="BFBFBF"/>
+              <w:bottom w:val="single" w:sz="4" w:space="0" w:color="BFBFBF"/>
+              <w:right w:val="single" w:sz="4" w:space="0" w:color="BFBFBF"/>
+            </w:tcBorders>
+            <w:shd w:val="clear" w:color="auto" w:fill="1F4E8C"/>
+            <w:tcMar>
+              <w:top w:w="70" w:type="dxa"/>
+              <w:left w:w="110" w:type="dxa"/>
+              <w:bottom w:w="70" w:type="dxa"/>
+              <w:right w:w="110" w:type="dxa"/>
+            </w:tcMar>
+          </w:tcPr>
+          <w:p>
+            <w:pPr>
+              <w:rPr>
+                <w:rFonts w:ascii="Arial" w:hAnsi="Arial" w:cs="Arial"/>
+              </w:rPr>
+            </w:pPr>
+            <w:r>
+              <w:rPr>
+                <w:rFonts w:ascii="Arial" w:hAnsi="Arial" w:cs="Arial"/>
+                <w:b/>
+                <w:bCs/>
+                <w:color w:val="FFFFFF"/>
+              </w:rPr>
+              <w:t>N.º</w:t>
+            </w:r>
+          </w:p>
+        </w:tc>
+        <w:tc>
+          <w:tcPr>
+            <w:tcW w:w="3000" w:type="dxa"/>
+            <w:tcBorders>
+              <w:top w:val="single" w:sz="4" w:space="0" w:color="BFBFBF"/>
+              <w:left w:val="single" w:sz="4" w:space="0" w:color="BFBFBF"/>
+              <w:bottom w:val="single" w:sz="4" w:space="0" w:color="BFBFBF"/>
+              <w:right w:val="single" w:sz="4" w:space="0" w:color="BFBFBF"/>
+            </w:tcBorders>
+            <w:shd w:val="clear" w:color="auto" w:fill="1F4E8C"/>
+            <w:tcMar>
+              <w:top w:w="70" w:type="dxa"/>
+              <w:left w:w="110" w:type="dxa"/>
+              <w:bottom w:w="70" w:type="dxa"/>
+              <w:right w:w="110" w:type="dxa"/>
+            </w:tcMar>
+          </w:tcPr>
+          <w:p>
+            <w:pPr>
+              <w:rPr>
+                <w:rFonts w:ascii="Arial" w:hAnsi="Arial" w:cs="Arial"/>
+              </w:rPr>
+            </w:pPr>
+            <w:r>
+              <w:rPr>
+                <w:rFonts w:ascii="Arial" w:hAnsi="Arial" w:cs="Arial"/>
+                <w:b/>
+                <w:bCs/>
+                <w:color w:val="FFFFFF"/>
+              </w:rPr>
+              <w:t>Destino</w:t>
+            </w:r>
+          </w:p>
+        </w:tc>
+        <w:tc>
+          <w:tcPr>
+            <w:tcW w:w="5460" w:type="dxa"/>
+            <w:tcBorders>
+              <w:top w:val="single" w:sz="4" w:space="0" w:color="BFBFBF"/>
+              <w:left w:val="single" w:sz="4" w:space="0" w:color="BFBFBF"/>
+              <w:bottom w:val="single" w:sz="4" w:space="0" w:color="BFBFBF"/>
+              <w:right w:val="single" w:sz="4" w:space="0" w:color="BFBFBF"/>
+            </w:tcBorders>
+            <w:shd w:val="clear" w:color="auto" w:fill="1F4E8C"/>
+            <w:tcMar>
+              <w:top w:w="70" w:type="dxa"/>
+              <w:left w:w="110" w:type="dxa"/>
+              <w:bottom w:w="70" w:type="dxa"/>
+              <w:right w:w="110" w:type="dxa"/>
+            </w:tcMar>
+          </w:tcPr>
+          <w:p>
+            <w:pPr>
+              <w:rPr>
+                <w:rFonts w:ascii="Arial" w:hAnsi="Arial" w:cs="Arial"/>
+              </w:rPr>
+            </w:pPr>
+            <w:r>
+              <w:rPr>
+                <w:rFonts w:ascii="Arial" w:hAnsi="Arial" w:cs="Arial"/>
+                <w:b/>
+                <w:bCs/>
+                <w:color w:val="FFFFFF"/>
+              </w:rPr>
+              <w:t>Ubicación</w:t>
+            </w:r>
+          </w:p>
+        </w:tc>
+      </w:tr>
+      <w:tr>
+        <w:tc>
+          <w:tcPr>
+            <w:tcW w:w="900" w:type="dxa"/>
+            <w:tcBorders>
+              <w:top w:val="single" w:sz="4" w:space="0" w:color="BFBFBF"/>
+              <w:left w:val="single" w:sz="4" w:space="0" w:color="BFBFBF"/>
+              <w:bottom w:val="single" w:sz="4" w:space="0" w:color="BFBFBF"/>
+              <w:right w:val="single" w:sz="4" w:space="0" w:color="BFBFBF"/>
+            </w:tcBorders>
+            <w:tcMar>
+              <w:top w:w="70" w:type="dxa"/>
+              <w:left w:w="110" w:type="dxa"/>
+              <w:bottom w:w="70" w:type="dxa"/>
+              <w:right w:w="110" w:type="dxa"/>
+            </w:tcMar>
+          </w:tcPr>
+          <w:p>
+            <w:pPr>
+              <w:rPr>
+                <w:rFonts w:ascii="Arial" w:hAnsi="Arial" w:cs="Arial"/>
+              </w:rPr>
+            </w:pPr>
+            <w:r>
+              <w:rPr>
+                <w:rFonts w:ascii="Arial" w:hAnsi="Arial" w:cs="Arial"/>
+              </w:rPr>
+              <w:t>1</w:t>
+            </w:r>
+          </w:p>
+        </w:tc>
+        <w:tc>
+          <w:tcPr>
+            <w:tcW w:w="3000" w:type="dxa"/>
+            <w:tcBorders>
+              <w:top w:val="single" w:sz="4" w:space="0" w:color="BFBFBF"/>
+              <w:left w:val="single" w:sz="4" w:space="0" w:color="BFBFBF"/>
+              <w:bottom w:val="single" w:sz="4" w:space="0" w:color="BFBFBF"/>
+              <w:right w:val="single" w:sz="4" w:space="0" w:color="BFBFBF"/>
+            </w:tcBorders>
+            <w:tcMar>
+              <w:top w:w="70" w:type="dxa"/>
+              <w:left w:w="110" w:type="dxa"/>
+              <w:bottom w:w="70" w:type="dxa"/>
+              <w:right w:w="110" w:type="dxa"/>
+            </w:tcMar>
+          </w:tcPr>
+          <w:p>
+            <w:pPr>
+              <w:rPr>
+                <w:rFonts w:ascii="Arial" w:hAnsi="Arial" w:cs="Arial"/>
+              </w:rPr>
+            </w:pPr>
+            <w:r>
+              <w:rPr>
+                <w:rFonts w:ascii="Arial" w:hAnsi="Arial" w:cs="Arial"/>
+              </w:rPr>
+              <w:t>Plaza</w:t>
+            </w:r>
+          </w:p>
+        </w:tc>
+        <w:tc>
+          <w:tcPr>
+            <w:tcW w:w="5460" w:type="dxa"/>
+            <w:tcBorders>
+              <w:top w:val="single" w:sz="4" w:space="0" w:color="BFBFBF"/>
+              <w:left w:val="single" w:sz="4" w:space="0" w:color="BFBFBF"/>
+              <w:bottom w:val="single" w:sz="4" w:space="0" w:color="BFBFBF"/>
+              <w:right w:val="single" w:sz="4" w:space="0" w:color="BFBFBF"/>
+            </w:tcBorders>
+            <w:tcMar>
+              <w:top w:w="70" w:type="dxa"/>
+              <w:left w:w="110" w:type="dxa"/>
+              <w:bottom w:w="70" w:type="dxa"/>
+              <w:right w:w="110" w:type="dxa"/>
+            </w:tcMar>
+          </w:tcPr>
+          <w:p>
+            <w:pPr>
+              <w:rPr>
+                <w:rFonts w:ascii="Arial" w:hAnsi="Arial" w:cs="Arial"/>
+              </w:rPr>
+            </w:pPr>
+            <w:r>
+              <w:rPr>
+                <w:rFonts w:ascii="Arial" w:hAnsi="Arial" w:cs="Arial"/>
+              </w:rPr>
+              <w:t>Calle al norte de la plaza central</w:t>
+            </w:r>
+          </w:p>
+        </w:tc>
+      </w:tr>
+      <w:tr>
+        <w:tc>
+          <w:tcPr>
+            <w:tcW w:w="900" w:type="dxa"/>
+            <w:tcBorders>
+              <w:top w:val="single" w:sz="4" w:space="0" w:color="BFBFBF"/>
+              <w:left w:val="single" w:sz="4" w:space="0" w:color="BFBFBF"/>
+              <w:bottom w:val="single" w:sz="4" w:space="0" w:color="BFBFBF"/>
+              <w:right w:val="single" w:sz="4" w:space="0" w:color="BFBFBF"/>
+            </w:tcBorders>
+            <w:tcMar>
+              <w:top w:w="70" w:type="dxa"/>
+              <w:left w:w="110" w:type="dxa"/>
+              <w:bottom w:w="70" w:type="dxa"/>
+              <w:right w:w="110" w:type="dxa"/>
+            </w:tcMar>
+          </w:tcPr>
+          <w:p>
+            <w:pPr>
+              <w:rPr>
+                <w:rFonts w:ascii="Arial" w:hAnsi="Arial" w:cs="Arial"/>
+              </w:rPr>
+            </w:pPr>
+            <w:r>
+              <w:rPr>
+                <w:rFonts w:ascii="Arial" w:hAnsi="Arial" w:cs="Arial"/>
+              </w:rPr>
+              <w:t>2</w:t>
+            </w:r>
+          </w:p>
+        </w:tc>
+        <w:tc>
+          <w:tcPr>
+            <w:tcW w:w="3000" w:type="dxa"/>
+            <w:tcBorders>
+              <w:top w:val="single" w:sz="4" w:space="0" w:color="BFBFBF"/>
+              <w:left w:val="single" w:sz="4" w:space="0" w:color="BFBFBF"/>
+              <w:bottom w:val="single" w:sz="4" w:space="0" w:color="BFBFBF"/>
+              <w:right w:val="single" w:sz="4" w:space="0" w:color="BFBFBF"/>
+            </w:tcBorders>
+            <w:tcMar>
+              <w:top w:w="70" w:type="dxa"/>
+              <w:left w:w="110" w:type="dxa"/>
+              <w:bottom w:w="70" w:type="dxa"/>
+              <w:right w:w="110" w:type="dxa"/>
+            </w:tcMar>
+          </w:tcPr>
+          <w:p>
+            <w:pPr>
+              <w:rPr>
+                <w:rFonts w:ascii="Arial" w:hAnsi="Arial" w:cs="Arial"/>
+              </w:rPr>
+            </w:pPr>
+            <w:r>
+              <w:rPr>
+                <w:rFonts w:ascii="Arial" w:hAnsi="Arial" w:cs="Arial"/>
+              </w:rPr>
+              <w:t>Mansión Burns</w:t>
+            </w:r>
+          </w:p>
+        </w:tc>
+        <w:tc>
+          <w:tcPr>
+            <w:tcW w:w="5460" w:type="dxa"/>
+            <w:tcBorders>
+              <w:top w:val="single" w:sz="4" w:space="0" w:color="BFBFBF"/>
+              <w:left w:val="single" w:sz="4" w:space="0" w:color="BFBFBF"/>
+              <w:bottom w:val="single" w:sz="4" w:space="0" w:color="BFBFBF"/>
+              <w:right w:val="single" w:sz="4" w:space="0" w:color="BFBFBF"/>
+            </w:tcBorders>
+            <w:tcMar>
+              <w:top w:w="70" w:type="dxa"/>
+              <w:left w:w="110" w:type="dxa"/>
+              <w:bottom w:w="70" w:type="dxa"/>
+              <w:right w:w="110" w:type="dxa"/>
+            </w:tcMar>
+          </w:tcPr>
+          <w:p>
+            <w:pPr>
+              <w:rPr>
+                <w:rFonts w:ascii="Arial" w:hAnsi="Arial" w:cs="Arial"/>
+              </w:rPr>
+            </w:pPr>
+            <w:r>
+              <w:rPr>
+                <w:rFonts w:ascii="Arial" w:hAnsi="Arial" w:cs="Arial"/>
+              </w:rPr>
+              <w:t>Calle frente a la mansión</w:t>
+            </w:r>
+          </w:p>
+        </w:tc>
+      </w:tr>
+      <w:tr>
+        <w:tc>
+          <w:tcPr>
+            <w:tcW w:w="900" w:type="dxa"/>
+            <w:tcBorders>
+              <w:top w:val="single" w:sz="4" w:space="0" w:color="BFBFBF"/>
+              <w:left w:val="single" w:sz="4" w:space="0" w:color="BFBFBF"/>
+              <w:bottom w:val="single" w:sz="4" w:space="0" w:color="BFBFBF"/>
+              <w:right w:val="single" w:sz="4" w:space="0" w:color="BFBFBF"/>
+            </w:tcBorders>
+            <w:tcMar>
+              <w:top w:w="70" w:type="dxa"/>
+              <w:left w:w="110" w:type="dxa"/>
+              <w:bottom w:w="70" w:type="dxa"/>
+              <w:right w:w="110" w:type="dxa"/>
+            </w:tcMar>
+          </w:tcPr>
+          <w:p>
+            <w:pPr>
+              <w:rPr>
+                <w:rFonts w:ascii="Arial" w:hAnsi="Arial" w:cs="Arial"/>
+              </w:rPr>
+            </w:pPr>
+            <w:r>
+              <w:rPr>
+                <w:rFonts w:ascii="Arial" w:hAnsi="Arial" w:cs="Arial"/>
+              </w:rPr>
+              <w:t>3</w:t>
+            </w:r>
+          </w:p>
+        </w:tc>
+        <w:tc>
+          <w:tcPr>
+            <w:tcW w:w="3000" w:type="dxa"/>
+            <w:tcBorders>
+              <w:top w:val="single" w:sz="4" w:space="0" w:color="BFBFBF"/>
+              <w:left w:val="single" w:sz="4" w:space="0" w:color="BFBFBF"/>
+              <w:bottom w:val="single" w:sz="4" w:space="0" w:color="BFBFBF"/>
+              <w:right w:val="single" w:sz="4" w:space="0" w:color="BFBFBF"/>
+            </w:tcBorders>
+            <w:tcMar>
+              <w:top w:w="70" w:type="dxa"/>
+              <w:left w:w="110" w:type="dxa"/>
+              <w:bottom w:w="70" w:type="dxa"/>
+              <w:right w:w="110" w:type="dxa"/>
+            </w:tcMar>
+          </w:tcPr>
+          <w:p>
+            <w:pPr>
+              <w:rPr>
+                <w:rFonts w:ascii="Arial" w:hAnsi="Arial" w:cs="Arial"/>
+              </w:rPr>
+            </w:pPr>
+            <w:r>
+              <w:rPr>
+                <w:rFonts w:ascii="Arial" w:hAnsi="Arial" w:cs="Arial"/>
+              </w:rPr>
+              <w:t>Kwik-E-Mart</w:t>
+            </w:r>
+          </w:p>
+        </w:tc>
+        <w:tc>
+          <w:tcPr>
+            <w:tcW w:w="5460" w:type="dxa"/>
+            <w:tcBorders>
+              <w:top w:val="single" w:sz="4" w:space="0" w:color="BFBFBF"/>
+              <w:left w:val="single" w:sz="4" w:space="0" w:color="BFBFBF"/>
+              <w:bottom w:val="single" w:sz="4" w:space="0" w:color="BFBFBF"/>
+              <w:right w:val="single" w:sz="4" w:space="0" w:color="BFBFBF"/>
+            </w:tcBorders>
+            <w:tcMar>
+              <w:top w:w="70" w:type="dxa"/>
+              <w:left w:w="110" w:type="dxa"/>
+              <w:bottom w:w="70" w:type="dxa"/>
+              <w:right w:w="110" w:type="dxa"/>
+            </w:tcMar>
+          </w:tcPr>
+          <w:p>
+            <w:pPr>
+              <w:rPr>
+                <w:rFonts w:ascii="Arial" w:hAnsi="Arial" w:cs="Arial"/>
+              </w:rPr>
+            </w:pPr>
+            <w:r>
+              <w:rPr>
+                <w:rFonts w:ascii="Arial" w:hAnsi="Arial" w:cs="Arial"/>
+              </w:rPr>
+              <w:t>Calle frente a la tienda</w:t>
+            </w:r>
+          </w:p>
+        </w:tc>
+      </w:tr>
+      <w:tr>
+        <w:tc>
+          <w:tcPr>
+            <w:tcW w:w="900" w:type="dxa"/>
+            <w:tcBorders>
+              <w:top w:val="single" w:sz="4" w:space="0" w:color="BFBFBF"/>
+              <w:left w:val="single" w:sz="4" w:space="0" w:color="BFBFBF"/>
+              <w:bottom w:val="single" w:sz="4" w:space="0" w:color="BFBFBF"/>
+              <w:right w:val="single" w:sz="4" w:space="0" w:color="BFBFBF"/>
+            </w:tcBorders>
+            <w:tcMar>
+              <w:top w:w="70" w:type="dxa"/>
+              <w:left w:w="110" w:type="dxa"/>
+              <w:bottom w:w="70" w:type="dxa"/>
+              <w:right w:w="110" w:type="dxa"/>
+            </w:tcMar>
+          </w:tcPr>
+          <w:p>
+            <w:pPr>
+              <w:rPr>
+                <w:rFonts w:ascii="Arial" w:hAnsi="Arial" w:cs="Arial"/>
+              </w:rPr>
+            </w:pPr>
+            <w:r>
+              <w:rPr>
+                <w:rFonts w:ascii="Arial" w:hAnsi="Arial" w:cs="Arial"/>
+              </w:rPr>
+              <w:t>4</w:t>
+            </w:r>
+          </w:p>
+        </w:tc>
+        <w:tc>
+          <w:tcPr>
+            <w:tcW w:w="3000" w:type="dxa"/>
+            <w:tcBorders>
+              <w:top w:val="single" w:sz="4" w:space="0" w:color="BFBFBF"/>
+              <w:left w:val="single" w:sz="4" w:space="0" w:color="BFBFBF"/>
+              <w:bottom w:val="single" w:sz="4" w:space="0" w:color="BFBFBF"/>
+              <w:right w:val="single" w:sz="4" w:space="0" w:color="BFBFBF"/>
+            </w:tcBorders>
+            <w:tcMar>
+              <w:top w:w="70" w:type="dxa"/>
+              <w:left w:w="110" w:type="dxa"/>
+              <w:bottom w:w="70" w:type="dxa"/>
+              <w:right w:w="110" w:type="dxa"/>
+            </w:tcMar>
+          </w:tcPr>
+          <w:p>
+            <w:pPr>
+              <w:rPr>
+                <w:rFonts w:ascii="Arial" w:hAnsi="Arial" w:cs="Arial"/>
+              </w:rPr>
+            </w:pPr>
+            <w:r>
+              <w:rPr>
+                <w:rFonts w:ascii="Arial" w:hAnsi="Arial" w:cs="Arial"/>
+              </w:rPr>
+              <w:t>Casa Simpson</w:t>
+            </w:r>
+          </w:p>
+        </w:tc>
+        <w:tc>
+          <w:tcPr>
+            <w:tcW w:w="5460" w:type="dxa"/>
+            <w:tcBorders>
+              <w:top w:val="single" w:sz="4" w:space="0" w:color="BFBFBF"/>
+              <w:left w:val="single" w:sz="4" w:space="0" w:color="BFBFBF"/>
+              <w:bottom w:val="single" w:sz="4" w:space="0" w:color="BFBFBF"/>
+              <w:right w:val="single" w:sz="4" w:space="0" w:color="BFBFBF"/>
+            </w:tcBorders>
+            <w:tcMar>
+              <w:top w:w="70" w:type="dxa"/>
+              <w:left w:w="110" w:type="dxa"/>
+              <w:bottom w:w="70" w:type="dxa"/>
+              <w:right w:w="110" w:type="dxa"/>
+            </w:tcMar>
+          </w:tcPr>
+          <w:p>
+            <w:pPr>
+              <w:rPr>
+                <w:rFonts w:ascii="Arial" w:hAnsi="Arial" w:cs="Arial"/>
+              </w:rPr>
+            </w:pPr>
+            <w:r>
+              <w:rPr>
+                <w:rFonts w:ascii="Arial" w:hAnsi="Arial" w:cs="Arial"/>
+              </w:rPr>
+              <w:t>Calle frente a la casa de los Simpson</w:t>
+            </w:r>
+          </w:p>
+        </w:tc>
+      </w:tr>
+    </w:tbl>
+    <w:p>
+      <w:pPr>
+        <w:spacing w:after="120"/>
+        <w:rPr>
+          <w:rFonts w:ascii="Arial" w:hAnsi="Arial" w:cs="Arial"/>
+        </w:rPr>
+      </w:pPr>
+    </w:p>
+    <w:p>
+      <w:pPr>
+        <w:pStyle w:val="Prrafodelista"/>
+        <w:numPr>
+          <w:ilvl w:val="0"/>
+          <w:numId w:val="2"/>
+        </w:numPr>
+        <w:spacing w:after="60" w:line="276" w:lineRule="auto"/>
+        <w:rPr>
+          <w:rFonts w:ascii="Arial" w:hAnsi="Arial" w:cs="Arial"/>
+        </w:rPr>
+      </w:pPr>
+      <w:r>
+        <w:rPr>
+          <w:rFonts w:ascii="Arial" w:hAnsi="Arial" w:cs="Arial"/>
+          <w:b/>
+          <w:bCs/>
+        </w:rPr>
+        <w:t>Para completar una entrega</w:t>
+      </w:r>
+      <w:r>
+        <w:rPr>
+          <w:rFonts w:ascii="Arial" w:hAnsi="Arial" w:cs="Arial"/>
+        </w:rPr>
+        <w:t>: llegar a menos de 4 unidades de la marca y bajar de unos 5 km/h.</w:t>
+      </w:r>
+    </w:p>
+    <w:p>
+      <w:pPr>
+        <w:pStyle w:val="Prrafodelista"/>
+        <w:numPr>
+          <w:ilvl w:val="0"/>
+          <w:numId w:val="2"/>
+        </w:numPr>
+        <w:spacing w:after="60" w:line="276" w:lineRule="auto"/>
+        <w:rPr>
+          <w:rFonts w:ascii="Arial" w:hAnsi="Arial" w:cs="Arial"/>
+        </w:rPr>
+      </w:pPr>
+      <w:r>
+        <w:rPr>
+          <w:rFonts w:ascii="Arial" w:hAnsi="Arial" w:cs="Arial"/>
+          <w:b/>
+          <w:bCs/>
+        </w:rPr>
+        <w:t>Marca en el mundo</w:t>
+      </w:r>
+      <w:r>
+        <w:rPr>
+          <w:rFonts w:ascii="Arial" w:hAnsi="Arial" w:cs="Arial"/>
+        </w:rPr>
+        <w:t>: plataforma dorada, baliza giratoria y un rayo de luz alto que se ve desde lejos, incluso de noche.</w:t>
+      </w:r>
+    </w:p>
+    <w:p>
+      <w:pPr>
+        <w:pStyle w:val="Prrafodelista"/>
+        <w:numPr>
+          <w:ilvl w:val="0"/>
+          <w:numId w:val="2"/>
+        </w:numPr>
+        <w:spacing w:after="60" w:line="276" w:lineRule="auto"/>
+        <w:rPr>
+          <w:rFonts w:ascii="Arial" w:hAnsi="Arial" w:cs="Arial"/>
+        </w:rPr>
+      </w:pPr>
+      <w:r>
+        <w:rPr>
+          <w:rFonts w:ascii="Arial" w:hAnsi="Arial" w:cs="Arial"/>
+          <w:b/>
+          <w:bCs/>
+        </w:rPr>
+        <w:t>Marca en el minimapa</w:t>
+      </w:r>
+      <w:r>
+        <w:rPr>
+          <w:rFonts w:ascii="Arial" w:hAnsi="Arial" w:cs="Arial"/>
+        </w:rPr>
+        <w:t>: un cuadrado dorado que pulsa.</w:t>
+      </w:r>
+    </w:p>
+    <w:p>
+      <w:pPr>
+        <w:pStyle w:val="Prrafodelista"/>
+        <w:numPr>
+          <w:ilvl w:val="0"/>
+          <w:numId w:val="2"/>
+        </w:numPr>
+        <w:spacing w:after="60" w:line="276" w:lineRule="auto"/>
+        <w:rPr>
+          <w:rFonts w:ascii="Arial" w:hAnsi="Arial" w:cs="Arial"/>
+        </w:rPr>
+      </w:pPr>
+      <w:r>
+        <w:rPr>
+          <w:rFonts w:ascii="Arial" w:hAnsi="Arial" w:cs="Arial"/>
+          <w:b/>
+          <w:bCs/>
+        </w:rPr>
+        <w:t>Al terminar las cuatro</w:t>
+      </w:r>
+      <w:r>
+        <w:rPr>
+          <w:rFonts w:ascii="Arial" w:hAnsi="Arial" w:cs="Arial"/>
+        </w:rPr>
+        <w:t>: la tarjeta muestra «GANASTE!» y el tiempo total. La tecla R reinicia el auto y las misiones.</w:t>
+      </w:r>
+    </w:p>
+    <w:p>
+      <w:pPr>
+        <w:keepNext/>
+        <w:spacing w:before="120" w:after="60"/>
+        <w:jc w:val="center"/>
+      </w:pPr>
+      <w:r>
+        <w:rPr>
+          <w:noProof/>
+        </w:rPr>
+        <w:drawing>
+          <wp:inline distT="0" distB="0" distL="0" distR="0">
+            <wp:extent cx="5334000" cy="3200400"/>
+            <wp:effectExtent l="0" t="0" r="0" b="0"/>
+            <wp:docPr id="18" name="juego_mision_plaza.png" descr="Misión hacia la plaza" title="Misión hacia la plaza"/>
+            <wp:cNvGraphicFramePr>
+              <a:graphicFrameLocks xmlns:a="http://schemas.openxmlformats.org/drawingml/2006/main" noChangeAspect="1"/>
+            </wp:cNvGraphicFramePr>
+            <a:graphic xmlns:a="http://schemas.openxmlformats.org/drawingml/2006/main">
+              <a:graphicData uri="http://schemas.openxmlformats.org/drawingml/2006/picture">
+                <pic:pic xmlns:pic="http://schemas.openxmlformats.org/drawingml/2006/picture">
+                  <pic:nvPicPr>
+                    <pic:cNvPr id="0" name=""/>
+                    <pic:cNvPicPr>
+                      <a:picLocks noChangeAspect="1" noChangeArrowheads="1"/>
+                    </pic:cNvPicPr>
+                  </pic:nvPicPr>
+                  <pic:blipFill>
+                    <a:blip r:embed="rId25"/>
+                    <a:srcRect/>
+                    <a:stretch>
+                      <a:fillRect/>
+                    </a:stretch>
+                  </pic:blipFill>
+                  <pic:spPr bwMode="auto">
+                    <a:xfrm>
+                      <a:off x="0" y="0"/>
+                      <a:ext cx="5334000" cy="3200400"/>
+                    </a:xfrm>
+                    <a:prstGeom prst="rect">
+                      <a:avLst/>
+                    </a:prstGeom>
+                  </pic:spPr>
+                </pic:pic>
+              </a:graphicData>
+            </a:graphic>
+          </wp:inline>
+        </w:drawing>
+      </w:r>
+    </w:p>
+    <w:p>
+      <w:pPr>
+        <w:spacing w:after="200"/>
+        <w:jc w:val="center"/>
+      </w:pPr>
+      <w:r>
+        <w:rPr>
+          <w:i/>
+          <w:iCs/>
+          <w:color w:val="595959"/>
+          <w:sz w:val="20"/>
+          <w:szCs w:val="20"/>
+        </w:rPr>
         <w:t>Figura 17. Misión 1: la marca dorada junto a la plaza, con su rayo de luz.</w:t>
       </w:r>
     </w:p>
@@ -7728,6 +6735,7 @@
           <w:rFonts w:ascii="Arial" w:hAnsi="Arial" w:cs="Arial"/>
           <w:color w:val="000000" w:themeColor="text1"/>
         </w:rPr>
+        <w:lastRenderedPageBreak/>
         <w:t>11. Controles</w:t>
       </w:r>
     </w:p>
@@ -8034,7 +7042,7 @@
               <w:rPr>
                 <w:rFonts w:ascii="Arial" w:hAnsi="Arial" w:cs="Arial"/>
               </w:rPr>
-              <w:t>N</w:t>
+              <w:t>C</w:t>
             </w:r>
           </w:p>
         </w:tc>
@@ -8064,7 +7072,7 @@
               <w:rPr>
                 <w:rFonts w:ascii="Arial" w:hAnsi="Arial" w:cs="Arial"/>
               </w:rPr>
-              <w:t>Alternar día / noche</w:t>
+              <w:t>Cambiar de Vehiculo</w:t>
             </w:r>
           </w:p>
         </w:tc>
@@ -8096,7 +7104,7 @@
               <w:rPr>
                 <w:rFonts w:ascii="Arial" w:hAnsi="Arial" w:cs="Arial"/>
               </w:rPr>
-              <w:t>F</w:t>
+              <w:t>N</w:t>
             </w:r>
           </w:p>
         </w:tc>
@@ -8126,7 +7134,7 @@
               <w:rPr>
                 <w:rFonts w:ascii="Arial" w:hAnsi="Arial" w:cs="Arial"/>
               </w:rPr>
-              <w:t>Encender / apagar los faros</w:t>
+              <w:t>Alternar día / noche</w:t>
             </w:r>
           </w:p>
         </w:tc>
@@ -8158,6 +7166,68 @@
               <w:rPr>
                 <w:rFonts w:ascii="Arial" w:hAnsi="Arial" w:cs="Arial"/>
               </w:rPr>
+              <w:t>F</w:t>
+            </w:r>
+          </w:p>
+        </w:tc>
+        <w:tc>
+          <w:tcPr>
+            <w:tcW w:w="6360" w:type="dxa"/>
+            <w:tcBorders>
+              <w:top w:val="single" w:sz="4" w:space="0" w:color="BFBFBF"/>
+              <w:left w:val="single" w:sz="4" w:space="0" w:color="BFBFBF"/>
+              <w:bottom w:val="single" w:sz="4" w:space="0" w:color="BFBFBF"/>
+              <w:right w:val="single" w:sz="4" w:space="0" w:color="BFBFBF"/>
+            </w:tcBorders>
+            <w:tcMar>
+              <w:top w:w="70" w:type="dxa"/>
+              <w:left w:w="110" w:type="dxa"/>
+              <w:bottom w:w="70" w:type="dxa"/>
+              <w:right w:w="110" w:type="dxa"/>
+            </w:tcMar>
+          </w:tcPr>
+          <w:p>
+            <w:pPr>
+              <w:rPr>
+                <w:rFonts w:ascii="Arial" w:hAnsi="Arial" w:cs="Arial"/>
+              </w:rPr>
+            </w:pPr>
+            <w:r>
+              <w:rPr>
+                <w:rFonts w:ascii="Arial" w:hAnsi="Arial" w:cs="Arial"/>
+              </w:rPr>
+              <w:t>Encender / apagar los faros</w:t>
+            </w:r>
+          </w:p>
+        </w:tc>
+      </w:tr>
+      <w:tr>
+        <w:tc>
+          <w:tcPr>
+            <w:tcW w:w="3000" w:type="dxa"/>
+            <w:tcBorders>
+              <w:top w:val="single" w:sz="4" w:space="0" w:color="BFBFBF"/>
+              <w:left w:val="single" w:sz="4" w:space="0" w:color="BFBFBF"/>
+              <w:bottom w:val="single" w:sz="4" w:space="0" w:color="BFBFBF"/>
+              <w:right w:val="single" w:sz="4" w:space="0" w:color="BFBFBF"/>
+            </w:tcBorders>
+            <w:tcMar>
+              <w:top w:w="70" w:type="dxa"/>
+              <w:left w:w="110" w:type="dxa"/>
+              <w:bottom w:w="70" w:type="dxa"/>
+              <w:right w:w="110" w:type="dxa"/>
+            </w:tcMar>
+          </w:tcPr>
+          <w:p>
+            <w:pPr>
+              <w:rPr>
+                <w:rFonts w:ascii="Arial" w:hAnsi="Arial" w:cs="Arial"/>
+              </w:rPr>
+            </w:pPr>
+            <w:r>
+              <w:rPr>
+                <w:rFonts w:ascii="Arial" w:hAnsi="Arial" w:cs="Arial"/>
+              </w:rPr>
               <w:t>M</w:t>
             </w:r>
           </w:p>
@@ -8188,16 +7258,8 @@
               <w:rPr>
                 <w:rFonts w:ascii="Arial" w:hAnsi="Arial" w:cs="Arial"/>
               </w:rPr>
-              <w:t xml:space="preserve">Mostrar / ocultar el </w:t>
-            </w:r>
-            <w:proofErr w:type="spellStart"/>
-            <w:r>
-              <w:rPr>
-                <w:rFonts w:ascii="Arial" w:hAnsi="Arial" w:cs="Arial"/>
-              </w:rPr>
-              <w:t>minimapa</w:t>
-            </w:r>
-            <w:proofErr w:type="spellEnd"/>
+              <w:t>Mostrar / ocultar el minimapa</w:t>
+            </w:r>
           </w:p>
         </w:tc>
       </w:tr>
@@ -8370,20 +7432,7 @@
         <w:rPr>
           <w:rFonts w:ascii="Arial" w:hAnsi="Arial" w:cs="Arial"/>
         </w:rPr>
-        <w:t xml:space="preserve">: la ciudad completa se dibuja en cada cuadro, aunque casi toda esté fuera de la vista. En una medición con el juego completo de noche se registraron unos 35 ms </w:t>
-      </w:r>
-      <w:r>
-        <w:rPr>
-          <w:rFonts w:ascii="Arial" w:hAnsi="Arial" w:cs="Arial"/>
-        </w:rPr>
-        <w:lastRenderedPageBreak/>
-        <w:t>por cuadro (alrededor de 28 FPS); sin dibujar la ciudad, el resto tarda unos 4 ms. La mejora má</w:t>
-      </w:r>
-      <w:r>
-        <w:rPr>
-          <w:rFonts w:ascii="Arial" w:hAnsi="Arial" w:cs="Arial"/>
-        </w:rPr>
-        <w:t>s importante pendiente es dibujar solo los edificios cercanos a la cámara.</w:t>
+        <w:t>: la ciudad completa se dibuja en cada cuadro, aunque casi toda esté fuera de la vista. En una medición con el juego completo de noche se registraron unos 35 ms por cuadro (alrededor de 28 FPS); sin dibujar la ciudad, el resto tarda unos 4 ms. La mejora más importante pendiente es dibujar solo los edificios cercanos a la cámara.</w:t>
       </w:r>
     </w:p>
     <w:p>
@@ -8437,13 +7486,7 @@
         <w:rPr>
           <w:rFonts w:ascii="Arial" w:hAnsi="Arial" w:cs="Arial"/>
         </w:rPr>
-        <w:t>: las casas sin calle al frente quedan orientadas hacia +Z, aunque no</w:t>
-      </w:r>
-      <w:r>
-        <w:rPr>
-          <w:rFonts w:ascii="Arial" w:hAnsi="Arial" w:cs="Arial"/>
-        </w:rPr>
-        <w:t xml:space="preserve"> haya calle en esa dirección.</w:t>
+        <w:t>: las casas sin calle al frente quedan orientadas hacia +Z, aunque no haya calle en esa dirección.</w:t>
       </w:r>
     </w:p>
     <w:p>
@@ -8509,7 +7552,7 @@
       </w:pPr>
     </w:p>
     <w:sectPr>
-      <w:footerReference w:type="default" r:id="rId25"/>
+      <w:footerReference w:type="default" r:id="rId26"/>
       <w:pgSz w:w="12240" w:h="15840"/>
       <w:pgMar w:top="1440" w:right="1440" w:bottom="1440" w:left="1440" w:header="708" w:footer="708" w:gutter="0"/>
       <w:cols w:space="720"/>
@@ -9410,7 +8453,6 @@
   <w:style w:type="character" w:default="1" w:styleId="Fuentedeprrafopredeter">
     <w:name w:val="Default Paragraph Font"/>
     <w:uiPriority w:val="1"/>
-    <w:semiHidden/>
     <w:unhideWhenUsed/>
   </w:style>
   <w:style w:type="table" w:default="1" w:styleId="Tablanormal">

</xml_diff>